<commit_message>
Backup current working tree before Mac migration
</commit_message>
<xml_diff>
--- a/production-log/complete-production-log-en.docx
+++ b/production-log/complete-production-log-en.docx
@@ -3470,7 +3470,7 @@
           <w:spacing w:val="0"/>
           <w:color w:val="0E121D"/>
         </w:rPr>
-        <w:t xml:space="preserve">I selected Bitcoin volatility forecasting because it allowed me to combine mathematics, statistics, computing and an applied financial problem. Volatility is relevant to risk, the result can be evaluated quantitatively, and historical market data can support a reproducible product. The project was also suitable for critical evaluation because a more complex forecasting model would not necessarily be more accurate, interpretable or practical. Before this wording is used, I will confirm that it reflects my actual initial reasoning rather than only the later direction of the repository.</w:t>
+        <w:t xml:space="preserve">I selected Bitcoin volatility forecasting because it connects my interests in mathematics, computing and finance and gives me a question that can be tested with real data. It also lets me compare whether a more complicated method actually gives a useful improvement. Before using this wording, I will confirm that it matches my own reasons at the start of the project.</w:t>
       </w:r>
       <w:r>
         <w:rPr>
@@ -3632,7 +3632,7 @@
           <w:spacing w:val="0"/>
           <w:color w:val="0E121D"/>
         </w:rPr>
-        <w:t xml:space="preserve">Modifications made after the initial meeting</w:t>
+        <w:t xml:space="preserve">Changes made after the initial meeting</w:t>
       </w:r>
     </w:p>
     <w:p>
@@ -3752,7 +3752,7 @@
           <w:spacing w:val="0"/>
           <w:color w:val="0E121D"/>
         </w:rPr>
-        <w:t xml:space="preserve"> To critically evaluate the predictive power, interpretability, computational practicality and practical limitations of machine-learning approaches compared with traditional statistical approaches in Bitcoin volatility forecasting.</w:t>
+        <w:t xml:space="preserve"> To compare several ways of forecasting Bitcoin volatility and decide whether the more complicated machine-learning methods give enough extra benefit to justify their use.</w:t>
       </w:r>
     </w:p>
     <w:p>
@@ -3806,7 +3806,7 @@
           <w:spacing w:val="0"/>
           <w:color w:val="0E121D"/>
         </w:rPr>
-        <w:t xml:space="preserve">Research logarithmic returns, realised volatility and GARCH-type models.</w:t>
+        <w:t xml:space="preserve">Read about Bitcoin returns, volatility and the selected forecasting methods.</w:t>
       </w:r>
     </w:p>
     <w:p>
@@ -3834,7 +3834,7 @@
           <w:spacing w:val="0"/>
           <w:color w:val="0E121D"/>
         </w:rPr>
-        <w:t xml:space="preserve">Collect daily Bitcoin price data and construct a realised-volatility target.</w:t>
+        <w:t xml:space="preserve">Collect and prepare a consistent set of daily Bitcoin data.</w:t>
       </w:r>
     </w:p>
     <w:p>
@@ -3862,7 +3862,7 @@
           <w:spacing w:val="0"/>
           <w:color w:val="0E121D"/>
         </w:rPr>
-        <w:t xml:space="preserve">Implement rolling historical volatility and GARCH(1,1) as statistical benchmarks.</w:t>
+        <w:t xml:space="preserve">Build two clear statistical comparison methods.</w:t>
       </w:r>
     </w:p>
     <w:p>
@@ -3890,7 +3890,7 @@
           <w:spacing w:val="0"/>
           <w:color w:val="0E121D"/>
         </w:rPr>
-        <w:t xml:space="preserve">Implement Random Forest and, if feasible, an LSTM.</w:t>
+        <w:t xml:space="preserve">Build Random Forest and, if manageable, an LSTM for comparison.</w:t>
       </w:r>
     </w:p>
     <w:p>
@@ -3918,7 +3918,7 @@
           <w:spacing w:val="0"/>
           <w:color w:val="0E121D"/>
         </w:rPr>
-        <w:t xml:space="preserve">compare forecasts using MAE, MSE and RMSE.</w:t>
+        <w:t xml:space="preserve">Test every method on the same time-ordered data and compare the errors.</w:t>
       </w:r>
     </w:p>
     <w:p>
@@ -3946,7 +3946,7 @@
           <w:spacing w:val="0"/>
           <w:color w:val="0E121D"/>
         </w:rPr>
-        <w:t xml:space="preserve">Decide whether any accuracy improvement is meaningful after interpretability, computational complexity and project scale are considered.</w:t>
+        <w:t xml:space="preserve">Consider accuracy together with ease of explanation, time required and important limitations.</w:t>
       </w:r>
     </w:p>
     <w:p>
@@ -4073,19 +4073,6 @@
           <w:color w:val="0E121D"/>
         </w:rPr>
         <w:t xml:space="preserve">{{INITIAL_PROPOSAL_DATE}}</w:t>
-      </w:r>
-    </w:p>
-    <w:p>
-      <w:pPr/>
-      <w:r>
-        <w:rPr>
-          <w:rFonts w:ascii="Arial" w:hAnsi="Arial" w:cs="Arial"/>
-          <w:sz w:val="28"/>
-          <w:sz-cs w:val="28"/>
-          <w:spacing w:val="0"/>
-          <w:color w:val="6D6D6D"/>
-        </w:rPr>
-        <w:t xml:space="preserve"/>
       </w:r>
     </w:p>
     <w:p>
@@ -4169,7 +4156,7 @@
           <w:spacing w:val="0"/>
           <w:color w:val="0E121D"/>
         </w:rPr>
-        <w:t xml:space="preserve"> How do Random Forest and Long Short-Term Memory networks compare with rolling historical volatility and GARCH(1,1) when forecasting Bitcoin volatility, in terms of accuracy, interpretability, computational practicality and robustness?</w:t>
+        <w:t xml:space="preserve"> When the same Bitcoin data and testing period are used, do Random Forest and LSTM give a useful improvement over two clearer statistical approaches, and are they still practical and understandable enough for this project?</w:t>
       </w:r>
     </w:p>
     <w:p>
@@ -4215,7 +4202,7 @@
           <w:spacing w:val="0"/>
           <w:color w:val="0E121D"/>
         </w:rPr>
-        <w:t xml:space="preserve">At the proposal stage I planned to use daily BTC price data, Python for data processing and modelling, academic literature on volatility forecasting and machine learning, a source-evaluation workbook, saved code and outputs, and a chronological evaluation design. The first tracked proposal named Yahoo Finance; the project changed to Hyperliquid exchange-level BTC perpetual-futures candles later in the documented process. I will keep that change visible rather than rewriting the original proposal as though Hyperliquid had always been selected.</w:t>
+        <w:t xml:space="preserve">At the proposal stage, I planned to use daily Bitcoin data, academic and educational reading about forecasting, Python to organise the data and run the comparisons, a source-evaluation workbook, saved results and a time-ordered test. The first plan named Yahoo Finance, but the documented project later changed to Hyperliquid. I will keep this change visible instead of rewriting the starting plan.</w:t>
       </w:r>
       <w:r>
         <w:rPr>
@@ -4312,7 +4299,7 @@
           <w:spacing w:val="0"/>
           <w:color w:val="0E121D"/>
         </w:rPr>
-        <w:t xml:space="preserve">Daily BTC data; the first tracked plan named Yahoo Finance</w:t>
+        <w:t xml:space="preserve">Daily Bitcoin data; the first tracked plan named Yahoo Finance</w:t>
       </w:r>
     </w:p>
     <w:p>
@@ -4338,20 +4325,20 @@
           <w:spacing w:val="0"/>
           <w:color w:val="0E121D"/>
         </w:rPr>
-        <w:t xml:space="preserve">Statistical theory</w:t>
-      </w:r>
-    </w:p>
-    <w:p>
-      <w:pPr/>
-      <w:r>
-        <w:rPr>
-          <w:rFonts w:ascii="Arial" w:hAnsi="Arial" w:cs="Arial"/>
-          <w:sz w:val="23"/>
-          <w:sz-cs w:val="23"/>
-          <w:spacing w:val="0"/>
-          <w:color w:val="0E121D"/>
-        </w:rPr>
-        <w:t xml:space="preserve">Log returns, realised volatility and GARCH literature</w:t>
+        <w:t xml:space="preserve">Background reading</w:t>
+      </w:r>
+    </w:p>
+    <w:p>
+      <w:pPr/>
+      <w:r>
+        <w:rPr>
+          <w:rFonts w:ascii="Arial" w:hAnsi="Arial" w:cs="Arial"/>
+          <w:sz w:val="23"/>
+          <w:sz-cs w:val="23"/>
+          <w:spacing w:val="0"/>
+          <w:color w:val="0E121D"/>
+        </w:rPr>
+        <w:t xml:space="preserve">Sources explaining returns, volatility and established forecasting methods</w:t>
       </w:r>
     </w:p>
     <w:p>
@@ -4377,20 +4364,20 @@
           <w:spacing w:val="0"/>
           <w:color w:val="0E121D"/>
         </w:rPr>
-        <w:t xml:space="preserve">Machine learning</w:t>
-      </w:r>
-    </w:p>
-    <w:p>
-      <w:pPr/>
-      <w:r>
-        <w:rPr>
-          <w:rFonts w:ascii="Arial" w:hAnsi="Arial" w:cs="Arial"/>
-          <w:sz w:val="23"/>
-          <w:sz-cs w:val="23"/>
-          <w:spacing w:val="0"/>
-          <w:color w:val="0E121D"/>
-        </w:rPr>
-        <w:t xml:space="preserve">Random Forest and LSTM literature</w:t>
+        <w:t xml:space="preserve">Comparison reading</w:t>
+      </w:r>
+    </w:p>
+    <w:p>
+      <w:pPr/>
+      <w:r>
+        <w:rPr>
+          <w:rFonts w:ascii="Arial" w:hAnsi="Arial" w:cs="Arial"/>
+          <w:sz w:val="23"/>
+          <w:sz-cs w:val="23"/>
+          <w:spacing w:val="0"/>
+          <w:color w:val="0E121D"/>
+        </w:rPr>
+        <w:t xml:space="preserve">Sources explaining the selected machine-learning methods</w:t>
       </w:r>
     </w:p>
     <w:p>
@@ -4429,7 +4416,7 @@
           <w:spacing w:val="0"/>
           <w:color w:val="0E121D"/>
         </w:rPr>
-        <w:t xml:space="preserve">MAE, MSE, RMSE and chronological train/test separation</w:t>
+        <w:t xml:space="preserve">Common error measures and a test that keeps the original time order</w:t>
       </w:r>
     </w:p>
     <w:p>
@@ -4468,7 +4455,7 @@
           <w:spacing w:val="0"/>
           <w:color w:val="0E121D"/>
         </w:rPr>
-        <w:t xml:space="preserve">Python or notebook environment, source-evaluation workbook, scripts, output tables and charts</w:t>
+        <w:t xml:space="preserve">Python, the source-evaluation workbook, saved tables and charts</w:t>
       </w:r>
     </w:p>
     <w:p>
@@ -4848,7 +4835,7 @@
           <w:spacing w:val="0"/>
           <w:color w:val="0E121D"/>
         </w:rPr>
-        <w:t xml:space="preserve"> To critically evaluate whether the additional complexity of machine-learning approaches is justified when compared with transparent statistical approaches to Bitcoin volatility forecasting.</w:t>
+        <w:t xml:space="preserve"> To decide whether the extra complication of the selected machine-learning approaches is worthwhile when compared with clearer statistical approaches to Bitcoin volatility forecasting.</w:t>
       </w:r>
     </w:p>
     <w:p>
@@ -4902,7 +4889,7 @@
           <w:spacing w:val="0"/>
           <w:color w:val="0E121D"/>
         </w:rPr>
-        <w:t xml:space="preserve">Explain the mathematical foundations of returns and volatility.</w:t>
+        <w:t xml:space="preserve">Explain the key ideas behind Bitcoin returns and volatility in accessible language.</w:t>
       </w:r>
     </w:p>
     <w:p>
@@ -4930,7 +4917,7 @@
           <w:spacing w:val="0"/>
           <w:color w:val="0E121D"/>
         </w:rPr>
-        <w:t xml:space="preserve">Build a reproducible daily BTC dataset and realised-volatility target.</w:t>
+        <w:t xml:space="preserve">Prepare a reliable daily Bitcoin dataset for the comparison.</w:t>
       </w:r>
     </w:p>
     <w:p>
@@ -4958,7 +4945,7 @@
           <w:spacing w:val="0"/>
           <w:color w:val="0E121D"/>
         </w:rPr>
-        <w:t xml:space="preserve">Implement rolling historical volatility and GARCH(1,1).</w:t>
+        <w:t xml:space="preserve">Build two statistical reference methods.</w:t>
       </w:r>
     </w:p>
     <w:p>
@@ -4986,7 +4973,7 @@
           <w:spacing w:val="0"/>
           <w:color w:val="0E121D"/>
         </w:rPr>
-        <w:t xml:space="preserve">Implement Random Forest and attempt a small LSTM after the baseline workflow is stable.</w:t>
+        <w:t xml:space="preserve">Build Random Forest and attempt a small LSTM after the first comparison works.</w:t>
       </w:r>
     </w:p>
     <w:p>
@@ -5014,7 +5001,7 @@
           <w:spacing w:val="0"/>
           <w:color w:val="0E121D"/>
         </w:rPr>
-        <w:t xml:space="preserve">Preserve chronological order and evaluate MAE, MSE and RMSE.</w:t>
+        <w:t xml:space="preserve">Keep the data in time order and compare every method using the same error measures.</w:t>
       </w:r>
     </w:p>
     <w:p>
@@ -5042,7 +5029,7 @@
           <w:spacing w:val="0"/>
           <w:color w:val="0E121D"/>
         </w:rPr>
-        <w:t xml:space="preserve">Evaluate accuracy, interpretability, computational practicality and limitations.</w:t>
+        <w:t xml:space="preserve">Discuss accuracy, ease of explanation, practical use and limitations.</w:t>
       </w:r>
     </w:p>
     <w:p>
@@ -5057,7 +5044,7 @@
           <w:spacing w:val="0"/>
           <w:color w:val="0E121D"/>
         </w:rPr>
-        <w:t xml:space="preserve">The later addition of lagged linear regression, alternative target windows, test segments, expanding-window folds, volatility regimes, bootstrap uncertainty, Random Forest diagnostics and multi-seed LSTM checks belongs in later reviews, not in this original proposal section.</w:t>
+        <w:t xml:space="preserve">Later extra checks belong in the review sections because they were not part of the original proposal.</w:t>
       </w:r>
     </w:p>
     <w:p>
@@ -6021,7 +6008,7 @@
           <w:spacing w:val="0"/>
           <w:color w:val="0E121D"/>
         </w:rPr>
-        <w:t xml:space="preserve">I narrowed the project from a broad cryptocurrency-prediction idea to a focused comparison of Bitcoin volatility forecasts. I planned to establish transparent benchmarks before implementing machine learning, preserve chronological order, save raw and processed data, and export tables and charts rather than rely on screenshots. I also widened the evaluation from accuracy alone to interpretability, computational practicality and usefulness because a lower error would not automatically justify a more opaque model.</w:t>
+        <w:t xml:space="preserve">I narrowed the project from a broad cryptocurrency-prediction idea to a focused Bitcoin volatility comparison. I planned to begin with clear reference methods, keep the dates in order, save both the original and prepared data and produce tables and charts that could be checked. I also decided to compare clarity and practicality as well as accuracy, because a slightly lower error would not automatically make a more complicated method the better choice.</w:t>
       </w:r>
       <w:r>
         <w:rPr>
@@ -6121,7 +6108,7 @@
           <w:spacing w:val="0"/>
           <w:color w:val="0E121D"/>
         </w:rPr>
-        <w:t xml:space="preserve">Refine question, aims and objectives</w:t>
+        <w:t xml:space="preserve">Refine the question and objectives</w:t>
       </w:r>
     </w:p>
     <w:p>
@@ -6147,7 +6134,7 @@
           <w:spacing w:val="0"/>
           <w:color w:val="0E121D"/>
         </w:rPr>
-        <w:t xml:space="preserve">Candidate proposal, report outline and supervisor-feedback summary</w:t>
+        <w:t xml:space="preserve">Candidate proposal, report outline and feedback summary</w:t>
       </w:r>
     </w:p>
     <w:p>
@@ -6225,7 +6212,7 @@
           <w:spacing w:val="0"/>
           <w:color w:val="0E121D"/>
         </w:rPr>
-        <w:t xml:space="preserve">Complete planning review</w:t>
+        <w:t xml:space="preserve">Complete the planning review</w:t>
       </w:r>
     </w:p>
     <w:p>
@@ -6277,7 +6264,7 @@
           <w:spacing w:val="0"/>
           <w:color w:val="0E121D"/>
         </w:rPr>
-        <w:t xml:space="preserve">Download and clean BTC data</w:t>
+        <w:t xml:space="preserve">Download, check and organise the Bitcoin data</w:t>
       </w:r>
     </w:p>
     <w:p>
@@ -6303,7 +6290,7 @@
           <w:spacing w:val="0"/>
           <w:color w:val="0E121D"/>
         </w:rPr>
-        <w:t xml:space="preserve">Raw archive, processed dataset and data notes</w:t>
+        <w:t xml:space="preserve">Original data, prepared dataset and data notes</w:t>
       </w:r>
     </w:p>
     <w:p>
@@ -6329,7 +6316,7 @@
           <w:spacing w:val="0"/>
           <w:color w:val="0E121D"/>
         </w:rPr>
-        <w:t xml:space="preserve">Implement rolling volatility and GARCH</w:t>
+        <w:t xml:space="preserve">Build the first two comparison methods</w:t>
       </w:r>
     </w:p>
     <w:p>
@@ -6355,7 +6342,7 @@
           <w:spacing w:val="0"/>
           <w:color w:val="0E121D"/>
         </w:rPr>
-        <w:t xml:space="preserve">Python pipeline and outputs</w:t>
+        <w:t xml:space="preserve">Saved work and result tables</w:t>
       </w:r>
     </w:p>
     <w:p>
@@ -6381,7 +6368,7 @@
           <w:spacing w:val="0"/>
           <w:color w:val="0E121D"/>
         </w:rPr>
-        <w:t xml:space="preserve">Implement Random Forest and first LSTM prototype</w:t>
+        <w:t xml:space="preserve">Build the two machine-learning comparisons</w:t>
       </w:r>
     </w:p>
     <w:p>
@@ -6407,7 +6394,7 @@
           <w:spacing w:val="0"/>
           <w:color w:val="0E121D"/>
         </w:rPr>
-        <w:t xml:space="preserve">Python pipeline, model settings and outputs</w:t>
+        <w:t xml:space="preserve">Saved work, settings and results</w:t>
       </w:r>
     </w:p>
     <w:p>
@@ -6433,7 +6420,7 @@
           <w:spacing w:val="0"/>
           <w:color w:val="0E121D"/>
         </w:rPr>
-        <w:t xml:space="preserve">Compare models</w:t>
+        <w:t xml:space="preserve">Compare the results</w:t>
       </w:r>
     </w:p>
     <w:p>
@@ -6459,7 +6446,7 @@
           <w:spacing w:val="0"/>
           <w:color w:val="0E121D"/>
         </w:rPr>
-        <w:t xml:space="preserve">MAE, MSE, RMSE and forecast chart</w:t>
+        <w:t xml:space="preserve">Error table and forecast chart</w:t>
       </w:r>
     </w:p>
     <w:p>
@@ -6485,7 +6472,7 @@
           <w:spacing w:val="0"/>
           <w:color w:val="0E121D"/>
         </w:rPr>
-        <w:t xml:space="preserve">Complete mid-project review</w:t>
+        <w:t xml:space="preserve">Complete the mid-project review</w:t>
       </w:r>
     </w:p>
     <w:p>
@@ -6537,7 +6524,7 @@
           <w:spacing w:val="0"/>
           <w:color w:val="0E121D"/>
         </w:rPr>
-        <w:t xml:space="preserve">Draft report</w:t>
+        <w:t xml:space="preserve">Draft the report</w:t>
       </w:r>
     </w:p>
     <w:p>
@@ -6563,7 +6550,7 @@
           <w:spacing w:val="0"/>
           <w:color w:val="0E121D"/>
         </w:rPr>
-        <w:t xml:space="preserve">Section drafts and consolidated report</w:t>
+        <w:t xml:space="preserve">Section drafts and combined report</w:t>
       </w:r>
     </w:p>
     <w:p>
@@ -6589,7 +6576,7 @@
           <w:spacing w:val="0"/>
           <w:color w:val="0E121D"/>
         </w:rPr>
-        <w:t xml:space="preserve">Prepare presentation and final reflection</w:t>
+        <w:t xml:space="preserve">Prepare the presentation and final reflection</w:t>
       </w:r>
     </w:p>
     <w:p>
@@ -6615,7 +6602,7 @@
           <w:spacing w:val="0"/>
           <w:color w:val="0E121D"/>
         </w:rPr>
-        <w:t xml:space="preserve">Slide material, script, Q&amp;A preparation and final reflection</w:t>
+        <w:t xml:space="preserve">Slides, script, Q&amp;A preparation and reflection</w:t>
       </w:r>
     </w:p>
     <w:p>
@@ -6630,7 +6617,7 @@
           <w:spacing w:val="0"/>
           <w:color w:val="0E121D"/>
         </w:rPr>
-        <w:t xml:space="preserve">These are documented target dates, not proof that a review or task occurred on each date.</w:t>
+        <w:t xml:space="preserve">These dates show the plan, not proof that every task was completed on its target date.</w:t>
       </w:r>
     </w:p>
     <w:p>
@@ -6733,7 +6720,7 @@
           <w:spacing w:val="0"/>
           <w:color w:val="0E121D"/>
         </w:rPr>
-        <w:t xml:space="preserve">Depth was more feasible than a shallow multi-asset comparison within the project scale.</w:t>
+        <w:t xml:space="preserve">One asset allowed a deeper and more manageable project.</w:t>
       </w:r>
     </w:p>
     <w:p>
@@ -6759,20 +6746,20 @@
           <w:spacing w:val="0"/>
           <w:color w:val="0E121D"/>
         </w:rPr>
-        <w:t xml:space="preserve">Use rolling volatility and GARCH as benchmarks</w:t>
-      </w:r>
-    </w:p>
-    <w:p>
-      <w:pPr/>
-      <w:r>
-        <w:rPr>
-          <w:rFonts w:ascii="Arial" w:hAnsi="Arial" w:cs="Arial"/>
-          <w:sz w:val="23"/>
-          <w:sz-cs w:val="23"/>
-          <w:spacing w:val="0"/>
-          <w:color w:val="0E121D"/>
-        </w:rPr>
-        <w:t xml:space="preserve">Rolling volatility gives a transparent minimum benchmark; GARCH explicitly models volatility clustering.</w:t>
+        <w:t xml:space="preserve">Begin with two clear reference methods</w:t>
+      </w:r>
+    </w:p>
+    <w:p>
+      <w:pPr/>
+      <w:r>
+        <w:rPr>
+          <w:rFonts w:ascii="Arial" w:hAnsi="Arial" w:cs="Arial"/>
+          <w:sz w:val="23"/>
+          <w:sz-cs w:val="23"/>
+          <w:spacing w:val="0"/>
+          <w:color w:val="0E121D"/>
+        </w:rPr>
+        <w:t xml:space="preserve">They provided understandable results against which the later methods could be judged.</w:t>
       </w:r>
     </w:p>
     <w:p>
@@ -6798,20 +6785,20 @@
           <w:spacing w:val="0"/>
           <w:color w:val="0E121D"/>
         </w:rPr>
-        <w:t xml:space="preserve">Use Random Forest and LSTM as the main machine-learning comparison</w:t>
-      </w:r>
-    </w:p>
-    <w:p>
-      <w:pPr/>
-      <w:r>
-        <w:rPr>
-          <w:rFonts w:ascii="Arial" w:hAnsi="Arial" w:cs="Arial"/>
-          <w:sz w:val="23"/>
-          <w:sz-cs w:val="23"/>
-          <w:spacing w:val="0"/>
-          <w:color w:val="0E121D"/>
-        </w:rPr>
-        <w:t xml:space="preserve">The two models test nonlinear lag relationships and sequential learning without adding many unrelated model families.</w:t>
+        <w:t xml:space="preserve">Compare Random Forest and LSTM</w:t>
+      </w:r>
+    </w:p>
+    <w:p>
+      <w:pPr/>
+      <w:r>
+        <w:rPr>
+          <w:rFonts w:ascii="Arial" w:hAnsi="Arial" w:cs="Arial"/>
+          <w:sz w:val="23"/>
+          <w:sz-cs w:val="23"/>
+          <w:spacing w:val="0"/>
+          <w:color w:val="0E121D"/>
+        </w:rPr>
+        <w:t xml:space="preserve">They represented two different machine-learning approaches without making the project too wide.</w:t>
       </w:r>
     </w:p>
     <w:p>
@@ -6837,20 +6824,20 @@
           <w:spacing w:val="0"/>
           <w:color w:val="0E121D"/>
         </w:rPr>
-        <w:t xml:space="preserve">Preserve chronological order</w:t>
-      </w:r>
-    </w:p>
-    <w:p>
-      <w:pPr/>
-      <w:r>
-        <w:rPr>
-          <w:rFonts w:ascii="Arial" w:hAnsi="Arial" w:cs="Arial"/>
-          <w:sz w:val="23"/>
-          <w:sz-cs w:val="23"/>
-          <w:spacing w:val="0"/>
-          <w:color w:val="0E121D"/>
-        </w:rPr>
-        <w:t xml:space="preserve">Random shuffling would allow later market information to influence an earlier forecast evaluation.</w:t>
+        <w:t xml:space="preserve">Keep the original time order</w:t>
+      </w:r>
+    </w:p>
+    <w:p>
+      <w:pPr/>
+      <w:r>
+        <w:rPr>
+          <w:rFonts w:ascii="Arial" w:hAnsi="Arial" w:cs="Arial"/>
+          <w:sz w:val="23"/>
+          <w:sz-cs w:val="23"/>
+          <w:spacing w:val="0"/>
+          <w:color w:val="0E121D"/>
+        </w:rPr>
+        <w:t xml:space="preserve">Using future information to judge an earlier prediction would be unfair.</w:t>
       </w:r>
     </w:p>
     <w:p>
@@ -6889,7 +6876,7 @@
           <w:spacing w:val="0"/>
           <w:color w:val="0E121D"/>
         </w:rPr>
-        <w:t xml:space="preserve">The project moved to a specific exchange-level BTC perpetual-futures market rather than an aggregated finance site.</w:t>
+        <w:t xml:space="preserve">This gave the project one clearly defined Bitcoin market.</w:t>
       </w:r>
     </w:p>
     <w:p>
@@ -6928,7 +6915,7 @@
           <w:spacing w:val="0"/>
           <w:color w:val="0E121D"/>
         </w:rPr>
-        <w:t xml:space="preserve">Interpretability, measured runtime, structural complexity and robustness affect whether extra complexity is worthwhile.</w:t>
+        <w:t xml:space="preserve">Ease of explanation, time required and consistency also affect whether extra complexity is useful.</w:t>
       </w:r>
     </w:p>
     <w:p>
@@ -6959,7 +6946,7 @@
           <w:spacing w:val="0"/>
           <w:color w:val="0E121D"/>
         </w:rPr>
-        <w:t xml:space="preserve">The repository contains a candidate-side summary suggesting that the comparison should not be a simple ranking by MAE or RMSE and should define comparative analysis more clearly. It is not an authenticated supervisor quotation.</w:t>
+        <w:t xml:space="preserve">The repository contains a candidate-side summary suggesting that the comparison should go beyond simply ranking the error figures and should explain more clearly what was being compared. It is not an authenticated supervisor quotation.</w:t>
       </w:r>
     </w:p>
     <w:p>
@@ -7124,7 +7111,7 @@
           <w:spacing w:val="0"/>
           <w:color w:val="0E121D"/>
         </w:rPr>
-        <w:t xml:space="preserve">I expanded the planned comparison to include model-specific interpretability evidence, measured local runtime, structural scale, reproducibility and robustness. Candidate confirmation: {{PLANNING_RESPONSE_CONFIRMED}}</w:t>
+        <w:t xml:space="preserve">I added clearer comparison points covering explanation, time required, repeatability and whether the result stayed similar after further checks. Candidate confirmation: {{PLANNING_RESPONSE_CONFIRMED}}</w:t>
       </w:r>
     </w:p>
     <w:p>
@@ -7418,7 +7405,7 @@
           <w:spacing w:val="0"/>
           <w:color w:val="0E121D"/>
         </w:rPr>
-        <w:t xml:space="preserve">The timetable recorded 2026-07-05 as a target for this review, but the repository does not prove that a formal supervisor review occurred on that date. The official date remains {{MID_REVIEW_DATE}}.</w:t>
+        <w:t xml:space="preserve">The timetable recorded 2026-07-05 as the target for this review, but the repository does not prove that a formal review occurred on that date. The official date remains {{MID_REVIEW_DATE}}.</w:t>
       </w:r>
     </w:p>
     <w:p>
@@ -7448,7 +7435,7 @@
           <w:spacing w:val="0"/>
           <w:color w:val="0E121D"/>
         </w:rPr>
-        <w:t xml:space="preserve">The project broadly followed the planned topic but developed in important ways. Bitcoin remained the core asset, while Ethereum was dropped so that the main comparison could be deeper. Hyperliquid replaced the initially planned Yahoo Finance source. The first modelling workflow established rolling volatility, GARCH and feature-based models, and lagged linear regression was added as a transparent check on whether engineered features required a nonlinear model. The evaluation remained chronological. I also recognised that daily rolling volatility is an overlapping proxy for latent volatility and that this limits how widely the findings can be generalised.</w:t>
+        <w:t xml:space="preserve">The project kept its main Bitcoin topic but became more focused. I removed Ethereum so that I could study one market in more depth and changed the data source from Yahoo Finance to Hyperliquid. I built the planned comparison methods and added one extra simple method to check whether the more complicated approaches were really necessary. I kept the data in time order and became more careful about explaining that the chosen daily volatility measure is only an estimate, so the conclusion should not be applied too widely.</w:t>
       </w:r>
       <w:r>
         <w:rPr>
@@ -7548,20 +7535,20 @@
           <w:spacing w:val="0"/>
           <w:color w:val="0E121D"/>
         </w:rPr>
-        <w:t xml:space="preserve">Daily realised volatility is a proxy rather than directly observed latent volatility</w:t>
-      </w:r>
-    </w:p>
-    <w:p>
-      <w:pPr/>
-      <w:r>
-        <w:rPr>
-          <w:rFonts w:ascii="Arial" w:hAnsi="Arial" w:cs="Arial"/>
-          <w:sz w:val="23"/>
-          <w:sz-cs w:val="23"/>
-          <w:spacing w:val="0"/>
-          <w:color w:val="0E121D"/>
-        </w:rPr>
-        <w:t xml:space="preserve">Define the target precisely and state the limitation throughout the report.</w:t>
+        <w:t xml:space="preserve">The project measures volatility indirectly</w:t>
+      </w:r>
+    </w:p>
+    <w:p>
+      <w:pPr/>
+      <w:r>
+        <w:rPr>
+          <w:rFonts w:ascii="Arial" w:hAnsi="Arial" w:cs="Arial"/>
+          <w:sz w:val="23"/>
+          <w:sz-cs w:val="23"/>
+          <w:spacing w:val="0"/>
+          <w:color w:val="0E121D"/>
+        </w:rPr>
+        <w:t xml:space="preserve">Define the measure clearly and keep this limitation visible.</w:t>
       </w:r>
     </w:p>
     <w:p>
@@ -7587,20 +7574,20 @@
           <w:spacing w:val="0"/>
           <w:color w:val="0E121D"/>
         </w:rPr>
-        <w:t xml:space="preserve">The rolling target overlaps strongly across days</w:t>
-      </w:r>
-    </w:p>
-    <w:p>
-      <w:pPr/>
-      <w:r>
-        <w:rPr>
-          <w:rFonts w:ascii="Arial" w:hAnsi="Arial" w:cs="Arial"/>
-          <w:sz w:val="23"/>
-          <w:sz-cs w:val="23"/>
-          <w:spacing w:val="0"/>
-          <w:color w:val="0E121D"/>
-        </w:rPr>
-        <w:t xml:space="preserve">Preserve time order and avoid treating observations as independent.</w:t>
+        <w:t xml:space="preserve">Neighbouring daily results are closely related</w:t>
+      </w:r>
+    </w:p>
+    <w:p>
+      <w:pPr/>
+      <w:r>
+        <w:rPr>
+          <w:rFonts w:ascii="Arial" w:hAnsi="Arial" w:cs="Arial"/>
+          <w:sz w:val="23"/>
+          <w:sz-cs w:val="23"/>
+          <w:spacing w:val="0"/>
+          <w:color w:val="0E121D"/>
+        </w:rPr>
+        <w:t xml:space="preserve">Keep the dates in order and avoid treating every row as completely separate.</w:t>
       </w:r>
     </w:p>
     <w:p>
@@ -7626,20 +7613,20 @@
           <w:spacing w:val="0"/>
           <w:color w:val="0E121D"/>
         </w:rPr>
-        <w:t xml:space="preserve">The dataset is small for deep learning</w:t>
-      </w:r>
-    </w:p>
-    <w:p>
-      <w:pPr/>
-      <w:r>
-        <w:rPr>
-          <w:rFonts w:ascii="Arial" w:hAnsi="Arial" w:cs="Arial"/>
-          <w:sz w:val="23"/>
-          <w:sz-cs w:val="23"/>
-          <w:spacing w:val="0"/>
-          <w:color w:val="0E121D"/>
-        </w:rPr>
-        <w:t xml:space="preserve">Keep the LSTM modest, use chronological validation and report architecture and training evidence.</w:t>
+        <w:t xml:space="preserve">The dataset is not large for the most complicated method</w:t>
+      </w:r>
+    </w:p>
+    <w:p>
+      <w:pPr/>
+      <w:r>
+        <w:rPr>
+          <w:rFonts w:ascii="Arial" w:hAnsi="Arial" w:cs="Arial"/>
+          <w:sz w:val="23"/>
+          <w:sz-cs w:val="23"/>
+          <w:spacing w:val="0"/>
+          <w:color w:val="0E121D"/>
+        </w:rPr>
+        <w:t xml:space="preserve">Keep that method small and make a cautious comparison.</w:t>
       </w:r>
     </w:p>
     <w:p>
@@ -7665,20 +7652,20 @@
           <w:spacing w:val="0"/>
           <w:color w:val="0E121D"/>
         </w:rPr>
-        <w:t xml:space="preserve">Machine-learning models are harder to explain</w:t>
-      </w:r>
-    </w:p>
-    <w:p>
-      <w:pPr/>
-      <w:r>
-        <w:rPr>
-          <w:rFonts w:ascii="Arial" w:hAnsi="Arial" w:cs="Arial"/>
-          <w:sz w:val="23"/>
-          <w:sz-cs w:val="23"/>
-          <w:spacing w:val="0"/>
-          <w:color w:val="0E121D"/>
-        </w:rPr>
-        <w:t xml:space="preserve">Export model-specific evidence and avoid claiming that complexity itself is useful.</w:t>
+        <w:t xml:space="preserve">Some methods are harder to explain</w:t>
+      </w:r>
+    </w:p>
+    <w:p>
+      <w:pPr/>
+      <w:r>
+        <w:rPr>
+          <w:rFonts w:ascii="Arial" w:hAnsi="Arial" w:cs="Arial"/>
+          <w:sz w:val="23"/>
+          <w:sz-cs w:val="23"/>
+          <w:spacing w:val="0"/>
+          <w:color w:val="0E121D"/>
+        </w:rPr>
+        <w:t xml:space="preserve">Include clarity as part of the final judgement.</w:t>
       </w:r>
     </w:p>
     <w:p>
@@ -7704,20 +7691,20 @@
           <w:spacing w:val="0"/>
           <w:color w:val="0E121D"/>
         </w:rPr>
-        <w:t xml:space="preserve">Early outputs could contain implementation errors</w:t>
-      </w:r>
-    </w:p>
-    <w:p>
-      <w:pPr/>
-      <w:r>
-        <w:rPr>
-          <w:rFonts w:ascii="Arial" w:hAnsi="Arial" w:cs="Arial"/>
-          <w:sz w:val="23"/>
-          <w:sz-cs w:val="23"/>
-          <w:spacing w:val="0"/>
-          <w:color w:val="0E121D"/>
-        </w:rPr>
-        <w:t xml:space="preserve">Audit alignment, scaling, target construction and forecast dates before treating rankings as final.</w:t>
+        <w:t xml:space="preserve">An early result could contain a data or date mistake</w:t>
+      </w:r>
+    </w:p>
+    <w:p>
+      <w:pPr/>
+      <w:r>
+        <w:rPr>
+          <w:rFonts w:ascii="Arial" w:hAnsi="Arial" w:cs="Arial"/>
+          <w:sz w:val="23"/>
+          <w:sz-cs w:val="23"/>
+          <w:spacing w:val="0"/>
+          <w:color w:val="0E121D"/>
+        </w:rPr>
+        <w:t xml:space="preserve">Check the dates, input data and calculations before accepting the ranking.</w:t>
       </w:r>
     </w:p>
     <w:p>
@@ -7743,20 +7730,20 @@
           <w:spacing w:val="0"/>
           <w:color w:val="0E121D"/>
         </w:rPr>
-        <w:t xml:space="preserve">Project administration was not recorded consistently while work was happening</w:t>
-      </w:r>
-    </w:p>
-    <w:p>
-      <w:pPr/>
-      <w:r>
-        <w:rPr>
-          <w:rFonts w:ascii="Arial" w:hAnsi="Arial" w:cs="Arial"/>
-          <w:sz w:val="23"/>
-          <w:sz-cs w:val="23"/>
-          <w:spacing w:val="0"/>
-          <w:color w:val="0E121D"/>
-        </w:rPr>
-        <w:t xml:space="preserve">Use Git, saved outputs and dated files to build an evidence-based weekly chronology, leaving gaps explicit.</w:t>
+        <w:t xml:space="preserve">Weekly administration had not always been recorded</w:t>
+      </w:r>
+    </w:p>
+    <w:p>
+      <w:pPr/>
+      <w:r>
+        <w:rPr>
+          <w:rFonts w:ascii="Arial" w:hAnsi="Arial" w:cs="Arial"/>
+          <w:sz w:val="23"/>
+          <w:sz-cs w:val="23"/>
+          <w:spacing w:val="0"/>
+          <w:color w:val="0E121D"/>
+        </w:rPr>
+        <w:t xml:space="preserve">Reconstruct only what the saved evidence supports and leave gaps visible.</w:t>
       </w:r>
     </w:p>
     <w:p>
@@ -8044,7 +8031,7 @@
           <w:spacing w:val="0"/>
           <w:color w:val="0E121D"/>
         </w:rPr>
-        <w:t xml:space="preserve"> To evaluate whether the additional complexity of Random Forest and LSTM is justified when compared with transparent statistical approaches to Bitcoin volatility forecasting.</w:t>
+        <w:t xml:space="preserve"> To judge whether Random Forest and LSTM provide enough benefit to justify their extra complexity when compared with clearer statistical approaches.</w:t>
       </w:r>
     </w:p>
     <w:p>
@@ -8098,7 +8085,7 @@
           <w:spacing w:val="0"/>
           <w:color w:val="0E121D"/>
         </w:rPr>
-        <w:t xml:space="preserve">Define log returns and rolling realised-volatility targets.</w:t>
+        <w:t xml:space="preserve">Explain the chosen measure of Bitcoin volatility.</w:t>
       </w:r>
     </w:p>
     <w:p>
@@ -8126,7 +8113,7 @@
           <w:spacing w:val="0"/>
           <w:color w:val="0E121D"/>
         </w:rPr>
-        <w:t xml:space="preserve">Collect and quality-check daily Hyperliquid BTC perpetual-futures candles.</w:t>
+        <w:t xml:space="preserve">Collect, organise and check the daily Bitcoin data.</w:t>
       </w:r>
     </w:p>
     <w:p>
@@ -8154,7 +8141,7 @@
           <w:spacing w:val="0"/>
           <w:color w:val="0E121D"/>
         </w:rPr>
-        <w:t xml:space="preserve">Implement rolling historical volatility, GARCH(1,1), lagged linear regression, Random Forest and LSTM.</w:t>
+        <w:t xml:space="preserve">Build the selected statistical and machine-learning comparisons.</w:t>
       </w:r>
     </w:p>
     <w:p>
@@ -8182,7 +8169,7 @@
           <w:spacing w:val="0"/>
           <w:color w:val="0E121D"/>
         </w:rPr>
-        <w:t xml:space="preserve">Use chronological validation and common MAE, MSE and RMSE metrics.</w:t>
+        <w:t xml:space="preserve">Test every method on the same time-ordered data.</w:t>
       </w:r>
     </w:p>
     <w:p>
@@ -8210,7 +8197,7 @@
           <w:spacing w:val="0"/>
           <w:color w:val="0E121D"/>
         </w:rPr>
-        <w:t xml:space="preserve">Compare interpretation evidence, measured runtime, structural complexity and reproducibility.</w:t>
+        <w:t xml:space="preserve">Compare accuracy, clarity, time required and repeatability.</w:t>
       </w:r>
     </w:p>
     <w:p>
@@ -8238,7 +8225,7 @@
           <w:spacing w:val="0"/>
           <w:color w:val="0E121D"/>
         </w:rPr>
-        <w:t xml:space="preserve">Audit temporal alignment, scaling and target construction.</w:t>
+        <w:t xml:space="preserve">Check that dates, data preparation and results match correctly.</w:t>
       </w:r>
     </w:p>
     <w:p>
@@ -8266,7 +8253,7 @@
           <w:spacing w:val="0"/>
           <w:color w:val="0E121D"/>
         </w:rPr>
-        <w:t xml:space="preserve">Test whether the conclusion remains stable under alternative windows and later robustness checks.</w:t>
+        <w:t xml:space="preserve">Repeat the comparison in several reasonable ways to see whether the conclusion changes.</w:t>
       </w:r>
     </w:p>
     <w:p>
@@ -8294,7 +8281,7 @@
           <w:spacing w:val="0"/>
           <w:color w:val="0E121D"/>
         </w:rPr>
-        <w:t xml:space="preserve">Give a bounded conclusion for this dataset and implementation.</w:t>
+        <w:t xml:space="preserve">Give a careful conclusion limited to this project.</w:t>
       </w:r>
     </w:p>
     <w:p>
@@ -8338,7 +8325,7 @@
           <w:spacing w:val="0"/>
           <w:color w:val="0E121D"/>
         </w:rPr>
-        <w:t xml:space="preserve">Complete the LSTM and verify that validation and scaling use training-period information only.</w:t>
+        <w:t xml:space="preserve">Complete the final planned method and check that it uses only the information available at the time.</w:t>
       </w:r>
     </w:p>
     <w:p>
@@ -8366,7 +8353,7 @@
           <w:spacing w:val="0"/>
           <w:color w:val="0E121D"/>
         </w:rPr>
-        <w:t xml:space="preserve">Audit GARCH forecast alignment and the rolling-target conversion.</w:t>
+        <w:t xml:space="preserve">Check that every prediction is matched to the correct date and comparison value.</w:t>
       </w:r>
     </w:p>
     <w:p>
@@ -8394,7 +8381,7 @@
           <w:spacing w:val="0"/>
           <w:color w:val="0E121D"/>
         </w:rPr>
-        <w:t xml:space="preserve">Rerun the complete model set after each material correction.</w:t>
+        <w:t xml:space="preserve">Repeat the full comparison after any important correction.</w:t>
       </w:r>
     </w:p>
     <w:p>
@@ -8422,7 +8409,7 @@
           <w:spacing w:val="0"/>
           <w:color w:val="0E121D"/>
         </w:rPr>
-        <w:t xml:space="preserve">Add at least one alternative volatility window.</w:t>
+        <w:t xml:space="preserve">Try at least one reasonable alternative way of measuring volatility.</w:t>
       </w:r>
     </w:p>
     <w:p>
@@ -8450,7 +8437,7 @@
           <w:spacing w:val="0"/>
           <w:color w:val="0E121D"/>
         </w:rPr>
-        <w:t xml:space="preserve">Expand the literature review, methodology, results, discussion and conclusion.</w:t>
+        <w:t xml:space="preserve">Expand the report's research, method, results, discussion and conclusion sections.</w:t>
       </w:r>
     </w:p>
     <w:p>
@@ -8478,7 +8465,7 @@
           <w:spacing w:val="0"/>
           <w:color w:val="0E121D"/>
         </w:rPr>
-        <w:t xml:space="preserve">Prepare presentation materials and record genuine Q&amp;A after delivery.</w:t>
+        <w:t xml:space="preserve">Prepare the presentation and record the real questions after it is delivered.</w:t>
       </w:r>
     </w:p>
     <w:p>
@@ -8605,19 +8592,6 @@
           <w:color w:val="0E121D"/>
         </w:rPr>
         <w:t xml:space="preserve">{{MID_REVIEW_SIGNATURE_AND_DATE_OFFICIAL_FORM_ONLY}}</w:t>
-      </w:r>
-    </w:p>
-    <w:p>
-      <w:pPr/>
-      <w:r>
-        <w:rPr>
-          <w:rFonts w:ascii="Arial" w:hAnsi="Arial" w:cs="Arial"/>
-          <w:sz w:val="28"/>
-          <w:sz-cs w:val="28"/>
-          <w:spacing w:val="0"/>
-          <w:color w:val="6D6D6D"/>
-        </w:rPr>
-        <w:t xml:space="preserve"/>
       </w:r>
     </w:p>
     <w:p>
@@ -8679,7 +8653,7 @@
           <w:spacing w:val="0"/>
           <w:color w:val="0E121D"/>
         </w:rPr>
-        <w:t xml:space="preserve">The product is a research report supported by a reproducible Python pipeline, archived market data, processed features and targets, model predictions, comparison tables, robustness outputs, a native chart, source evaluation and presentation preparation. The project followed the revised topic and comparison logic, but the methodology became stricter after several audits. Those changes are part of the product's development rather than being hidden from the record.</w:t>
+        <w:t xml:space="preserve">The main product is a research report supported by saved Bitcoin data, the work used to run the comparisons, result tables, a chart, source evaluation and presentation preparation. The topic stayed consistent with the revised plan, but the checking process became more careful after I found problems with dates and an incomplete day of data. I have kept those changes visible because they show how the project developed.</w:t>
       </w:r>
       <w:r>
         <w:rPr>
@@ -8802,20 +8776,20 @@
           <w:spacing w:val="0"/>
           <w:color w:val="0E121D"/>
         </w:rPr>
-        <w:t xml:space="preserve">Reproducible code and tests</w:t>
-      </w:r>
-    </w:p>
-    <w:p>
-      <w:pPr/>
-      <w:r>
-        <w:rPr>
-          <w:rFonts w:ascii="Arial" w:hAnsi="Arial" w:cs="Arial"/>
-          <w:sz w:val="23"/>
-          <w:sz-cs w:val="23"/>
-          <w:spacing w:val="0"/>
-          <w:color w:val="0E121D"/>
-        </w:rPr>
-        <w:t xml:space="preserve">code/epq_pipeline, code/tests and run scripts; current passing-test count: 39</w:t>
+        <w:t xml:space="preserve">Saved comparison work and checks</w:t>
+      </w:r>
+    </w:p>
+    <w:p>
+      <w:pPr/>
+      <w:r>
+        <w:rPr>
+          <w:rFonts w:ascii="Arial" w:hAnsi="Arial" w:cs="Arial"/>
+          <w:sz w:val="23"/>
+          <w:sz-cs w:val="23"/>
+          <w:spacing w:val="0"/>
+          <w:color w:val="0E121D"/>
+        </w:rPr>
+        <w:t xml:space="preserve">code folder, test folder and run files; 39 checks currently pass</w:t>
       </w:r>
     </w:p>
     <w:p>
@@ -8841,20 +8815,20 @@
           <w:spacing w:val="0"/>
           <w:color w:val="0E121D"/>
         </w:rPr>
-        <w:t xml:space="preserve">Market data and quality record</w:t>
-      </w:r>
-    </w:p>
-    <w:p>
-      <w:pPr/>
-      <w:r>
-        <w:rPr>
-          <w:rFonts w:ascii="Arial" w:hAnsi="Arial" w:cs="Arial"/>
-          <w:sz w:val="23"/>
-          <w:sz-cs w:val="23"/>
-          <w:spacing w:val="0"/>
-          <w:color w:val="0E121D"/>
-        </w:rPr>
-        <w:t xml:space="preserve">Completed daily Hyperliquid candles and quality JSON; current retained rows: 1,240</w:t>
+        <w:t xml:space="preserve">Market data and data-quality record</w:t>
+      </w:r>
+    </w:p>
+    <w:p>
+      <w:pPr/>
+      <w:r>
+        <w:rPr>
+          <w:rFonts w:ascii="Arial" w:hAnsi="Arial" w:cs="Arial"/>
+          <w:sz w:val="23"/>
+          <w:sz-cs w:val="23"/>
+          <w:spacing w:val="0"/>
+          <w:color w:val="0E121D"/>
+        </w:rPr>
+        <w:t xml:space="preserve">Completed daily Hyperliquid records; 1,240 completed days retained</w:t>
       </w:r>
     </w:p>
     <w:p>
@@ -8880,20 +8854,20 @@
           <w:spacing w:val="0"/>
           <w:color w:val="0E121D"/>
         </w:rPr>
-        <w:t xml:space="preserve">Model evidence</w:t>
-      </w:r>
-    </w:p>
-    <w:p>
-      <w:pPr/>
-      <w:r>
-        <w:rPr>
-          <w:rFonts w:ascii="Arial" w:hAnsi="Arial" w:cs="Arial"/>
-          <w:sz w:val="23"/>
-          <w:sz-cs w:val="23"/>
-          <w:spacing w:val="0"/>
-          <w:color w:val="0E121D"/>
-        </w:rPr>
-        <w:t xml:space="preserve">Predictions, metrics, parameters, timing, complexity and diagnostic outputs</w:t>
+        <w:t xml:space="preserve">Results evidence</w:t>
+      </w:r>
+    </w:p>
+    <w:p>
+      <w:pPr/>
+      <w:r>
+        <w:rPr>
+          <w:rFonts w:ascii="Arial" w:hAnsi="Arial" w:cs="Arial"/>
+          <w:sz w:val="23"/>
+          <w:sz-cs w:val="23"/>
+          <w:spacing w:val="0"/>
+          <w:color w:val="0E121D"/>
+        </w:rPr>
+        <w:t xml:space="preserve">Saved predictions, comparison figures and supporting checks</w:t>
       </w:r>
     </w:p>
     <w:p>
@@ -8932,7 +8906,7 @@
           <w:spacing w:val="0"/>
           <w:color w:val="0E121D"/>
         </w:rPr>
-        <w:t xml:space="preserve">Source list, literature notes, search log and source-evaluation workbook</w:t>
+        <w:t xml:space="preserve">Source list, reading notes, search log and source-evaluation workbook</w:t>
       </w:r>
     </w:p>
     <w:p>
@@ -8971,7 +8945,7 @@
           <w:spacing w:val="0"/>
           <w:color w:val="0E121D"/>
         </w:rPr>
-        <w:t xml:space="preserve">Slide outline, full script and Q&amp;A preparation; final delivered slide file: {{FINAL_PRESENTATION_FILE}}</w:t>
+        <w:t xml:space="preserve">Slide outline, script and Q&amp;A preparation; final slide file: {{FINAL_PRESENTATION_FILE}}</w:t>
       </w:r>
     </w:p>
     <w:p>
@@ -8987,7 +8961,7 @@
           <w:spacing w:val="0"/>
           <w:color w:val="1B3C5D"/>
         </w:rPr>
-        <w:t xml:space="preserve">PL-11.02 Major development and audit trail</w:t>
+        <w:t xml:space="preserve">PL-11.02 Major development and checking record</w:t>
       </w:r>
     </w:p>
     <w:p>
@@ -9061,20 +9035,20 @@
           <w:spacing w:val="0"/>
           <w:color w:val="0E121D"/>
         </w:rPr>
-        <w:t xml:space="preserve">Data source changed from Yahoo Finance to Hyperliquid</w:t>
-      </w:r>
-    </w:p>
-    <w:p>
-      <w:pPr/>
-      <w:r>
-        <w:rPr>
-          <w:rFonts w:ascii="Arial" w:hAnsi="Arial" w:cs="Arial"/>
-          <w:sz w:val="23"/>
-          <w:sz-cs w:val="23"/>
-          <w:spacing w:val="0"/>
-          <w:color w:val="0E121D"/>
-        </w:rPr>
-        <w:t xml:space="preserve">Defined one exchange-level BTC perpetual-futures market and made the market scope more precise.</w:t>
+        <w:t xml:space="preserve">The data source changed from Yahoo Finance to Hyperliquid</w:t>
+      </w:r>
+    </w:p>
+    <w:p>
+      <w:pPr/>
+      <w:r>
+        <w:rPr>
+          <w:rFonts w:ascii="Arial" w:hAnsi="Arial" w:cs="Arial"/>
+          <w:sz w:val="23"/>
+          <w:sz-cs w:val="23"/>
+          <w:spacing w:val="0"/>
+          <w:color w:val="0E121D"/>
+        </w:rPr>
+        <w:t xml:space="preserve">The study used one clearly identified Bitcoin market.</w:t>
       </w:r>
     </w:p>
     <w:p>
@@ -9100,20 +9074,20 @@
           <w:spacing w:val="0"/>
           <w:color w:val="0E121D"/>
         </w:rPr>
-        <w:t xml:space="preserve">Lagged linear regression added</w:t>
-      </w:r>
-    </w:p>
-    <w:p>
-      <w:pPr/>
-      <w:r>
-        <w:rPr>
-          <w:rFonts w:ascii="Arial" w:hAnsi="Arial" w:cs="Arial"/>
-          <w:sz w:val="23"/>
-          <w:sz-cs w:val="23"/>
-          <w:spacing w:val="0"/>
-          <w:color w:val="0E121D"/>
-        </w:rPr>
-        <w:t xml:space="preserve">Tested whether engineered lag information needed a nonlinear model.</w:t>
+        <w:t xml:space="preserve">An extra simple comparison was added</w:t>
+      </w:r>
+    </w:p>
+    <w:p>
+      <w:pPr/>
+      <w:r>
+        <w:rPr>
+          <w:rFonts w:ascii="Arial" w:hAnsi="Arial" w:cs="Arial"/>
+          <w:sz w:val="23"/>
+          <w:sz-cs w:val="23"/>
+          <w:spacing w:val="0"/>
+          <w:color w:val="0E121D"/>
+        </w:rPr>
+        <w:t xml:space="preserve">It helped show whether a more complicated method was actually needed.</w:t>
       </w:r>
     </w:p>
     <w:p>
@@ -9139,20 +9113,20 @@
           <w:spacing w:val="0"/>
           <w:color w:val="0E121D"/>
         </w:rPr>
-        <w:t xml:space="preserve">LSTM implemented and code refactored into a package</w:t>
-      </w:r>
-    </w:p>
-    <w:p>
-      <w:pPr/>
-      <w:r>
-        <w:rPr>
-          <w:rFonts w:ascii="Arial" w:hAnsi="Arial" w:cs="Arial"/>
-          <w:sz w:val="23"/>
-          <w:sz-cs w:val="23"/>
-          <w:spacing w:val="0"/>
-          <w:color w:val="0E121D"/>
-        </w:rPr>
-        <w:t xml:space="preserve">Completed the planned sequential-model comparison and improved reproducibility.</w:t>
+        <w:t xml:space="preserve">The final planned method was completed and the files were reorganised</w:t>
+      </w:r>
+    </w:p>
+    <w:p>
+      <w:pPr/>
+      <w:r>
+        <w:rPr>
+          <w:rFonts w:ascii="Arial" w:hAnsi="Arial" w:cs="Arial"/>
+          <w:sz w:val="23"/>
+          <w:sz-cs w:val="23"/>
+          <w:spacing w:val="0"/>
+          <w:color w:val="0E121D"/>
+        </w:rPr>
+        <w:t xml:space="preserve">The full comparison became easier to repeat and review.</w:t>
       </w:r>
     </w:p>
     <w:p>
@@ -9178,20 +9152,20 @@
           <w:spacing w:val="0"/>
           <w:color w:val="0E121D"/>
         </w:rPr>
-        <w:t xml:space="preserve">GARCH predictions mapped by date rather than reset row number</w:t>
-      </w:r>
-    </w:p>
-    <w:p>
-      <w:pPr/>
-      <w:r>
-        <w:rPr>
-          <w:rFonts w:ascii="Arial" w:hAnsi="Arial" w:cs="Arial"/>
-          <w:sz w:val="23"/>
-          <w:sz-cs w:val="23"/>
-          <w:spacing w:val="0"/>
-          <w:color w:val="0E121D"/>
-        </w:rPr>
-        <w:t xml:space="preserve">Removed a forecast-to-target alignment risk.</w:t>
+        <w:t xml:space="preserve">Predictions were matched using dates</w:t>
+      </w:r>
+    </w:p>
+    <w:p>
+      <w:pPr/>
+      <w:r>
+        <w:rPr>
+          <w:rFonts w:ascii="Arial" w:hAnsi="Arial" w:cs="Arial"/>
+          <w:sz w:val="23"/>
+          <w:sz-cs w:val="23"/>
+          <w:spacing w:val="0"/>
+          <w:color w:val="0E121D"/>
+        </w:rPr>
+        <w:t xml:space="preserve">This corrected the risk of connecting a result to the wrong day.</w:t>
       </w:r>
     </w:p>
     <w:p>
@@ -9217,20 +9191,20 @@
           <w:spacing w:val="0"/>
           <w:color w:val="0E121D"/>
         </w:rPr>
-        <w:t xml:space="preserve">GARCH likelihood update order corrected</w:t>
-      </w:r>
-    </w:p>
-    <w:p>
-      <w:pPr/>
-      <w:r>
-        <w:rPr>
-          <w:rFonts w:ascii="Arial" w:hAnsi="Arial" w:cs="Arial"/>
-          <w:sz w:val="23"/>
-          <w:sz-cs w:val="23"/>
-          <w:spacing w:val="0"/>
-          <w:color w:val="0E121D"/>
-        </w:rPr>
-        <w:t xml:space="preserve">Prevented the current shock from entering its own conditional variance.</w:t>
+        <w:t xml:space="preserve">One calculation step was corrected</w:t>
+      </w:r>
+    </w:p>
+    <w:p>
+      <w:pPr/>
+      <w:r>
+        <w:rPr>
+          <w:rFonts w:ascii="Arial" w:hAnsi="Arial" w:cs="Arial"/>
+          <w:sz w:val="23"/>
+          <w:sz-cs w:val="23"/>
+          <w:spacing w:val="0"/>
+          <w:color w:val="0E121D"/>
+        </w:rPr>
+        <w:t xml:space="preserve">The result no longer used information from the wrong point in time.</w:t>
       </w:r>
     </w:p>
     <w:p>
@@ -9256,20 +9230,20 @@
           <w:spacing w:val="0"/>
           <w:color w:val="0E121D"/>
         </w:rPr>
-        <w:t xml:space="preserve">Rolling sample-variance expectation corrected</w:t>
-      </w:r>
-    </w:p>
-    <w:p>
-      <w:pPr/>
-      <w:r>
-        <w:rPr>
-          <w:rFonts w:ascii="Arial" w:hAnsi="Arial" w:cs="Arial"/>
-          <w:sz w:val="23"/>
-          <w:sz-cs w:val="23"/>
-          <w:spacing w:val="0"/>
-          <w:color w:val="0E121D"/>
-        </w:rPr>
-        <w:t xml:space="preserve">Accounted for the uncertain next return changing both the sum of squares and the sample mean.</w:t>
+        <w:t xml:space="preserve">The volatility calculation was checked and corrected</w:t>
+      </w:r>
+    </w:p>
+    <w:p>
+      <w:pPr/>
+      <w:r>
+        <w:rPr>
+          <w:rFonts w:ascii="Arial" w:hAnsi="Arial" w:cs="Arial"/>
+          <w:sz w:val="23"/>
+          <w:sz-cs w:val="23"/>
+          <w:spacing w:val="0"/>
+          <w:color w:val="0E121D"/>
+        </w:rPr>
+        <w:t xml:space="preserve">The target was calculated more consistently.</w:t>
       </w:r>
     </w:p>
     <w:p>
@@ -9295,20 +9269,20 @@
           <w:spacing w:val="0"/>
           <w:color w:val="0E121D"/>
         </w:rPr>
-        <w:t xml:space="preserve">LSTM scaler limited to the fitting portion</w:t>
-      </w:r>
-    </w:p>
-    <w:p>
-      <w:pPr/>
-      <w:r>
-        <w:rPr>
-          <w:rFonts w:ascii="Arial" w:hAnsi="Arial" w:cs="Arial"/>
-          <w:sz w:val="23"/>
-          <w:sz-cs w:val="23"/>
-          <w:spacing w:val="0"/>
-          <w:color w:val="0E121D"/>
-        </w:rPr>
-        <w:t xml:space="preserve">Removed validation-period information from scaling estimates.</w:t>
+        <w:t xml:space="preserve">Data preparation for the final method was limited to the correct period</w:t>
+      </w:r>
+    </w:p>
+    <w:p>
+      <w:pPr/>
+      <w:r>
+        <w:rPr>
+          <w:rFonts w:ascii="Arial" w:hAnsi="Arial" w:cs="Arial"/>
+          <w:sz w:val="23"/>
+          <w:sz-cs w:val="23"/>
+          <w:spacing w:val="0"/>
+          <w:color w:val="0E121D"/>
+        </w:rPr>
+        <w:t xml:space="preserve">Later information was kept out of an earlier stage.</w:t>
       </w:r>
     </w:p>
     <w:p>
@@ -9334,20 +9308,20 @@
           <w:spacing w:val="0"/>
           <w:color w:val="0E121D"/>
         </w:rPr>
-        <w:t xml:space="preserve">Still-open daily candle excluded</w:t>
-      </w:r>
-    </w:p>
-    <w:p>
-      <w:pPr/>
-      <w:r>
-        <w:rPr>
-          <w:rFonts w:ascii="Arial" w:hAnsi="Arial" w:cs="Arial"/>
-          <w:sz w:val="23"/>
-          <w:sz-cs w:val="23"/>
-          <w:spacing w:val="0"/>
-          <w:color w:val="0E121D"/>
-        </w:rPr>
-        <w:t xml:space="preserve">Prevented a partial close and partial activity measures from entering the dataset.</w:t>
+        <w:t xml:space="preserve">The still-open daily record was excluded</w:t>
+      </w:r>
+    </w:p>
+    <w:p>
+      <w:pPr/>
+      <w:r>
+        <w:rPr>
+          <w:rFonts w:ascii="Arial" w:hAnsi="Arial" w:cs="Arial"/>
+          <w:sz w:val="23"/>
+          <w:sz-cs w:val="23"/>
+          <w:spacing w:val="0"/>
+          <w:color w:val="0E121D"/>
+        </w:rPr>
+        <w:t xml:space="preserve">Only completed days entered the final comparison.</w:t>
       </w:r>
     </w:p>
     <w:p>
@@ -9373,20 +9347,20 @@
           <w:spacing w:val="0"/>
           <w:color w:val="0E121D"/>
         </w:rPr>
-        <w:t xml:space="preserve">Robustness and diagnostics expanded</w:t>
-      </w:r>
-    </w:p>
-    <w:p>
-      <w:pPr/>
-      <w:r>
-        <w:rPr>
-          <w:rFonts w:ascii="Arial" w:hAnsi="Arial" w:cs="Arial"/>
-          <w:sz w:val="23"/>
-          <w:sz-cs w:val="23"/>
-          <w:spacing w:val="0"/>
-          <w:color w:val="0E121D"/>
-        </w:rPr>
-        <w:t xml:space="preserve">Added target-window, segment, expanding-window, regime, bootstrap, OOB, permutation and multi-seed evidence.</w:t>
+        <w:t xml:space="preserve">The comparison was repeated under several reasonable settings</w:t>
+      </w:r>
+    </w:p>
+    <w:p>
+      <w:pPr/>
+      <w:r>
+        <w:rPr>
+          <w:rFonts w:ascii="Arial" w:hAnsi="Arial" w:cs="Arial"/>
+          <w:sz w:val="23"/>
+          <w:sz-cs w:val="23"/>
+          <w:spacing w:val="0"/>
+          <w:color w:val="0E121D"/>
+        </w:rPr>
+        <w:t xml:space="preserve">This showed whether the main conclusion was stable.</w:t>
       </w:r>
     </w:p>
     <w:p>
@@ -9401,7 +9375,7 @@
           <w:spacing w:val="0"/>
           <w:color w:val="0E121D"/>
         </w:rPr>
-        <w:t xml:space="preserve">The candidate must describe personal involvement accurately. Replace any unsupported “I coded” or “I corrected” wording with a truthful account of what was done with AI assistance and what the candidate personally reviewed or tested.</w:t>
+        <w:t xml:space="preserve">The candidate must describe personal involvement accurately. Any statement about creating or correcting work should explain truthfully what was completed with AI assistance and what the candidate personally reviewed or tested.</w:t>
       </w:r>
     </w:p>
     <w:p>
@@ -9432,7 +9406,7 @@
           <w:spacing w:val="0"/>
           <w:color w:val="0E121D"/>
         </w:rPr>
-        <w:t xml:space="preserve">The values below come from the final 2026-07-20 data refresh and model run. The run metadata was generated at 2026-07-20T06:14:33+00:00.</w:t>
+        <w:t xml:space="preserve">The values below come from the data refresh and full comparison completed on 2026-07-20. More detailed figures remain in the report and saved output files.</w:t>
       </w:r>
     </w:p>
     <w:p>
@@ -9545,7 +9519,7 @@
           <w:spacing w:val="0"/>
           <w:color w:val="0E121D"/>
         </w:rPr>
-        <w:t xml:space="preserve">Fetch timestamp UTC</w:t>
+        <w:t xml:space="preserve">Time the data was collected</w:t>
       </w:r>
     </w:p>
     <w:p>
@@ -9584,7 +9558,7 @@
           <w:spacing w:val="0"/>
           <w:color w:val="0E121D"/>
         </w:rPr>
-        <w:t xml:space="preserve">API rows returned</w:t>
+        <w:t xml:space="preserve">Daily records returned</w:t>
       </w:r>
     </w:p>
     <w:p>
@@ -9623,7 +9597,7 @@
           <w:spacing w:val="0"/>
           <w:color w:val="0E121D"/>
         </w:rPr>
-        <w:t xml:space="preserve">Incomplete rows excluded</w:t>
+        <w:t xml:space="preserve">Unfinished records removed</w:t>
       </w:r>
     </w:p>
     <w:p>
@@ -9662,7 +9636,7 @@
           <w:spacing w:val="0"/>
           <w:color w:val="0E121D"/>
         </w:rPr>
-        <w:t xml:space="preserve">Completed candle rows retained</w:t>
+        <w:t xml:space="preserve">Completed daily records kept</w:t>
       </w:r>
     </w:p>
     <w:p>
@@ -9701,7 +9675,7 @@
           <w:spacing w:val="0"/>
           <w:color w:val="0E121D"/>
         </w:rPr>
-        <w:t xml:space="preserve">Last completed candle date</w:t>
+        <w:t xml:space="preserve">Last complete date</w:t>
       </w:r>
     </w:p>
     <w:p>
@@ -9740,7 +9714,7 @@
           <w:spacing w:val="0"/>
           <w:color w:val="0E121D"/>
         </w:rPr>
-        <w:t xml:space="preserve">Modelling-frame rows</w:t>
+        <w:t xml:space="preserve">Rows used after preparation</w:t>
       </w:r>
     </w:p>
     <w:p>
@@ -9779,7 +9753,7 @@
           <w:spacing w:val="0"/>
           <w:color w:val="0E121D"/>
         </w:rPr>
-        <w:t xml:space="preserve">Training rows</w:t>
+        <w:t xml:space="preserve">Earlier rows used for learning</w:t>
       </w:r>
     </w:p>
     <w:p>
@@ -9818,7 +9792,7 @@
           <w:spacing w:val="0"/>
           <w:color w:val="0E121D"/>
         </w:rPr>
-        <w:t xml:space="preserve">Test rows</w:t>
+        <w:t xml:space="preserve">Later rows used for comparison</w:t>
       </w:r>
     </w:p>
     <w:p>
@@ -9857,7 +9831,7 @@
           <w:spacing w:val="0"/>
           <w:color w:val="0E121D"/>
         </w:rPr>
-        <w:t xml:space="preserve">GARCH 30-day RMSE</w:t>
+        <w:t xml:space="preserve">Best main error figure</w:t>
       </w:r>
     </w:p>
     <w:p>
@@ -9896,7 +9870,7 @@
           <w:spacing w:val="0"/>
           <w:color w:val="0E121D"/>
         </w:rPr>
-        <w:t xml:space="preserve">Lagged linear 30-day RMSE</w:t>
+        <w:t xml:space="preserve">Extra simple comparison</w:t>
       </w:r>
     </w:p>
     <w:p>
@@ -9935,7 +9909,7 @@
           <w:spacing w:val="0"/>
           <w:color w:val="0E121D"/>
         </w:rPr>
-        <w:t xml:space="preserve">Rolling 30-day RMSE</w:t>
+        <w:t xml:space="preserve">Rolling comparison</w:t>
       </w:r>
     </w:p>
     <w:p>
@@ -9974,7 +9948,7 @@
           <w:spacing w:val="0"/>
           <w:color w:val="0E121D"/>
         </w:rPr>
-        <w:t xml:space="preserve">LSTM 30-day RMSE</w:t>
+        <w:t xml:space="preserve">LSTM comparison</w:t>
       </w:r>
     </w:p>
     <w:p>
@@ -10013,7 +9987,7 @@
           <w:spacing w:val="0"/>
           <w:color w:val="0E121D"/>
         </w:rPr>
-        <w:t xml:space="preserve">Random Forest 30-day RMSE</w:t>
+        <w:t xml:space="preserve">Random Forest comparison</w:t>
       </w:r>
     </w:p>
     <w:p>
@@ -10052,7 +10026,7 @@
           <w:spacing w:val="0"/>
           <w:color w:val="0E121D"/>
         </w:rPr>
-        <w:t xml:space="preserve">GARCH expanding-window RMSE</w:t>
+        <w:t xml:space="preserve">Best result in the repeated time-based check</w:t>
       </w:r>
     </w:p>
     <w:p>
@@ -10091,7 +10065,7 @@
           <w:spacing w:val="0"/>
           <w:color w:val="0E121D"/>
         </w:rPr>
-        <w:t xml:space="preserve">GARCH bootstrap interval versus rolling</w:t>
+        <w:t xml:space="preserve">Range from the uncertainty check</w:t>
       </w:r>
     </w:p>
     <w:p>
@@ -10130,7 +10104,7 @@
           <w:spacing w:val="0"/>
           <w:color w:val="0E121D"/>
         </w:rPr>
-        <w:t xml:space="preserve">Passing tests</w:t>
+        <w:t xml:space="preserve">Automated checks passed</w:t>
       </w:r>
     </w:p>
     <w:p>
@@ -10187,7 +10161,7 @@
           <w:spacing w:val="0"/>
           <w:color w:val="0E121D"/>
         </w:rPr>
-        <w:t xml:space="preserve">The same explicit target and chronological test logic are used across the five primary comparators.</w:t>
+        <w:t xml:space="preserve">All main methods were compared using the same target and the same time order.</w:t>
       </w:r>
     </w:p>
     <w:p>
@@ -10215,7 +10189,7 @@
           <w:spacing w:val="0"/>
           <w:color w:val="0E121D"/>
         </w:rPr>
-        <w:t xml:space="preserve">Saved outputs support numerical claims and preserve forecast-origin and target dates.</w:t>
+        <w:t xml:space="preserve">Results were saved in tables so that the figures could be checked again.</w:t>
       </w:r>
     </w:p>
     <w:p>
@@ -10243,7 +10217,7 @@
           <w:spacing w:val="0"/>
           <w:color w:val="0E121D"/>
         </w:rPr>
-        <w:t xml:space="preserve">The audit trail records material corrections instead of silently retaining an invalid early ranking.</w:t>
+        <w:t xml:space="preserve">Important corrections were recorded instead of hiding the earlier problem.</w:t>
       </w:r>
     </w:p>
     <w:p>
@@ -10271,7 +10245,7 @@
           <w:spacing w:val="0"/>
           <w:color w:val="0E121D"/>
         </w:rPr>
-        <w:t xml:space="preserve">Robustness evidence tests whether the conclusion depends on one window, one test segment, one volatility regime or one LSTM seed.</w:t>
+        <w:t xml:space="preserve">The comparison was repeated in several ways to see whether the overall answer changed.</w:t>
       </w:r>
     </w:p>
     <w:p>
@@ -10299,7 +10273,7 @@
           <w:spacing w:val="0"/>
           <w:color w:val="0E121D"/>
         </w:rPr>
-        <w:t xml:space="preserve">The final conclusion is bounded to the selected market, period, target and implementations.</w:t>
+        <w:t xml:space="preserve">The final conclusion is limited to the market, dates and methods used in this project.</w:t>
       </w:r>
     </w:p>
     <w:p>
@@ -10343,7 +10317,7 @@
           <w:spacing w:val="0"/>
           <w:color w:val="0E121D"/>
         </w:rPr>
-        <w:t xml:space="preserve">Daily realised volatility is a proxy and does not use intraday realised variance.</w:t>
+        <w:t xml:space="preserve">The project estimates volatility from daily data rather than observing it directly.</w:t>
       </w:r>
     </w:p>
     <w:p>
@@ -10371,7 +10345,7 @@
           <w:spacing w:val="0"/>
           <w:color w:val="0E121D"/>
         </w:rPr>
-        <w:t xml:space="preserve">Overlapping rolling targets create strong persistence and dependent errors.</w:t>
+        <w:t xml:space="preserve">Results for neighbouring days are closely related, so the evidence is not completely independent.</w:t>
       </w:r>
     </w:p>
     <w:p>
@@ -10399,7 +10373,7 @@
           <w:spacing w:val="0"/>
           <w:color w:val="0E121D"/>
         </w:rPr>
-        <w:t xml:space="preserve">The Random Forest is a lightweight local implementation rather than an extensively tuned library benchmark.</w:t>
+        <w:t xml:space="preserve">The Random Forest comparison is deliberately modest and was not tuned in every possible way.</w:t>
       </w:r>
     </w:p>
     <w:p>
@@ -10427,7 +10401,7 @@
           <w:spacing w:val="0"/>
           <w:color w:val="0E121D"/>
         </w:rPr>
-        <w:t xml:space="preserve">The LSTM is deliberately small and the dataset is limited for deep learning.</w:t>
+        <w:t xml:space="preserve">The LSTM is small and the available dataset is limited for a complicated model.</w:t>
       </w:r>
     </w:p>
     <w:p>
@@ -10455,7 +10429,7 @@
           <w:spacing w:val="0"/>
           <w:color w:val="0E121D"/>
         </w:rPr>
-        <w:t xml:space="preserve">One BTC perpetual-futures market cannot establish universal model superiority.</w:t>
+        <w:t xml:space="preserve">One Bitcoin market cannot prove that the same result will hold everywhere.</w:t>
       </w:r>
     </w:p>
     <w:p>
@@ -10483,7 +10457,7 @@
           <w:spacing w:val="0"/>
           <w:color w:val="0E121D"/>
         </w:rPr>
-        <w:t xml:space="preserve">Four expanding-window blocks remain parts of one history, not independent external datasets.</w:t>
+        <w:t xml:space="preserve">Repeating the test across parts of the same history is not the same as using a completely new dataset.</w:t>
       </w:r>
     </w:p>
     <w:p>
@@ -10511,7 +10485,7 @@
           <w:spacing w:val="0"/>
           <w:color w:val="0E121D"/>
         </w:rPr>
-        <w:t xml:space="preserve">Early administration was weaker than the later technical audit; many days lack direct process records.</w:t>
+        <w:t xml:space="preserve">Early weekly record-keeping was weaker than the later checking process.</w:t>
       </w:r>
     </w:p>
     <w:p>
@@ -10539,7 +10513,7 @@
           <w:spacing w:val="0"/>
           <w:color w:val="0E121D"/>
         </w:rPr>
-        <w:t xml:space="preserve">AI-supported implementation and drafting require precise disclosure and candidate verification.</w:t>
+        <w:t xml:space="preserve">Any AI-supported work and writing must be disclosed accurately and checked by the candidate.</w:t>
       </w:r>
     </w:p>
     <w:p>
@@ -11326,7 +11300,7 @@
           <w:spacing w:val="0"/>
           <w:color w:val="0E121D"/>
         </w:rPr>
-        <w:t xml:space="preserve">How the question narrowed from a broad machine-learning comparison to Bitcoin volatility forecasting.</w:t>
+        <w:t xml:space="preserve">How I narrowed the question to Bitcoin volatility forecasting.</w:t>
       </w:r>
     </w:p>
     <w:p>
@@ -11354,7 +11328,7 @@
           <w:spacing w:val="0"/>
           <w:color w:val="0E121D"/>
         </w:rPr>
-        <w:t xml:space="preserve">Why the data source changed to Hyperliquid BTC perpetual-futures candles.</w:t>
+        <w:t xml:space="preserve">Why I changed the data source to Hyperliquid.</w:t>
       </w:r>
     </w:p>
     <w:p>
@@ -11382,7 +11356,7 @@
           <w:spacing w:val="0"/>
           <w:color w:val="0E121D"/>
         </w:rPr>
-        <w:t xml:space="preserve">How log returns and rolling realised-volatility targets were constructed.</w:t>
+        <w:t xml:space="preserve">How I prepared the daily data and decided what to measure.</w:t>
       </w:r>
     </w:p>
     <w:p>
@@ -11410,7 +11384,7 @@
           <w:spacing w:val="0"/>
           <w:color w:val="0E121D"/>
         </w:rPr>
-        <w:t xml:space="preserve">Why a chronological holdout and expanding-window checks were used.</w:t>
+        <w:t xml:space="preserve">Why I kept the data in date order for a fair comparison.</w:t>
       </w:r>
     </w:p>
     <w:p>
@@ -11438,7 +11412,7 @@
           <w:spacing w:val="0"/>
           <w:color w:val="0E121D"/>
         </w:rPr>
-        <w:t xml:space="preserve">How date alignment, likelihood order, sample-variance conversion, scaling and incomplete-candle audits improved the evidence.</w:t>
+        <w:t xml:space="preserve">How checking the dates, calculations and unfinished daily record changed the project.</w:t>
       </w:r>
     </w:p>
     <w:p>
@@ -11466,7 +11440,7 @@
           <w:spacing w:val="0"/>
           <w:color w:val="0E121D"/>
         </w:rPr>
-        <w:t xml:space="preserve">How source evaluation, code outputs and limitations informed the final judgment.</w:t>
+        <w:t xml:space="preserve">How the research, results and limitations led to the final judgement.</w:t>
       </w:r>
     </w:p>
     <w:p>
@@ -11497,7 +11471,7 @@
           <w:spacing w:val="0"/>
           <w:color w:val="0E121D"/>
         </w:rPr>
-        <w:t xml:space="preserve">The presentation will insert the final synchronised values:</w:t>
+        <w:t xml:space="preserve">The presentation will use the final checked values:</w:t>
       </w:r>
     </w:p>
     <w:p>
@@ -11571,7 +11545,7 @@
           <w:spacing w:val="0"/>
           <w:color w:val="0E121D"/>
         </w:rPr>
-        <w:t xml:space="preserve">Best primary 30-day RMSE model</w:t>
+        <w:t xml:space="preserve">Best result in the main comparison</w:t>
       </w:r>
     </w:p>
     <w:p>
@@ -11610,7 +11584,7 @@
           <w:spacing w:val="0"/>
           <w:color w:val="0E121D"/>
         </w:rPr>
-        <w:t xml:space="preserve">GARCH primary RMSE</w:t>
+        <w:t xml:space="preserve">Best main error figure</w:t>
       </w:r>
     </w:p>
     <w:p>
@@ -11649,7 +11623,7 @@
           <w:spacing w:val="0"/>
           <w:color w:val="0E121D"/>
         </w:rPr>
-        <w:t xml:space="preserve">Rolling benchmark RMSE</w:t>
+        <w:t xml:space="preserve">Simple rolling comparison</w:t>
       </w:r>
     </w:p>
     <w:p>
@@ -11688,20 +11662,20 @@
           <w:spacing w:val="0"/>
           <w:color w:val="0E121D"/>
         </w:rPr>
-        <w:t xml:space="preserve">Alternative-window conclusion</w:t>
-      </w:r>
-    </w:p>
-    <w:p>
-      <w:pPr/>
-      <w:r>
-        <w:rPr>
-          <w:rFonts w:ascii="Arial" w:hAnsi="Arial" w:cs="Arial"/>
-          <w:sz w:val="23"/>
-          <w:sz-cs w:val="23"/>
-          <w:spacing w:val="0"/>
-          <w:color w:val="0E121D"/>
-        </w:rPr>
-        <w:t xml:space="preserve">GARCH ranks first for the 14-day target with RMSE 0.00178208, 35.482% below rolling.</w:t>
+        <w:t xml:space="preserve">Result with a shorter measurement period</w:t>
+      </w:r>
+    </w:p>
+    <w:p>
+      <w:pPr/>
+      <w:r>
+        <w:rPr>
+          <w:rFonts w:ascii="Arial" w:hAnsi="Arial" w:cs="Arial"/>
+          <w:sz w:val="23"/>
+          <w:sz-cs w:val="23"/>
+          <w:spacing w:val="0"/>
+          <w:color w:val="0E121D"/>
+        </w:rPr>
+        <w:t xml:space="preserve">The same method remained first, with an error of 0.00178208.</w:t>
       </w:r>
     </w:p>
     <w:p>
@@ -11727,20 +11701,20 @@
           <w:spacing w:val="0"/>
           <w:color w:val="0E121D"/>
         </w:rPr>
-        <w:t xml:space="preserve">Expanding-window conclusion</w:t>
-      </w:r>
-    </w:p>
-    <w:p>
-      <w:pPr/>
-      <w:r>
-        <w:rPr>
-          <w:rFonts w:ascii="Arial" w:hAnsi="Arial" w:cs="Arial"/>
-          <w:sz w:val="23"/>
-          <w:sz-cs w:val="23"/>
-          <w:spacing w:val="0"/>
-          <w:color w:val="0E121D"/>
-        </w:rPr>
-        <w:t xml:space="preserve">GARCH ranks first overall with RMSE 0.00098681 and ranks first in each of the four chronological folds.</w:t>
+        <w:t xml:space="preserve">Result when the comparison was repeated through time</w:t>
+      </w:r>
+    </w:p>
+    <w:p>
+      <w:pPr/>
+      <w:r>
+        <w:rPr>
+          <w:rFonts w:ascii="Arial" w:hAnsi="Arial" w:cs="Arial"/>
+          <w:sz w:val="23"/>
+          <w:sz-cs w:val="23"/>
+          <w:spacing w:val="0"/>
+          <w:color w:val="0E121D"/>
+        </w:rPr>
+        <w:t xml:space="preserve">The same method ranked first overall and in each of the four sections.</w:t>
       </w:r>
     </w:p>
     <w:p>
@@ -11766,20 +11740,20 @@
           <w:spacing w:val="0"/>
           <w:color w:val="0E121D"/>
         </w:rPr>
-        <w:t xml:space="preserve">Machine-learning conclusion</w:t>
-      </w:r>
-    </w:p>
-    <w:p>
-      <w:pPr/>
-      <w:r>
-        <w:rPr>
-          <w:rFonts w:ascii="Arial" w:hAnsi="Arial" w:cs="Arial"/>
-          <w:sz w:val="23"/>
-          <w:sz-cs w:val="23"/>
-          <w:spacing w:val="0"/>
-          <w:color w:val="0E121D"/>
-        </w:rPr>
-        <w:t xml:space="preserve">Neither machine-learning model beats rolling: LSTM ranks fourth and Random Forest fifth on primary RMSE.</w:t>
+        <w:t xml:space="preserve">Machine-learning result</w:t>
+      </w:r>
+    </w:p>
+    <w:p>
+      <w:pPr/>
+      <w:r>
+        <w:rPr>
+          <w:rFonts w:ascii="Arial" w:hAnsi="Arial" w:cs="Arial"/>
+          <w:sz w:val="23"/>
+          <w:sz-cs w:val="23"/>
+          <w:spacing w:val="0"/>
+          <w:color w:val="0E121D"/>
+        </w:rPr>
+        <w:t xml:space="preserve">Neither machine-learning method beat the simple rolling comparison.</w:t>
       </w:r>
     </w:p>
     <w:p>
@@ -11794,7 +11768,7 @@
           <w:spacing w:val="0"/>
           <w:color w:val="0E121D"/>
         </w:rPr>
-        <w:t xml:space="preserve">The intended conclusion is bounded: the tested machine-learning models do not justify their additional complexity under this daily-data design; this is not a claim about every Bitcoin market or every machine-learning method.</w:t>
+        <w:t xml:space="preserve">My conclusion will be careful: in this project, the tested machine-learning methods did not improve the result enough to justify their extra complexity. This does not prove that the same answer applies to every Bitcoin market or every machine-learning method.</w:t>
       </w:r>
     </w:p>
     <w:p>
@@ -13147,7 +13121,7 @@
           <w:spacing w:val="0"/>
           <w:color w:val="0E121D"/>
         </w:rPr>
-        <w:t xml:space="preserve">This project taught me that the quality of a forecast comparison depends first on the definition of the question and target. I learned to distinguish latent volatility from an observable rolling proxy, to calculate log returns, and to understand why volatility clustering motivates GARCH. I also learned that a persistent target can make simple models strong. A complicated model does not begin with an automatic advantage, and a small numerical difference is not meaningful unless the validation design and uncertainty support it.</w:t>
+        <w:t xml:space="preserve">This project taught me that a comparison depends first on asking a clear question and defining exactly what will be measured. I learned how daily Bitcoin price changes can be used to estimate volatility and why a simple method can sometimes perform very well. I also learned that a complicated method does not automatically have an advantage and that a small difference in a result only matters if the comparison itself is fair.</w:t>
       </w:r>
       <w:r>
         <w:rPr>
@@ -13203,7 +13177,7 @@
           <w:spacing w:val="0"/>
           <w:color w:val="0E121D"/>
         </w:rPr>
-        <w:t xml:space="preserve">My most important methodological lesson was that reproducible code can still be conceptually wrong. Saving a script is not enough if a prediction is aligned to the wrong date, if the current shock leaks into its own conditional variance, if a sample-variance conversion ignores the moving sample mean, if validation information influences scaling, or if an unfinished candle enters the data. The audit changed the strength of the evidence and made me more cautious about accepting the first output. I learned to use explicit dates, failure checks, unit tests, metadata and saved predictions as part of the argument rather than treating code as a hidden calculation.</w:t>
+        <w:t xml:space="preserve">My most important lesson was that a saved and repeatable process can still contain a mistake. Dates may be matched incorrectly, later information may enter an earlier stage or an unfinished day may be included. I therefore learned to check the meaning and timing of the data, repeat the work after corrections and keep the earlier change visible. Saved results, dates and simple checks became part of the evidence rather than background computer work.</w:t>
       </w:r>
       <w:r>
         <w:rPr>
@@ -13257,7 +13231,7 @@
           <w:spacing w:val="0"/>
           <w:color w:val="0E121D"/>
         </w:rPr>
-        <w:t xml:space="preserve">The project developed a focused and answerable research question.</w:t>
+        <w:t xml:space="preserve">The project developed a focused and answerable question.</w:t>
       </w:r>
     </w:p>
     <w:p>
@@ -13285,7 +13259,7 @@
           <w:spacing w:val="0"/>
           <w:color w:val="0E121D"/>
         </w:rPr>
-        <w:t xml:space="preserve">It compared transparent baselines with two different machine-learning approaches.</w:t>
+        <w:t xml:space="preserve">It compared clear reference methods with two different machine-learning methods.</w:t>
       </w:r>
     </w:p>
     <w:p>
@@ -13313,7 +13287,7 @@
           <w:spacing w:val="0"/>
           <w:color w:val="0E121D"/>
         </w:rPr>
-        <w:t xml:space="preserve">It retained an audit trail and reported method changes that affected the result.</w:t>
+        <w:t xml:space="preserve">It kept a record of important changes that affected the result.</w:t>
       </w:r>
     </w:p>
     <w:p>
@@ -13341,7 +13315,7 @@
           <w:spacing w:val="0"/>
           <w:color w:val="0E121D"/>
         </w:rPr>
-        <w:t xml:space="preserve">It combined numerical accuracy with interpretability, practicality and robustness.</w:t>
+        <w:t xml:space="preserve">It considered clarity and practicality as well as numerical accuracy.</w:t>
       </w:r>
     </w:p>
     <w:p>
@@ -13369,7 +13343,7 @@
           <w:spacing w:val="0"/>
           <w:color w:val="0E121D"/>
         </w:rPr>
-        <w:t xml:space="preserve">It produced reusable code, datasets, tables, diagnostics and presentation preparation rather than only a narrative report.</w:t>
+        <w:t xml:space="preserve">It produced a report, saved data, result tables, checking records and presentation material.</w:t>
       </w:r>
     </w:p>
     <w:p>
@@ -13413,7 +13387,7 @@
           <w:spacing w:val="0"/>
           <w:color w:val="0E121D"/>
         </w:rPr>
-        <w:t xml:space="preserve">Early project administration was not recorded consistently, so some process history is reconstructed from Git and generated files.</w:t>
+        <w:t xml:space="preserve">Early project activity was not recorded consistently, so some weeks had to be reconstructed from saved evidence.</w:t>
       </w:r>
     </w:p>
     <w:p>
@@ -13441,7 +13415,7 @@
           <w:spacing w:val="0"/>
           <w:color w:val="0E121D"/>
         </w:rPr>
-        <w:t xml:space="preserve">The target is based on daily data and overlapping rolling windows rather than intraday realised variance.</w:t>
+        <w:t xml:space="preserve">The project uses daily data and an estimated measure of volatility.</w:t>
       </w:r>
     </w:p>
     <w:p>
@@ -13469,7 +13443,7 @@
           <w:spacing w:val="0"/>
           <w:color w:val="0E121D"/>
         </w:rPr>
-        <w:t xml:space="preserve">The project studies one market and a modest set of implementations.</w:t>
+        <w:t xml:space="preserve">It studies one market and a limited group of methods.</w:t>
       </w:r>
     </w:p>
     <w:p>
@@ -13497,7 +13471,7 @@
           <w:spacing w:val="0"/>
           <w:color w:val="0E121D"/>
         </w:rPr>
-        <w:t xml:space="preserve">Machine-learning tuning is limited, particularly for the LSTM.</w:t>
+        <w:t xml:space="preserve">There was not enough time or data to try every possible setting for the machine-learning methods.</w:t>
       </w:r>
     </w:p>
     <w:p>
@@ -13525,7 +13499,7 @@
           <w:spacing w:val="0"/>
           <w:color w:val="0E121D"/>
         </w:rPr>
-        <w:t xml:space="preserve">Extensive AI assistance means that the candidate must be especially precise about personal decisions, verification and understanding.</w:t>
+        <w:t xml:space="preserve">Extensive AI assistance means that my own decisions, checks and understanding must be stated especially carefully.</w:t>
       </w:r>
     </w:p>
     <w:p>
@@ -13571,7 +13545,7 @@
           <w:spacing w:val="0"/>
           <w:color w:val="0E121D"/>
         </w:rPr>
-        <w:t xml:space="preserve">I developed skills in narrowing a research question, evaluating sources, designing chronological validation, interpreting statistical and machine-learning models, checking data quality, reading generated evidence critically, organising a repository and communicating a bounded conclusion. I also improved my understanding of why model comparison must separate predictive accuracy from interpretability and computational cost. I will identify which of these skills I personally demonstrated and provide examples before signing the final log.</w:t>
+        <w:t xml:space="preserve">I developed skills in narrowing a question, evaluating sources, organising a longer project, checking data quality, comparing results fairly and explaining a cautious conclusion. I also became better at reading computer-generated results critically rather than accepting the first output. Before signing the final log, I will identify the examples that I personally completed and can explain.</w:t>
       </w:r>
       <w:r>
         <w:rPr>
@@ -13870,7 +13844,7 @@
           <w:spacing w:val="0"/>
           <w:color w:val="0E121D"/>
         </w:rPr>
-        <w:t xml:space="preserve">If I repeated the project, I would write the evaluation protocol before fitting models, keep a contemporaneous activity log from the first day, preserve an untouched future test period, use higher-frequency data to estimate realised variance, and specify model-tuning limits in advance. I would also agree an AI-use record with the supervisor at the start and record which outputs I personally checked. Only after the core BTC workflow was stable would I add another exchange, asset or richer information such as sentiment.</w:t>
+        <w:t xml:space="preserve">If I repeated the project, I would write down the comparison rules before producing results, keep a short activity note after every work session and reserve a final set of data that remained untouched until the end. I would also agree how AI use should be recorded from the start and note exactly which results I checked myself. Only after the main Bitcoin comparison was stable would I consider adding another market or another type of information.</w:t>
       </w:r>
       <w:r>
         <w:rPr>
@@ -13926,7 +13900,7 @@
           <w:spacing w:val="0"/>
           <w:color w:val="0E121D"/>
         </w:rPr>
-        <w:t xml:space="preserve">Start with a strong baseline, define the target before choosing an advanced model, keep raw evidence, separate forecast-origin and target dates, and let the result contradict the original expectation. Record changes when they happen rather than reconstructing them later. Treat an AI-generated or software-generated output as something to verify and explain, not as evidence of understanding by itself.</w:t>
+        <w:t xml:space="preserve">Begin with a clear question and a simple comparison. Define what you are measuring before choosing a more advanced method, keep the original evidence and record changes when they happen. If a computer or AI produces an answer, check that you understand the data, dates and meaning of the result before using it in the report.</w:t>
       </w:r>
       <w:r>
         <w:rPr>
@@ -14373,72 +14347,20 @@
           <w:spacing w:val="0"/>
           <w:color w:val="0E121D"/>
         </w:rPr>
-        <w:t xml:space="preserve">Git-verified</w:t>
-      </w:r>
-    </w:p>
-    <w:p>
-      <w:pPr/>
-      <w:r>
-        <w:rPr>
-          <w:rFonts w:ascii="Arial" w:hAnsi="Arial" w:cs="Arial"/>
-          <w:sz w:val="23"/>
-          <w:sz-cs w:val="23"/>
-          <w:spacing w:val="0"/>
-          <w:color w:val="0E121D"/>
-        </w:rPr>
-        <w:t xml:space="preserve">Project structure and initial folders were created in commit 8aee51f.</w:t>
-      </w:r>
-    </w:p>
-    <w:p>
-      <w:pPr/>
-      <w:r>
-        <w:rPr>
-          <w:rFonts w:ascii="Arial" w:hAnsi="Arial" w:cs="Arial"/>
-          <w:sz w:val="23"/>
-          <w:sz-cs w:val="23"/>
-          <w:spacing w:val="0"/>
-          <w:color w:val="0E121D"/>
-        </w:rPr>
-        <w:t xml:space="preserve">PL-15.01-B</w:t>
-      </w:r>
-    </w:p>
-    <w:p>
-      <w:pPr/>
-      <w:r>
-        <w:rPr>
-          <w:rFonts w:ascii="Arial" w:hAnsi="Arial" w:cs="Arial"/>
-          <w:sz w:val="23"/>
-          <w:sz-cs w:val="23"/>
-          <w:spacing w:val="0"/>
-          <w:color w:val="0E121D"/>
-        </w:rPr>
-        <w:t xml:space="preserve">2026-06-14 to 2026-06-16</w:t>
-      </w:r>
-    </w:p>
-    <w:p>
-      <w:pPr/>
-      <w:r>
-        <w:rPr>
-          <w:rFonts w:ascii="Arial" w:hAnsi="Arial" w:cs="Arial"/>
-          <w:sz w:val="23"/>
-          <w:sz-cs w:val="23"/>
-          <w:spacing w:val="0"/>
-          <w:color w:val="0E121D"/>
-        </w:rPr>
-        <w:t xml:space="preserve">No direct repository evidence</w:t>
-      </w:r>
-    </w:p>
-    <w:p>
-      <w:pPr/>
-      <w:r>
-        <w:rPr>
-          <w:rFonts w:ascii="Arial" w:hAnsi="Arial" w:cs="Arial"/>
-          <w:sz w:val="23"/>
-          <w:sz-cs w:val="23"/>
-          <w:spacing w:val="0"/>
-          <w:color w:val="0E121D"/>
-        </w:rPr>
-        <w:t xml:space="preserve">No separate dated activity is claimed for this interval.</w:t>
+        <w:t xml:space="preserve">Confirmed by Git</w:t>
+      </w:r>
+    </w:p>
+    <w:p>
+      <w:pPr/>
+      <w:r>
+        <w:rPr>
+          <w:rFonts w:ascii="Arial" w:hAnsi="Arial" w:cs="Arial"/>
+          <w:sz w:val="23"/>
+          <w:sz-cs w:val="23"/>
+          <w:spacing w:val="0"/>
+          <w:color w:val="0E121D"/>
+        </w:rPr>
+        <w:t xml:space="preserve">Project folders and the first planning structure were created in commit 8aee51f.</w:t>
       </w:r>
     </w:p>
     <w:p>
@@ -14477,72 +14399,20 @@
           <w:spacing w:val="0"/>
           <w:color w:val="0E121D"/>
         </w:rPr>
-        <w:t xml:space="preserve">Git-verified</w:t>
-      </w:r>
-    </w:p>
-    <w:p>
-      <w:pPr/>
-      <w:r>
-        <w:rPr>
-          <w:rFonts w:ascii="Arial" w:hAnsi="Arial" w:cs="Arial"/>
-          <w:sz w:val="23"/>
-          <w:sz-cs w:val="23"/>
-          <w:spacing w:val="0"/>
-          <w:color w:val="0E121D"/>
-        </w:rPr>
-        <w:t xml:space="preserve">The question and production-log drafts were developed, sources were recorded, the planned data source changed to Hyperliquid, and first model outputs were added in commits 155ce90, 595d119 and b4a3cf6.</w:t>
-      </w:r>
-    </w:p>
-    <w:p>
-      <w:pPr/>
-      <w:r>
-        <w:rPr>
-          <w:rFonts w:ascii="Arial" w:hAnsi="Arial" w:cs="Arial"/>
-          <w:sz w:val="23"/>
-          <w:sz-cs w:val="23"/>
-          <w:spacing w:val="0"/>
-          <w:color w:val="0E121D"/>
-        </w:rPr>
-        <w:t xml:space="preserve">PL-15.01-D</w:t>
-      </w:r>
-    </w:p>
-    <w:p>
-      <w:pPr/>
-      <w:r>
-        <w:rPr>
-          <w:rFonts w:ascii="Arial" w:hAnsi="Arial" w:cs="Arial"/>
-          <w:sz w:val="23"/>
-          <w:sz-cs w:val="23"/>
-          <w:spacing w:val="0"/>
-          <w:color w:val="0E121D"/>
-        </w:rPr>
-        <w:t xml:space="preserve">2026-06-18 to 2026-07-08</w:t>
-      </w:r>
-    </w:p>
-    <w:p>
-      <w:pPr/>
-      <w:r>
-        <w:rPr>
-          <w:rFonts w:ascii="Arial" w:hAnsi="Arial" w:cs="Arial"/>
-          <w:sz w:val="23"/>
-          <w:sz-cs w:val="23"/>
-          <w:spacing w:val="0"/>
-          <w:color w:val="0E121D"/>
-        </w:rPr>
-        <w:t xml:space="preserve">Sparse evidence</w:t>
-      </w:r>
-    </w:p>
-    <w:p>
-      <w:pPr/>
-      <w:r>
-        <w:rPr>
-          <w:rFonts w:ascii="Arial" w:hAnsi="Arial" w:cs="Arial"/>
-          <w:sz w:val="23"/>
-          <w:sz-cs w:val="23"/>
-          <w:spacing w:val="0"/>
-          <w:color w:val="0E121D"/>
-        </w:rPr>
-        <w:t xml:space="preserve">The timetable contains targets, but it does not prove completion on those dates. No detailed daily activity is reconstructed.</w:t>
+        <w:t xml:space="preserve">Confirmed by Git</w:t>
+      </w:r>
+    </w:p>
+    <w:p>
+      <w:pPr/>
+      <w:r>
+        <w:rPr>
+          <w:rFonts w:ascii="Arial" w:hAnsi="Arial" w:cs="Arial"/>
+          <w:sz w:val="23"/>
+          <w:sz-cs w:val="23"/>
+          <w:spacing w:val="0"/>
+          <w:color w:val="0E121D"/>
+        </w:rPr>
+        <w:t xml:space="preserve">The question and planning drafts were developed, sources were recorded, the data source changed and the first results were added.</w:t>
       </w:r>
     </w:p>
     <w:p>
@@ -14581,20 +14451,20 @@
           <w:spacing w:val="0"/>
           <w:color w:val="0E121D"/>
         </w:rPr>
-        <w:t xml:space="preserve">Generated metadata and workspace evidence</w:t>
-      </w:r>
-    </w:p>
-    <w:p>
-      <w:pPr/>
-      <w:r>
-        <w:rPr>
-          <w:rFonts w:ascii="Arial" w:hAnsi="Arial" w:cs="Arial"/>
-          <w:sz w:val="23"/>
-          <w:sz-cs w:val="23"/>
-          <w:spacing w:val="0"/>
-          <w:color w:val="0E121D"/>
-        </w:rPr>
-        <w:t xml:space="preserve">Data and outputs were refreshed and report/status materials were expanded. These entries are supported by saved files rather than a dedicated Git commit.</w:t>
+        <w:t xml:space="preserve">Saved files and workspace evidence</w:t>
+      </w:r>
+    </w:p>
+    <w:p>
+      <w:pPr/>
+      <w:r>
+        <w:rPr>
+          <w:rFonts w:ascii="Arial" w:hAnsi="Arial" w:cs="Arial"/>
+          <w:sz w:val="23"/>
+          <w:sz-cs w:val="23"/>
+          <w:spacing w:val="0"/>
+          <w:color w:val="0E121D"/>
+        </w:rPr>
+        <w:t xml:space="preserve">Data and results were refreshed and the report and status material were expanded.</w:t>
       </w:r>
     </w:p>
     <w:p>
@@ -14633,20 +14503,20 @@
           <w:spacing w:val="0"/>
           <w:color w:val="0E121D"/>
         </w:rPr>
-        <w:t xml:space="preserve">Superseded generated output</w:t>
-      </w:r>
-    </w:p>
-    <w:p>
-      <w:pPr/>
-      <w:r>
-        <w:rPr>
-          <w:rFonts w:ascii="Arial" w:hAnsi="Arial" w:cs="Arial"/>
-          <w:sz w:val="23"/>
-          <w:sz-cs w:val="23"/>
-          <w:spacing w:val="0"/>
-          <w:color w:val="0E121D"/>
-        </w:rPr>
-        <w:t xml:space="preserve">A refresh included a daily candle that a later audit identified as still open at fetch time; the completion-aware fetch replaced it.</w:t>
+        <w:t xml:space="preserve">Earlier saved result</w:t>
+      </w:r>
+    </w:p>
+    <w:p>
+      <w:pPr/>
+      <w:r>
+        <w:rPr>
+          <w:rFonts w:ascii="Arial" w:hAnsi="Arial" w:cs="Arial"/>
+          <w:sz w:val="23"/>
+          <w:sz-cs w:val="23"/>
+          <w:spacing w:val="0"/>
+          <w:color w:val="0E121D"/>
+        </w:rPr>
+        <w:t xml:space="preserve">A later check found that the newest daily record had not yet finished and replaced it with a completion-aware refresh.</w:t>
       </w:r>
     </w:p>
     <w:p>
@@ -14685,20 +14555,20 @@
           <w:spacing w:val="0"/>
           <w:color w:val="0E121D"/>
         </w:rPr>
-        <w:t xml:space="preserve">Git-verified</w:t>
-      </w:r>
-    </w:p>
-    <w:p>
-      <w:pPr/>
-      <w:r>
-        <w:rPr>
-          <w:rFonts w:ascii="Arial" w:hAnsi="Arial" w:cs="Arial"/>
-          <w:sz w:val="23"/>
-          <w:sz-cs w:val="23"/>
-          <w:spacing w:val="0"/>
-          <w:color w:val="0E121D"/>
-        </w:rPr>
-        <w:t xml:space="preserve">LSTM implementation, package refactoring, date-alignment correction and expanded evaluation were recorded in commits f7d20bf, f0ab18a, af458e7 and 8c98f36.</w:t>
+        <w:t xml:space="preserve">Confirmed by Git</w:t>
+      </w:r>
+    </w:p>
+    <w:p>
+      <w:pPr/>
+      <w:r>
+        <w:rPr>
+          <w:rFonts w:ascii="Arial" w:hAnsi="Arial" w:cs="Arial"/>
+          <w:sz w:val="23"/>
+          <w:sz-cs w:val="23"/>
+          <w:spacing w:val="0"/>
+          <w:color w:val="0E121D"/>
+        </w:rPr>
+        <w:t xml:space="preserve">The planned methods were completed, files were reorganised, date matching was corrected and the comparison was expanded.</w:t>
       </w:r>
     </w:p>
     <w:p>
@@ -14737,72 +14607,20 @@
           <w:spacing w:val="0"/>
           <w:color w:val="0E121D"/>
         </w:rPr>
-        <w:t xml:space="preserve">Generated outputs and workspace evidence</w:t>
-      </w:r>
-    </w:p>
-    <w:p>
-      <w:pPr/>
-      <w:r>
-        <w:rPr>
-          <w:rFonts w:ascii="Arial" w:hAnsi="Arial" w:cs="Arial"/>
-          <w:sz w:val="23"/>
-          <w:sz-cs w:val="23"/>
-          <w:spacing w:val="0"/>
-          <w:color w:val="0E121D"/>
-        </w:rPr>
-        <w:t xml:space="preserve">Likelihood order, rolling-target conversion, scaler scope and completed-candle handling were audited; data-quality, expanding-window, regime, bootstrap, OOB, permutation and multi-seed evidence was generated.</w:t>
-      </w:r>
-    </w:p>
-    <w:p>
-      <w:pPr/>
-      <w:r>
-        <w:rPr>
-          <w:rFonts w:ascii="Arial" w:hAnsi="Arial" w:cs="Arial"/>
-          <w:sz w:val="23"/>
-          <w:sz-cs w:val="23"/>
-          <w:spacing w:val="0"/>
-          <w:color w:val="0E121D"/>
-        </w:rPr>
-        <w:t xml:space="preserve">PL-15.01-I</w:t>
-      </w:r>
-    </w:p>
-    <w:p>
-      <w:pPr/>
-      <w:r>
-        <w:rPr>
-          <w:rFonts w:ascii="Arial" w:hAnsi="Arial" w:cs="Arial"/>
-          <w:sz w:val="23"/>
-          <w:sz-cs w:val="23"/>
-          <w:spacing w:val="0"/>
-          <w:color w:val="0E121D"/>
-        </w:rPr>
-        <w:t xml:space="preserve">2026-07-15 to 2026-07-19</w:t>
-      </w:r>
-    </w:p>
-    <w:p>
-      <w:pPr/>
-      <w:r>
-        <w:rPr>
-          <w:rFonts w:ascii="Arial" w:hAnsi="Arial" w:cs="Arial"/>
-          <w:sz w:val="23"/>
-          <w:sz-cs w:val="23"/>
-          <w:spacing w:val="0"/>
-          <w:color w:val="0E121D"/>
-        </w:rPr>
-        <w:t xml:space="preserve">No separate direct evidence preserved</w:t>
-      </w:r>
-    </w:p>
-    <w:p>
-      <w:pPr/>
-      <w:r>
-        <w:rPr>
-          <w:rFonts w:ascii="Arial" w:hAnsi="Arial" w:cs="Arial"/>
-          <w:sz w:val="23"/>
-          <w:sz-cs w:val="23"/>
-          <w:spacing w:val="0"/>
-          <w:color w:val="0E121D"/>
-        </w:rPr>
-        <w:t xml:space="preserve">No specific activity is asserted for this interval.</w:t>
+        <w:t xml:space="preserve">Saved results and workspace evidence</w:t>
+      </w:r>
+    </w:p>
+    <w:p>
+      <w:pPr/>
+      <w:r>
+        <w:rPr>
+          <w:rFonts w:ascii="Arial" w:hAnsi="Arial" w:cs="Arial"/>
+          <w:sz w:val="23"/>
+          <w:sz-cs w:val="23"/>
+          <w:spacing w:val="0"/>
+          <w:color w:val="0E121D"/>
+        </w:rPr>
+        <w:t xml:space="preserve">Important calculation and data checks were completed, followed by several repeated comparisons.</w:t>
       </w:r>
     </w:p>
     <w:p>
@@ -14841,20 +14659,20 @@
           <w:spacing w:val="0"/>
           <w:color w:val="0E121D"/>
         </w:rPr>
-        <w:t xml:space="preserve">Final generated metadata and test run</w:t>
-      </w:r>
-    </w:p>
-    <w:p>
-      <w:pPr/>
-      <w:r>
-        <w:rPr>
-          <w:rFonts w:ascii="Arial" w:hAnsi="Arial" w:cs="Arial"/>
-          <w:sz w:val="23"/>
-          <w:sz-cs w:val="23"/>
-          <w:spacing w:val="0"/>
-          <w:color w:val="0E121D"/>
-        </w:rPr>
-        <w:t xml:space="preserve">The data and complete pipeline were refreshed again. The API returned 1,241 rows; one incomplete row was excluded; 1,240 completed candles were retained through 2026-07-19; 39 tests passed.</w:t>
+        <w:t xml:space="preserve">Final saved data and checking run</w:t>
+      </w:r>
+    </w:p>
+    <w:p>
+      <w:pPr/>
+      <w:r>
+        <w:rPr>
+          <w:rFonts w:ascii="Arial" w:hAnsi="Arial" w:cs="Arial"/>
+          <w:sz w:val="23"/>
+          <w:sz-cs w:val="23"/>
+          <w:spacing w:val="0"/>
+          <w:color w:val="0E121D"/>
+        </w:rPr>
+        <w:t xml:space="preserve">The project was refreshed again; one unfinished day was removed, 1,240 complete days were kept and 39 checks passed.</w:t>
       </w:r>
     </w:p>
     <w:p>
@@ -15643,7 +15461,7 @@
           <w:spacing w:val="0"/>
           <w:color w:val="1B3C5D"/>
         </w:rPr>
-        <w:t xml:space="preserve">PL-16.02 Research, technical and product evidence</w:t>
+        <w:t xml:space="preserve">PL-16.02 Research, project and product evidence</w:t>
       </w:r>
     </w:p>
     <w:p>
@@ -15746,7 +15564,7 @@
           <w:spacing w:val="0"/>
           <w:color w:val="0E121D"/>
         </w:rPr>
-        <w:t xml:space="preserve">Academic evidence and critical notes</w:t>
+        <w:t xml:space="preserve">Reading and critical notes</w:t>
       </w:r>
     </w:p>
     <w:p>
@@ -15863,7 +15681,7 @@
           <w:spacing w:val="0"/>
           <w:color w:val="0E121D"/>
         </w:rPr>
-        <w:t xml:space="preserve">Candidate should verify identity, content and submission relevance</w:t>
+        <w:t xml:space="preserve">Candidate should verify identity, content and relevance</w:t>
       </w:r>
     </w:p>
     <w:p>
@@ -15902,20 +15720,20 @@
           <w:spacing w:val="0"/>
           <w:color w:val="0E121D"/>
         </w:rPr>
-        <w:t xml:space="preserve">Archived data and target construction</w:t>
-      </w:r>
-    </w:p>
-    <w:p>
-      <w:pPr/>
-      <w:r>
-        <w:rPr>
-          <w:rFonts w:ascii="Arial" w:hAnsi="Arial" w:cs="Arial"/>
-          <w:sz w:val="23"/>
-          <w:sz-cs w:val="23"/>
-          <w:spacing w:val="0"/>
-          <w:color w:val="0E121D"/>
-        </w:rPr>
-        <w:t xml:space="preserve">Generated evidence</w:t>
+        <w:t xml:space="preserve">Original and prepared data</w:t>
+      </w:r>
+    </w:p>
+    <w:p>
+      <w:pPr/>
+      <w:r>
+        <w:rPr>
+          <w:rFonts w:ascii="Arial" w:hAnsi="Arial" w:cs="Arial"/>
+          <w:sz w:val="23"/>
+          <w:sz-cs w:val="23"/>
+          <w:spacing w:val="0"/>
+          <w:color w:val="0E121D"/>
+        </w:rPr>
+        <w:t xml:space="preserve">Saved project evidence</w:t>
       </w:r>
     </w:p>
     <w:p>
@@ -15941,20 +15759,20 @@
           <w:spacing w:val="0"/>
           <w:color w:val="0E121D"/>
         </w:rPr>
-        <w:t xml:space="preserve">code/epq_pipeline and code/tests</w:t>
-      </w:r>
-    </w:p>
-    <w:p>
-      <w:pPr/>
-      <w:r>
-        <w:rPr>
-          <w:rFonts w:ascii="Arial" w:hAnsi="Arial" w:cs="Arial"/>
-          <w:sz w:val="23"/>
-          <w:sz-cs w:val="23"/>
-          <w:spacing w:val="0"/>
-          <w:color w:val="0E121D"/>
-        </w:rPr>
-        <w:t xml:space="preserve">Reproducible implementation and tests</w:t>
+        <w:t xml:space="preserve">code folder and test folder</w:t>
+      </w:r>
+    </w:p>
+    <w:p>
+      <w:pPr/>
+      <w:r>
+        <w:rPr>
+          <w:rFonts w:ascii="Arial" w:hAnsi="Arial" w:cs="Arial"/>
+          <w:sz w:val="23"/>
+          <w:sz-cs w:val="23"/>
+          <w:spacing w:val="0"/>
+          <w:color w:val="0E121D"/>
+        </w:rPr>
+        <w:t xml:space="preserve">Repeatable comparison work and checks</w:t>
       </w:r>
     </w:p>
     <w:p>
@@ -16006,20 +15824,20 @@
           <w:spacing w:val="0"/>
           <w:color w:val="0E121D"/>
         </w:rPr>
-        <w:t xml:space="preserve">Run design, sample and timestamps</w:t>
-      </w:r>
-    </w:p>
-    <w:p>
-      <w:pPr/>
-      <w:r>
-        <w:rPr>
-          <w:rFonts w:ascii="Arial" w:hAnsi="Arial" w:cs="Arial"/>
-          <w:sz w:val="23"/>
-          <w:sz-cs w:val="23"/>
-          <w:spacing w:val="0"/>
-          <w:color w:val="0E121D"/>
-        </w:rPr>
-        <w:t xml:space="preserve">Canonical generated run metadata</w:t>
+        <w:t xml:space="preserve">Dates and overall run record</w:t>
+      </w:r>
+    </w:p>
+    <w:p>
+      <w:pPr/>
+      <w:r>
+        <w:rPr>
+          <w:rFonts w:ascii="Arial" w:hAnsi="Arial" w:cs="Arial"/>
+          <w:sz w:val="23"/>
+          <w:sz-cs w:val="23"/>
+          <w:spacing w:val="0"/>
+          <w:color w:val="0E121D"/>
+        </w:rPr>
+        <w:t xml:space="preserve">Main saved run information</w:t>
       </w:r>
     </w:p>
     <w:p>
@@ -16058,20 +15876,20 @@
           <w:spacing w:val="0"/>
           <w:color w:val="0E121D"/>
         </w:rPr>
-        <w:t xml:space="preserve">Primary numerical result</w:t>
-      </w:r>
-    </w:p>
-    <w:p>
-      <w:pPr/>
-      <w:r>
-        <w:rPr>
-          <w:rFonts w:ascii="Arial" w:hAnsi="Arial" w:cs="Arial"/>
-          <w:sz w:val="23"/>
-          <w:sz-cs w:val="23"/>
-          <w:spacing w:val="0"/>
-          <w:color w:val="0E121D"/>
-        </w:rPr>
-        <w:t xml:space="preserve">Canonical generated output after final run</w:t>
+        <w:t xml:space="preserve">Main numerical result</w:t>
+      </w:r>
+    </w:p>
+    <w:p>
+      <w:pPr/>
+      <w:r>
+        <w:rPr>
+          <w:rFonts w:ascii="Arial" w:hAnsi="Arial" w:cs="Arial"/>
+          <w:sz w:val="23"/>
+          <w:sz-cs w:val="23"/>
+          <w:spacing w:val="0"/>
+          <w:color w:val="0E121D"/>
+        </w:rPr>
+        <w:t xml:space="preserve">Saved result after the final run</w:t>
       </w:r>
     </w:p>
     <w:p>
@@ -16097,33 +15915,33 @@
           <w:spacing w:val="0"/>
           <w:color w:val="0E121D"/>
         </w:rPr>
-        <w:t xml:space="preserve">code/outputs robustness and diagnostic files</w:t>
-      </w:r>
-    </w:p>
-    <w:p>
-      <w:pPr/>
-      <w:r>
-        <w:rPr>
-          <w:rFonts w:ascii="Arial" w:hAnsi="Arial" w:cs="Arial"/>
-          <w:sz w:val="23"/>
-          <w:sz-cs w:val="23"/>
-          <w:spacing w:val="0"/>
-          <w:color w:val="0E121D"/>
-        </w:rPr>
-        <w:t xml:space="preserve">Robustness, uncertainty and model diagnostics</w:t>
-      </w:r>
-    </w:p>
-    <w:p>
-      <w:pPr/>
-      <w:r>
-        <w:rPr>
-          <w:rFonts w:ascii="Arial" w:hAnsi="Arial" w:cs="Arial"/>
-          <w:sz w:val="23"/>
-          <w:sz-cs w:val="23"/>
-          <w:spacing w:val="0"/>
-          <w:color w:val="0E121D"/>
-        </w:rPr>
-        <w:t xml:space="preserve">Supporting generated outputs</w:t>
+        <w:t xml:space="preserve">Other files in code/outputs</w:t>
+      </w:r>
+    </w:p>
+    <w:p>
+      <w:pPr/>
+      <w:r>
+        <w:rPr>
+          <w:rFonts w:ascii="Arial" w:hAnsi="Arial" w:cs="Arial"/>
+          <w:sz w:val="23"/>
+          <w:sz-cs w:val="23"/>
+          <w:spacing w:val="0"/>
+          <w:color w:val="0E121D"/>
+        </w:rPr>
+        <w:t xml:space="preserve">Extra comparison and checking evidence</w:t>
+      </w:r>
+    </w:p>
+    <w:p>
+      <w:pPr/>
+      <w:r>
+        <w:rPr>
+          <w:rFonts w:ascii="Arial" w:hAnsi="Arial" w:cs="Arial"/>
+          <w:sz w:val="23"/>
+          <w:sz-cs w:val="23"/>
+          <w:spacing w:val="0"/>
+          <w:color w:val="0E121D"/>
+        </w:rPr>
+        <w:t xml:space="preserve">Supporting saved results</w:t>
       </w:r>
     </w:p>
     <w:p>
@@ -16175,7 +15993,7 @@
           <w:spacing w:val="0"/>
           <w:color w:val="0E121D"/>
         </w:rPr>
-        <w:t xml:space="preserve">Final count and wording to be synchronised</w:t>
+        <w:t xml:space="preserve">Final count and wording to be checked</w:t>
       </w:r>
     </w:p>
     <w:p>
@@ -16228,19 +16046,6 @@
           <w:color w:val="0E121D"/>
         </w:rPr>
         <w:t xml:space="preserve">Delivery evidence still required</w:t>
-      </w:r>
-    </w:p>
-    <w:p>
-      <w:pPr/>
-      <w:r>
-        <w:rPr>
-          <w:rFonts w:ascii="Arial" w:hAnsi="Arial" w:cs="Arial"/>
-          <w:sz w:val="28"/>
-          <w:sz-cs w:val="28"/>
-          <w:spacing w:val="0"/>
-          <w:color w:val="6D6D6D"/>
-        </w:rPr>
-        <w:t xml:space="preserve"/>
       </w:r>
     </w:p>
     <w:p>

</xml_diff>

<commit_message>
chore: sync local project state after migration cleanup
</commit_message>
<xml_diff>
--- a/production-log/complete-production-log-en.docx
+++ b/production-log/complete-production-log-en.docx
@@ -3470,7 +3470,7 @@
           <w:spacing w:val="0"/>
           <w:color w:val="0E121D"/>
         </w:rPr>
-        <w:t xml:space="preserve">I selected Bitcoin volatility forecasting because it allowed me to combine mathematics, statistics, computing and an applied financial problem. Volatility is relevant to risk, the result can be evaluated quantitatively, and historical market data can support a reproducible product. The project was also suitable for critical evaluation because a more complex forecasting model would not necessarily be more accurate, interpretable or practical. Before this wording is used, I will confirm that it reflects my actual initial reasoning rather than only the later direction of the repository.</w:t>
+        <w:t xml:space="preserve">I selected Bitcoin volatility forecasting because it connects my interests in mathematics, computing and finance and gives me a question that can be tested with real data. It also lets me compare whether a more complicated method actually gives a useful improvement. Before using this wording, I will confirm that it matches my own reasons at the start of the project.</w:t>
       </w:r>
       <w:r>
         <w:rPr>
@@ -3632,7 +3632,7 @@
           <w:spacing w:val="0"/>
           <w:color w:val="0E121D"/>
         </w:rPr>
-        <w:t xml:space="preserve">Modifications made after the initial meeting</w:t>
+        <w:t xml:space="preserve">Changes made after the initial meeting</w:t>
       </w:r>
     </w:p>
     <w:p>
@@ -3752,7 +3752,7 @@
           <w:spacing w:val="0"/>
           <w:color w:val="0E121D"/>
         </w:rPr>
-        <w:t xml:space="preserve"> To critically evaluate the predictive power, interpretability, computational practicality and practical limitations of machine-learning approaches compared with traditional statistical approaches in Bitcoin volatility forecasting.</w:t>
+        <w:t xml:space="preserve"> To compare several ways of forecasting Bitcoin volatility and decide whether the more complicated machine-learning methods give enough extra benefit to justify their use.</w:t>
       </w:r>
     </w:p>
     <w:p>
@@ -3806,7 +3806,7 @@
           <w:spacing w:val="0"/>
           <w:color w:val="0E121D"/>
         </w:rPr>
-        <w:t xml:space="preserve">Research logarithmic returns, realised volatility and GARCH-type models.</w:t>
+        <w:t xml:space="preserve">Read about Bitcoin returns, volatility and the selected forecasting methods.</w:t>
       </w:r>
     </w:p>
     <w:p>
@@ -3834,7 +3834,7 @@
           <w:spacing w:val="0"/>
           <w:color w:val="0E121D"/>
         </w:rPr>
-        <w:t xml:space="preserve">Collect daily Bitcoin price data and construct a realised-volatility target.</w:t>
+        <w:t xml:space="preserve">Collect and prepare a consistent set of daily Bitcoin data.</w:t>
       </w:r>
     </w:p>
     <w:p>
@@ -3862,7 +3862,7 @@
           <w:spacing w:val="0"/>
           <w:color w:val="0E121D"/>
         </w:rPr>
-        <w:t xml:space="preserve">Implement rolling historical volatility and GARCH(1,1) as statistical benchmarks.</w:t>
+        <w:t xml:space="preserve">Build two clear statistical comparison methods.</w:t>
       </w:r>
     </w:p>
     <w:p>
@@ -3890,7 +3890,7 @@
           <w:spacing w:val="0"/>
           <w:color w:val="0E121D"/>
         </w:rPr>
-        <w:t xml:space="preserve">Implement Random Forest and, if feasible, an LSTM.</w:t>
+        <w:t xml:space="preserve">Build Random Forest and, if manageable, an LSTM for comparison.</w:t>
       </w:r>
     </w:p>
     <w:p>
@@ -3918,7 +3918,7 @@
           <w:spacing w:val="0"/>
           <w:color w:val="0E121D"/>
         </w:rPr>
-        <w:t xml:space="preserve">compare forecasts using MAE, MSE and RMSE.</w:t>
+        <w:t xml:space="preserve">Test every method on the same time-ordered data and compare the errors.</w:t>
       </w:r>
     </w:p>
     <w:p>
@@ -3946,7 +3946,7 @@
           <w:spacing w:val="0"/>
           <w:color w:val="0E121D"/>
         </w:rPr>
-        <w:t xml:space="preserve">Decide whether any accuracy improvement is meaningful after interpretability, computational complexity and project scale are considered.</w:t>
+        <w:t xml:space="preserve">Consider accuracy together with ease of explanation, time required and important limitations.</w:t>
       </w:r>
     </w:p>
     <w:p>
@@ -4073,19 +4073,6 @@
           <w:color w:val="0E121D"/>
         </w:rPr>
         <w:t xml:space="preserve">{{INITIAL_PROPOSAL_DATE}}</w:t>
-      </w:r>
-    </w:p>
-    <w:p>
-      <w:pPr/>
-      <w:r>
-        <w:rPr>
-          <w:rFonts w:ascii="Arial" w:hAnsi="Arial" w:cs="Arial"/>
-          <w:sz w:val="28"/>
-          <w:sz-cs w:val="28"/>
-          <w:spacing w:val="0"/>
-          <w:color w:val="6D6D6D"/>
-        </w:rPr>
-        <w:t xml:space="preserve"/>
       </w:r>
     </w:p>
     <w:p>
@@ -4169,7 +4156,7 @@
           <w:spacing w:val="0"/>
           <w:color w:val="0E121D"/>
         </w:rPr>
-        <w:t xml:space="preserve"> How do Random Forest and Long Short-Term Memory networks compare with rolling historical volatility and GARCH(1,1) when forecasting Bitcoin volatility, in terms of accuracy, interpretability, computational practicality and robustness?</w:t>
+        <w:t xml:space="preserve"> When the same Bitcoin data and testing period are used, do Random Forest and LSTM give a useful improvement over two clearer statistical approaches, and are they still practical and understandable enough for this project?</w:t>
       </w:r>
     </w:p>
     <w:p>
@@ -4215,7 +4202,7 @@
           <w:spacing w:val="0"/>
           <w:color w:val="0E121D"/>
         </w:rPr>
-        <w:t xml:space="preserve">At the proposal stage I planned to use daily BTC price data, Python for data processing and modelling, academic literature on volatility forecasting and machine learning, a source-evaluation workbook, saved code and outputs, and a chronological evaluation design. The first tracked proposal named Yahoo Finance; the project changed to Hyperliquid exchange-level BTC perpetual-futures candles later in the documented process. I will keep that change visible rather than rewriting the original proposal as though Hyperliquid had always been selected.</w:t>
+        <w:t xml:space="preserve">At the proposal stage, I planned to use daily Bitcoin data, academic and educational reading about forecasting, Python to organise the data and run the comparisons, a source-evaluation workbook, saved results and a time-ordered test. The first plan named Yahoo Finance, but the documented project later changed to Hyperliquid. I will keep this change visible instead of rewriting the starting plan.</w:t>
       </w:r>
       <w:r>
         <w:rPr>
@@ -4312,7 +4299,7 @@
           <w:spacing w:val="0"/>
           <w:color w:val="0E121D"/>
         </w:rPr>
-        <w:t xml:space="preserve">Daily BTC data; the first tracked plan named Yahoo Finance</w:t>
+        <w:t xml:space="preserve">Daily Bitcoin data; the first tracked plan named Yahoo Finance</w:t>
       </w:r>
     </w:p>
     <w:p>
@@ -4338,20 +4325,20 @@
           <w:spacing w:val="0"/>
           <w:color w:val="0E121D"/>
         </w:rPr>
-        <w:t xml:space="preserve">Statistical theory</w:t>
-      </w:r>
-    </w:p>
-    <w:p>
-      <w:pPr/>
-      <w:r>
-        <w:rPr>
-          <w:rFonts w:ascii="Arial" w:hAnsi="Arial" w:cs="Arial"/>
-          <w:sz w:val="23"/>
-          <w:sz-cs w:val="23"/>
-          <w:spacing w:val="0"/>
-          <w:color w:val="0E121D"/>
-        </w:rPr>
-        <w:t xml:space="preserve">Log returns, realised volatility and GARCH literature</w:t>
+        <w:t xml:space="preserve">Background reading</w:t>
+      </w:r>
+    </w:p>
+    <w:p>
+      <w:pPr/>
+      <w:r>
+        <w:rPr>
+          <w:rFonts w:ascii="Arial" w:hAnsi="Arial" w:cs="Arial"/>
+          <w:sz w:val="23"/>
+          <w:sz-cs w:val="23"/>
+          <w:spacing w:val="0"/>
+          <w:color w:val="0E121D"/>
+        </w:rPr>
+        <w:t xml:space="preserve">Sources explaining returns, volatility and established forecasting methods</w:t>
       </w:r>
     </w:p>
     <w:p>
@@ -4377,20 +4364,20 @@
           <w:spacing w:val="0"/>
           <w:color w:val="0E121D"/>
         </w:rPr>
-        <w:t xml:space="preserve">Machine learning</w:t>
-      </w:r>
-    </w:p>
-    <w:p>
-      <w:pPr/>
-      <w:r>
-        <w:rPr>
-          <w:rFonts w:ascii="Arial" w:hAnsi="Arial" w:cs="Arial"/>
-          <w:sz w:val="23"/>
-          <w:sz-cs w:val="23"/>
-          <w:spacing w:val="0"/>
-          <w:color w:val="0E121D"/>
-        </w:rPr>
-        <w:t xml:space="preserve">Random Forest and LSTM literature</w:t>
+        <w:t xml:space="preserve">Comparison reading</w:t>
+      </w:r>
+    </w:p>
+    <w:p>
+      <w:pPr/>
+      <w:r>
+        <w:rPr>
+          <w:rFonts w:ascii="Arial" w:hAnsi="Arial" w:cs="Arial"/>
+          <w:sz w:val="23"/>
+          <w:sz-cs w:val="23"/>
+          <w:spacing w:val="0"/>
+          <w:color w:val="0E121D"/>
+        </w:rPr>
+        <w:t xml:space="preserve">Sources explaining the selected machine-learning methods</w:t>
       </w:r>
     </w:p>
     <w:p>
@@ -4429,7 +4416,7 @@
           <w:spacing w:val="0"/>
           <w:color w:val="0E121D"/>
         </w:rPr>
-        <w:t xml:space="preserve">MAE, MSE, RMSE and chronological train/test separation</w:t>
+        <w:t xml:space="preserve">Common error measures and a test that keeps the original time order</w:t>
       </w:r>
     </w:p>
     <w:p>
@@ -4468,7 +4455,7 @@
           <w:spacing w:val="0"/>
           <w:color w:val="0E121D"/>
         </w:rPr>
-        <w:t xml:space="preserve">Python or notebook environment, source-evaluation workbook, scripts, output tables and charts</w:t>
+        <w:t xml:space="preserve">Python, the source-evaluation workbook, saved tables and charts</w:t>
       </w:r>
     </w:p>
     <w:p>
@@ -4848,7 +4835,7 @@
           <w:spacing w:val="0"/>
           <w:color w:val="0E121D"/>
         </w:rPr>
-        <w:t xml:space="preserve"> To critically evaluate whether the additional complexity of machine-learning approaches is justified when compared with transparent statistical approaches to Bitcoin volatility forecasting.</w:t>
+        <w:t xml:space="preserve"> To decide whether the extra complication of the selected machine-learning approaches is worthwhile when compared with clearer statistical approaches to Bitcoin volatility forecasting.</w:t>
       </w:r>
     </w:p>
     <w:p>
@@ -4902,7 +4889,7 @@
           <w:spacing w:val="0"/>
           <w:color w:val="0E121D"/>
         </w:rPr>
-        <w:t xml:space="preserve">Explain the mathematical foundations of returns and volatility.</w:t>
+        <w:t xml:space="preserve">Explain the key ideas behind Bitcoin returns and volatility in accessible language.</w:t>
       </w:r>
     </w:p>
     <w:p>
@@ -4930,7 +4917,7 @@
           <w:spacing w:val="0"/>
           <w:color w:val="0E121D"/>
         </w:rPr>
-        <w:t xml:space="preserve">Build a reproducible daily BTC dataset and realised-volatility target.</w:t>
+        <w:t xml:space="preserve">Prepare a reliable daily Bitcoin dataset for the comparison.</w:t>
       </w:r>
     </w:p>
     <w:p>
@@ -4958,7 +4945,7 @@
           <w:spacing w:val="0"/>
           <w:color w:val="0E121D"/>
         </w:rPr>
-        <w:t xml:space="preserve">Implement rolling historical volatility and GARCH(1,1).</w:t>
+        <w:t xml:space="preserve">Build two statistical reference methods.</w:t>
       </w:r>
     </w:p>
     <w:p>
@@ -4986,7 +4973,7 @@
           <w:spacing w:val="0"/>
           <w:color w:val="0E121D"/>
         </w:rPr>
-        <w:t xml:space="preserve">Implement Random Forest and attempt a small LSTM after the baseline workflow is stable.</w:t>
+        <w:t xml:space="preserve">Build Random Forest and attempt a small LSTM after the first comparison works.</w:t>
       </w:r>
     </w:p>
     <w:p>
@@ -5014,7 +5001,7 @@
           <w:spacing w:val="0"/>
           <w:color w:val="0E121D"/>
         </w:rPr>
-        <w:t xml:space="preserve">Preserve chronological order and evaluate MAE, MSE and RMSE.</w:t>
+        <w:t xml:space="preserve">Keep the data in time order and compare every method using the same error measures.</w:t>
       </w:r>
     </w:p>
     <w:p>
@@ -5042,7 +5029,7 @@
           <w:spacing w:val="0"/>
           <w:color w:val="0E121D"/>
         </w:rPr>
-        <w:t xml:space="preserve">Evaluate accuracy, interpretability, computational practicality and limitations.</w:t>
+        <w:t xml:space="preserve">Discuss accuracy, ease of explanation, practical use and limitations.</w:t>
       </w:r>
     </w:p>
     <w:p>
@@ -5057,7 +5044,7 @@
           <w:spacing w:val="0"/>
           <w:color w:val="0E121D"/>
         </w:rPr>
-        <w:t xml:space="preserve">The later addition of lagged linear regression, alternative target windows, test segments, expanding-window folds, volatility regimes, bootstrap uncertainty, Random Forest diagnostics and multi-seed LSTM checks belongs in later reviews, not in this original proposal section.</w:t>
+        <w:t xml:space="preserve">Later extra checks belong in the review sections because they were not part of the original proposal.</w:t>
       </w:r>
     </w:p>
     <w:p>
@@ -6021,7 +6008,7 @@
           <w:spacing w:val="0"/>
           <w:color w:val="0E121D"/>
         </w:rPr>
-        <w:t xml:space="preserve">I narrowed the project from a broad cryptocurrency-prediction idea to a focused comparison of Bitcoin volatility forecasts. I planned to establish transparent benchmarks before implementing machine learning, preserve chronological order, save raw and processed data, and export tables and charts rather than rely on screenshots. I also widened the evaluation from accuracy alone to interpretability, computational practicality and usefulness because a lower error would not automatically justify a more opaque model.</w:t>
+        <w:t xml:space="preserve">I narrowed the project from a broad cryptocurrency-prediction idea to a focused Bitcoin volatility comparison. I planned to begin with clear reference methods, keep the dates in order, save both the original and prepared data and produce tables and charts that could be checked. I also decided to compare clarity and practicality as well as accuracy, because a slightly lower error would not automatically make a more complicated method the better choice.</w:t>
       </w:r>
       <w:r>
         <w:rPr>
@@ -6121,7 +6108,7 @@
           <w:spacing w:val="0"/>
           <w:color w:val="0E121D"/>
         </w:rPr>
-        <w:t xml:space="preserve">Refine question, aims and objectives</w:t>
+        <w:t xml:space="preserve">Refine the question and objectives</w:t>
       </w:r>
     </w:p>
     <w:p>
@@ -6147,7 +6134,7 @@
           <w:spacing w:val="0"/>
           <w:color w:val="0E121D"/>
         </w:rPr>
-        <w:t xml:space="preserve">Candidate proposal, report outline and supervisor-feedback summary</w:t>
+        <w:t xml:space="preserve">Candidate proposal, report outline and feedback summary</w:t>
       </w:r>
     </w:p>
     <w:p>
@@ -6225,7 +6212,7 @@
           <w:spacing w:val="0"/>
           <w:color w:val="0E121D"/>
         </w:rPr>
-        <w:t xml:space="preserve">Complete planning review</w:t>
+        <w:t xml:space="preserve">Complete the planning review</w:t>
       </w:r>
     </w:p>
     <w:p>
@@ -6277,7 +6264,7 @@
           <w:spacing w:val="0"/>
           <w:color w:val="0E121D"/>
         </w:rPr>
-        <w:t xml:space="preserve">Download and clean BTC data</w:t>
+        <w:t xml:space="preserve">Download, check and organise the Bitcoin data</w:t>
       </w:r>
     </w:p>
     <w:p>
@@ -6303,7 +6290,7 @@
           <w:spacing w:val="0"/>
           <w:color w:val="0E121D"/>
         </w:rPr>
-        <w:t xml:space="preserve">Raw archive, processed dataset and data notes</w:t>
+        <w:t xml:space="preserve">Original data, prepared dataset and data notes</w:t>
       </w:r>
     </w:p>
     <w:p>
@@ -6329,7 +6316,7 @@
           <w:spacing w:val="0"/>
           <w:color w:val="0E121D"/>
         </w:rPr>
-        <w:t xml:space="preserve">Implement rolling volatility and GARCH</w:t>
+        <w:t xml:space="preserve">Build the first two comparison methods</w:t>
       </w:r>
     </w:p>
     <w:p>
@@ -6355,7 +6342,7 @@
           <w:spacing w:val="0"/>
           <w:color w:val="0E121D"/>
         </w:rPr>
-        <w:t xml:space="preserve">Python pipeline and outputs</w:t>
+        <w:t xml:space="preserve">Saved work and result tables</w:t>
       </w:r>
     </w:p>
     <w:p>
@@ -6381,7 +6368,7 @@
           <w:spacing w:val="0"/>
           <w:color w:val="0E121D"/>
         </w:rPr>
-        <w:t xml:space="preserve">Implement Random Forest and first LSTM prototype</w:t>
+        <w:t xml:space="preserve">Build the two machine-learning comparisons</w:t>
       </w:r>
     </w:p>
     <w:p>
@@ -6407,7 +6394,7 @@
           <w:spacing w:val="0"/>
           <w:color w:val="0E121D"/>
         </w:rPr>
-        <w:t xml:space="preserve">Python pipeline, model settings and outputs</w:t>
+        <w:t xml:space="preserve">Saved work, settings and results</w:t>
       </w:r>
     </w:p>
     <w:p>
@@ -6433,7 +6420,7 @@
           <w:spacing w:val="0"/>
           <w:color w:val="0E121D"/>
         </w:rPr>
-        <w:t xml:space="preserve">Compare models</w:t>
+        <w:t xml:space="preserve">Compare the results</w:t>
       </w:r>
     </w:p>
     <w:p>
@@ -6459,7 +6446,7 @@
           <w:spacing w:val="0"/>
           <w:color w:val="0E121D"/>
         </w:rPr>
-        <w:t xml:space="preserve">MAE, MSE, RMSE and forecast chart</w:t>
+        <w:t xml:space="preserve">Error table and forecast chart</w:t>
       </w:r>
     </w:p>
     <w:p>
@@ -6485,7 +6472,7 @@
           <w:spacing w:val="0"/>
           <w:color w:val="0E121D"/>
         </w:rPr>
-        <w:t xml:space="preserve">Complete mid-project review</w:t>
+        <w:t xml:space="preserve">Complete the mid-project review</w:t>
       </w:r>
     </w:p>
     <w:p>
@@ -6537,7 +6524,7 @@
           <w:spacing w:val="0"/>
           <w:color w:val="0E121D"/>
         </w:rPr>
-        <w:t xml:space="preserve">Draft report</w:t>
+        <w:t xml:space="preserve">Draft the report</w:t>
       </w:r>
     </w:p>
     <w:p>
@@ -6563,7 +6550,7 @@
           <w:spacing w:val="0"/>
           <w:color w:val="0E121D"/>
         </w:rPr>
-        <w:t xml:space="preserve">Section drafts and consolidated report</w:t>
+        <w:t xml:space="preserve">Section drafts and combined report</w:t>
       </w:r>
     </w:p>
     <w:p>
@@ -6589,7 +6576,7 @@
           <w:spacing w:val="0"/>
           <w:color w:val="0E121D"/>
         </w:rPr>
-        <w:t xml:space="preserve">Prepare presentation and final reflection</w:t>
+        <w:t xml:space="preserve">Prepare the presentation and final reflection</w:t>
       </w:r>
     </w:p>
     <w:p>
@@ -6615,7 +6602,7 @@
           <w:spacing w:val="0"/>
           <w:color w:val="0E121D"/>
         </w:rPr>
-        <w:t xml:space="preserve">Slide material, script, Q&amp;A preparation and final reflection</w:t>
+        <w:t xml:space="preserve">Slides, script, Q&amp;A preparation and reflection</w:t>
       </w:r>
     </w:p>
     <w:p>
@@ -6630,7 +6617,7 @@
           <w:spacing w:val="0"/>
           <w:color w:val="0E121D"/>
         </w:rPr>
-        <w:t xml:space="preserve">These are documented target dates, not proof that a review or task occurred on each date.</w:t>
+        <w:t xml:space="preserve">These dates show the plan, not proof that every task was completed on its target date.</w:t>
       </w:r>
     </w:p>
     <w:p>
@@ -6733,7 +6720,7 @@
           <w:spacing w:val="0"/>
           <w:color w:val="0E121D"/>
         </w:rPr>
-        <w:t xml:space="preserve">Depth was more feasible than a shallow multi-asset comparison within the project scale.</w:t>
+        <w:t xml:space="preserve">One asset allowed a deeper and more manageable project.</w:t>
       </w:r>
     </w:p>
     <w:p>
@@ -6759,20 +6746,20 @@
           <w:spacing w:val="0"/>
           <w:color w:val="0E121D"/>
         </w:rPr>
-        <w:t xml:space="preserve">Use rolling volatility and GARCH as benchmarks</w:t>
-      </w:r>
-    </w:p>
-    <w:p>
-      <w:pPr/>
-      <w:r>
-        <w:rPr>
-          <w:rFonts w:ascii="Arial" w:hAnsi="Arial" w:cs="Arial"/>
-          <w:sz w:val="23"/>
-          <w:sz-cs w:val="23"/>
-          <w:spacing w:val="0"/>
-          <w:color w:val="0E121D"/>
-        </w:rPr>
-        <w:t xml:space="preserve">Rolling volatility gives a transparent minimum benchmark; GARCH explicitly models volatility clustering.</w:t>
+        <w:t xml:space="preserve">Begin with two clear reference methods</w:t>
+      </w:r>
+    </w:p>
+    <w:p>
+      <w:pPr/>
+      <w:r>
+        <w:rPr>
+          <w:rFonts w:ascii="Arial" w:hAnsi="Arial" w:cs="Arial"/>
+          <w:sz w:val="23"/>
+          <w:sz-cs w:val="23"/>
+          <w:spacing w:val="0"/>
+          <w:color w:val="0E121D"/>
+        </w:rPr>
+        <w:t xml:space="preserve">They provided understandable results against which the later methods could be judged.</w:t>
       </w:r>
     </w:p>
     <w:p>
@@ -6798,20 +6785,20 @@
           <w:spacing w:val="0"/>
           <w:color w:val="0E121D"/>
         </w:rPr>
-        <w:t xml:space="preserve">Use Random Forest and LSTM as the main machine-learning comparison</w:t>
-      </w:r>
-    </w:p>
-    <w:p>
-      <w:pPr/>
-      <w:r>
-        <w:rPr>
-          <w:rFonts w:ascii="Arial" w:hAnsi="Arial" w:cs="Arial"/>
-          <w:sz w:val="23"/>
-          <w:sz-cs w:val="23"/>
-          <w:spacing w:val="0"/>
-          <w:color w:val="0E121D"/>
-        </w:rPr>
-        <w:t xml:space="preserve">The two models test nonlinear lag relationships and sequential learning without adding many unrelated model families.</w:t>
+        <w:t xml:space="preserve">Compare Random Forest and LSTM</w:t>
+      </w:r>
+    </w:p>
+    <w:p>
+      <w:pPr/>
+      <w:r>
+        <w:rPr>
+          <w:rFonts w:ascii="Arial" w:hAnsi="Arial" w:cs="Arial"/>
+          <w:sz w:val="23"/>
+          <w:sz-cs w:val="23"/>
+          <w:spacing w:val="0"/>
+          <w:color w:val="0E121D"/>
+        </w:rPr>
+        <w:t xml:space="preserve">They represented two different machine-learning approaches without making the project too wide.</w:t>
       </w:r>
     </w:p>
     <w:p>
@@ -6837,20 +6824,20 @@
           <w:spacing w:val="0"/>
           <w:color w:val="0E121D"/>
         </w:rPr>
-        <w:t xml:space="preserve">Preserve chronological order</w:t>
-      </w:r>
-    </w:p>
-    <w:p>
-      <w:pPr/>
-      <w:r>
-        <w:rPr>
-          <w:rFonts w:ascii="Arial" w:hAnsi="Arial" w:cs="Arial"/>
-          <w:sz w:val="23"/>
-          <w:sz-cs w:val="23"/>
-          <w:spacing w:val="0"/>
-          <w:color w:val="0E121D"/>
-        </w:rPr>
-        <w:t xml:space="preserve">Random shuffling would allow later market information to influence an earlier forecast evaluation.</w:t>
+        <w:t xml:space="preserve">Keep the original time order</w:t>
+      </w:r>
+    </w:p>
+    <w:p>
+      <w:pPr/>
+      <w:r>
+        <w:rPr>
+          <w:rFonts w:ascii="Arial" w:hAnsi="Arial" w:cs="Arial"/>
+          <w:sz w:val="23"/>
+          <w:sz-cs w:val="23"/>
+          <w:spacing w:val="0"/>
+          <w:color w:val="0E121D"/>
+        </w:rPr>
+        <w:t xml:space="preserve">Using future information to judge an earlier prediction would be unfair.</w:t>
       </w:r>
     </w:p>
     <w:p>
@@ -6889,7 +6876,7 @@
           <w:spacing w:val="0"/>
           <w:color w:val="0E121D"/>
         </w:rPr>
-        <w:t xml:space="preserve">The project moved to a specific exchange-level BTC perpetual-futures market rather than an aggregated finance site.</w:t>
+        <w:t xml:space="preserve">This gave the project one clearly defined Bitcoin market.</w:t>
       </w:r>
     </w:p>
     <w:p>
@@ -6928,7 +6915,7 @@
           <w:spacing w:val="0"/>
           <w:color w:val="0E121D"/>
         </w:rPr>
-        <w:t xml:space="preserve">Interpretability, measured runtime, structural complexity and robustness affect whether extra complexity is worthwhile.</w:t>
+        <w:t xml:space="preserve">Ease of explanation, time required and consistency also affect whether extra complexity is useful.</w:t>
       </w:r>
     </w:p>
     <w:p>
@@ -6959,7 +6946,7 @@
           <w:spacing w:val="0"/>
           <w:color w:val="0E121D"/>
         </w:rPr>
-        <w:t xml:space="preserve">The repository contains a candidate-side summary suggesting that the comparison should not be a simple ranking by MAE or RMSE and should define comparative analysis more clearly. It is not an authenticated supervisor quotation.</w:t>
+        <w:t xml:space="preserve">The repository contains a candidate-side summary suggesting that the comparison should go beyond simply ranking the error figures and should explain more clearly what was being compared. It is not an authenticated supervisor quotation.</w:t>
       </w:r>
     </w:p>
     <w:p>
@@ -7124,7 +7111,7 @@
           <w:spacing w:val="0"/>
           <w:color w:val="0E121D"/>
         </w:rPr>
-        <w:t xml:space="preserve">I expanded the planned comparison to include model-specific interpretability evidence, measured local runtime, structural scale, reproducibility and robustness. Candidate confirmation: {{PLANNING_RESPONSE_CONFIRMED}}</w:t>
+        <w:t xml:space="preserve">I added clearer comparison points covering explanation, time required, repeatability and whether the result stayed similar after further checks. Candidate confirmation: {{PLANNING_RESPONSE_CONFIRMED}}</w:t>
       </w:r>
     </w:p>
     <w:p>
@@ -7418,7 +7405,7 @@
           <w:spacing w:val="0"/>
           <w:color w:val="0E121D"/>
         </w:rPr>
-        <w:t xml:space="preserve">The timetable recorded 2026-07-05 as a target for this review, but the repository does not prove that a formal supervisor review occurred on that date. The official date remains {{MID_REVIEW_DATE}}.</w:t>
+        <w:t xml:space="preserve">The timetable recorded 2026-07-05 as the target for this review, but the repository does not prove that a formal review occurred on that date. The official date remains {{MID_REVIEW_DATE}}.</w:t>
       </w:r>
     </w:p>
     <w:p>
@@ -7448,7 +7435,7 @@
           <w:spacing w:val="0"/>
           <w:color w:val="0E121D"/>
         </w:rPr>
-        <w:t xml:space="preserve">The project broadly followed the planned topic but developed in important ways. Bitcoin remained the core asset, while Ethereum was dropped so that the main comparison could be deeper. Hyperliquid replaced the initially planned Yahoo Finance source. The first modelling workflow established rolling volatility, GARCH and feature-based models, and lagged linear regression was added as a transparent check on whether engineered features required a nonlinear model. The evaluation remained chronological. I also recognised that daily rolling volatility is an overlapping proxy for latent volatility and that this limits how widely the findings can be generalised.</w:t>
+        <w:t xml:space="preserve">The project kept its main Bitcoin topic but became more focused. I removed Ethereum so that I could study one market in more depth and changed the data source from Yahoo Finance to Hyperliquid. I built the planned comparison methods and added one extra simple method to check whether the more complicated approaches were really necessary. I kept the data in time order and became more careful about explaining that the chosen daily volatility measure is only an estimate, so the conclusion should not be applied too widely.</w:t>
       </w:r>
       <w:r>
         <w:rPr>
@@ -7548,20 +7535,20 @@
           <w:spacing w:val="0"/>
           <w:color w:val="0E121D"/>
         </w:rPr>
-        <w:t xml:space="preserve">Daily realised volatility is a proxy rather than directly observed latent volatility</w:t>
-      </w:r>
-    </w:p>
-    <w:p>
-      <w:pPr/>
-      <w:r>
-        <w:rPr>
-          <w:rFonts w:ascii="Arial" w:hAnsi="Arial" w:cs="Arial"/>
-          <w:sz w:val="23"/>
-          <w:sz-cs w:val="23"/>
-          <w:spacing w:val="0"/>
-          <w:color w:val="0E121D"/>
-        </w:rPr>
-        <w:t xml:space="preserve">Define the target precisely and state the limitation throughout the report.</w:t>
+        <w:t xml:space="preserve">The project measures volatility indirectly</w:t>
+      </w:r>
+    </w:p>
+    <w:p>
+      <w:pPr/>
+      <w:r>
+        <w:rPr>
+          <w:rFonts w:ascii="Arial" w:hAnsi="Arial" w:cs="Arial"/>
+          <w:sz w:val="23"/>
+          <w:sz-cs w:val="23"/>
+          <w:spacing w:val="0"/>
+          <w:color w:val="0E121D"/>
+        </w:rPr>
+        <w:t xml:space="preserve">Define the measure clearly and keep this limitation visible.</w:t>
       </w:r>
     </w:p>
     <w:p>
@@ -7587,20 +7574,20 @@
           <w:spacing w:val="0"/>
           <w:color w:val="0E121D"/>
         </w:rPr>
-        <w:t xml:space="preserve">The rolling target overlaps strongly across days</w:t>
-      </w:r>
-    </w:p>
-    <w:p>
-      <w:pPr/>
-      <w:r>
-        <w:rPr>
-          <w:rFonts w:ascii="Arial" w:hAnsi="Arial" w:cs="Arial"/>
-          <w:sz w:val="23"/>
-          <w:sz-cs w:val="23"/>
-          <w:spacing w:val="0"/>
-          <w:color w:val="0E121D"/>
-        </w:rPr>
-        <w:t xml:space="preserve">Preserve time order and avoid treating observations as independent.</w:t>
+        <w:t xml:space="preserve">Neighbouring daily results are closely related</w:t>
+      </w:r>
+    </w:p>
+    <w:p>
+      <w:pPr/>
+      <w:r>
+        <w:rPr>
+          <w:rFonts w:ascii="Arial" w:hAnsi="Arial" w:cs="Arial"/>
+          <w:sz w:val="23"/>
+          <w:sz-cs w:val="23"/>
+          <w:spacing w:val="0"/>
+          <w:color w:val="0E121D"/>
+        </w:rPr>
+        <w:t xml:space="preserve">Keep the dates in order and avoid treating every row as completely separate.</w:t>
       </w:r>
     </w:p>
     <w:p>
@@ -7626,20 +7613,20 @@
           <w:spacing w:val="0"/>
           <w:color w:val="0E121D"/>
         </w:rPr>
-        <w:t xml:space="preserve">The dataset is small for deep learning</w:t>
-      </w:r>
-    </w:p>
-    <w:p>
-      <w:pPr/>
-      <w:r>
-        <w:rPr>
-          <w:rFonts w:ascii="Arial" w:hAnsi="Arial" w:cs="Arial"/>
-          <w:sz w:val="23"/>
-          <w:sz-cs w:val="23"/>
-          <w:spacing w:val="0"/>
-          <w:color w:val="0E121D"/>
-        </w:rPr>
-        <w:t xml:space="preserve">Keep the LSTM modest, use chronological validation and report architecture and training evidence.</w:t>
+        <w:t xml:space="preserve">The dataset is not large for the most complicated method</w:t>
+      </w:r>
+    </w:p>
+    <w:p>
+      <w:pPr/>
+      <w:r>
+        <w:rPr>
+          <w:rFonts w:ascii="Arial" w:hAnsi="Arial" w:cs="Arial"/>
+          <w:sz w:val="23"/>
+          <w:sz-cs w:val="23"/>
+          <w:spacing w:val="0"/>
+          <w:color w:val="0E121D"/>
+        </w:rPr>
+        <w:t xml:space="preserve">Keep that method small and make a cautious comparison.</w:t>
       </w:r>
     </w:p>
     <w:p>
@@ -7665,20 +7652,20 @@
           <w:spacing w:val="0"/>
           <w:color w:val="0E121D"/>
         </w:rPr>
-        <w:t xml:space="preserve">Machine-learning models are harder to explain</w:t>
-      </w:r>
-    </w:p>
-    <w:p>
-      <w:pPr/>
-      <w:r>
-        <w:rPr>
-          <w:rFonts w:ascii="Arial" w:hAnsi="Arial" w:cs="Arial"/>
-          <w:sz w:val="23"/>
-          <w:sz-cs w:val="23"/>
-          <w:spacing w:val="0"/>
-          <w:color w:val="0E121D"/>
-        </w:rPr>
-        <w:t xml:space="preserve">Export model-specific evidence and avoid claiming that complexity itself is useful.</w:t>
+        <w:t xml:space="preserve">Some methods are harder to explain</w:t>
+      </w:r>
+    </w:p>
+    <w:p>
+      <w:pPr/>
+      <w:r>
+        <w:rPr>
+          <w:rFonts w:ascii="Arial" w:hAnsi="Arial" w:cs="Arial"/>
+          <w:sz w:val="23"/>
+          <w:sz-cs w:val="23"/>
+          <w:spacing w:val="0"/>
+          <w:color w:val="0E121D"/>
+        </w:rPr>
+        <w:t xml:space="preserve">Include clarity as part of the final judgement.</w:t>
       </w:r>
     </w:p>
     <w:p>
@@ -7704,20 +7691,20 @@
           <w:spacing w:val="0"/>
           <w:color w:val="0E121D"/>
         </w:rPr>
-        <w:t xml:space="preserve">Early outputs could contain implementation errors</w:t>
-      </w:r>
-    </w:p>
-    <w:p>
-      <w:pPr/>
-      <w:r>
-        <w:rPr>
-          <w:rFonts w:ascii="Arial" w:hAnsi="Arial" w:cs="Arial"/>
-          <w:sz w:val="23"/>
-          <w:sz-cs w:val="23"/>
-          <w:spacing w:val="0"/>
-          <w:color w:val="0E121D"/>
-        </w:rPr>
-        <w:t xml:space="preserve">Audit alignment, scaling, target construction and forecast dates before treating rankings as final.</w:t>
+        <w:t xml:space="preserve">An early result could contain a data or date mistake</w:t>
+      </w:r>
+    </w:p>
+    <w:p>
+      <w:pPr/>
+      <w:r>
+        <w:rPr>
+          <w:rFonts w:ascii="Arial" w:hAnsi="Arial" w:cs="Arial"/>
+          <w:sz w:val="23"/>
+          <w:sz-cs w:val="23"/>
+          <w:spacing w:val="0"/>
+          <w:color w:val="0E121D"/>
+        </w:rPr>
+        <w:t xml:space="preserve">Check the dates, input data and calculations before accepting the ranking.</w:t>
       </w:r>
     </w:p>
     <w:p>
@@ -7743,20 +7730,20 @@
           <w:spacing w:val="0"/>
           <w:color w:val="0E121D"/>
         </w:rPr>
-        <w:t xml:space="preserve">Project administration was not recorded consistently while work was happening</w:t>
-      </w:r>
-    </w:p>
-    <w:p>
-      <w:pPr/>
-      <w:r>
-        <w:rPr>
-          <w:rFonts w:ascii="Arial" w:hAnsi="Arial" w:cs="Arial"/>
-          <w:sz w:val="23"/>
-          <w:sz-cs w:val="23"/>
-          <w:spacing w:val="0"/>
-          <w:color w:val="0E121D"/>
-        </w:rPr>
-        <w:t xml:space="preserve">Use Git, saved outputs and dated files to build an evidence-based weekly chronology, leaving gaps explicit.</w:t>
+        <w:t xml:space="preserve">Weekly administration had not always been recorded</w:t>
+      </w:r>
+    </w:p>
+    <w:p>
+      <w:pPr/>
+      <w:r>
+        <w:rPr>
+          <w:rFonts w:ascii="Arial" w:hAnsi="Arial" w:cs="Arial"/>
+          <w:sz w:val="23"/>
+          <w:sz-cs w:val="23"/>
+          <w:spacing w:val="0"/>
+          <w:color w:val="0E121D"/>
+        </w:rPr>
+        <w:t xml:space="preserve">Reconstruct only what the saved evidence supports and leave gaps visible.</w:t>
       </w:r>
     </w:p>
     <w:p>
@@ -8044,7 +8031,7 @@
           <w:spacing w:val="0"/>
           <w:color w:val="0E121D"/>
         </w:rPr>
-        <w:t xml:space="preserve"> To evaluate whether the additional complexity of Random Forest and LSTM is justified when compared with transparent statistical approaches to Bitcoin volatility forecasting.</w:t>
+        <w:t xml:space="preserve"> To judge whether Random Forest and LSTM provide enough benefit to justify their extra complexity when compared with clearer statistical approaches.</w:t>
       </w:r>
     </w:p>
     <w:p>
@@ -8098,7 +8085,7 @@
           <w:spacing w:val="0"/>
           <w:color w:val="0E121D"/>
         </w:rPr>
-        <w:t xml:space="preserve">Define log returns and rolling realised-volatility targets.</w:t>
+        <w:t xml:space="preserve">Explain the chosen measure of Bitcoin volatility.</w:t>
       </w:r>
     </w:p>
     <w:p>
@@ -8126,7 +8113,7 @@
           <w:spacing w:val="0"/>
           <w:color w:val="0E121D"/>
         </w:rPr>
-        <w:t xml:space="preserve">Collect and quality-check daily Hyperliquid BTC perpetual-futures candles.</w:t>
+        <w:t xml:space="preserve">Collect, organise and check the daily Bitcoin data.</w:t>
       </w:r>
     </w:p>
     <w:p>
@@ -8154,7 +8141,7 @@
           <w:spacing w:val="0"/>
           <w:color w:val="0E121D"/>
         </w:rPr>
-        <w:t xml:space="preserve">Implement rolling historical volatility, GARCH(1,1), lagged linear regression, Random Forest and LSTM.</w:t>
+        <w:t xml:space="preserve">Build the selected statistical and machine-learning comparisons.</w:t>
       </w:r>
     </w:p>
     <w:p>
@@ -8182,7 +8169,7 @@
           <w:spacing w:val="0"/>
           <w:color w:val="0E121D"/>
         </w:rPr>
-        <w:t xml:space="preserve">Use chronological validation and common MAE, MSE and RMSE metrics.</w:t>
+        <w:t xml:space="preserve">Test every method on the same time-ordered data.</w:t>
       </w:r>
     </w:p>
     <w:p>
@@ -8210,7 +8197,7 @@
           <w:spacing w:val="0"/>
           <w:color w:val="0E121D"/>
         </w:rPr>
-        <w:t xml:space="preserve">Compare interpretation evidence, measured runtime, structural complexity and reproducibility.</w:t>
+        <w:t xml:space="preserve">Compare accuracy, clarity, time required and repeatability.</w:t>
       </w:r>
     </w:p>
     <w:p>
@@ -8238,7 +8225,7 @@
           <w:spacing w:val="0"/>
           <w:color w:val="0E121D"/>
         </w:rPr>
-        <w:t xml:space="preserve">Audit temporal alignment, scaling and target construction.</w:t>
+        <w:t xml:space="preserve">Check that dates, data preparation and results match correctly.</w:t>
       </w:r>
     </w:p>
     <w:p>
@@ -8266,7 +8253,7 @@
           <w:spacing w:val="0"/>
           <w:color w:val="0E121D"/>
         </w:rPr>
-        <w:t xml:space="preserve">Test whether the conclusion remains stable under alternative windows and later robustness checks.</w:t>
+        <w:t xml:space="preserve">Repeat the comparison in several reasonable ways to see whether the conclusion changes.</w:t>
       </w:r>
     </w:p>
     <w:p>
@@ -8294,7 +8281,7 @@
           <w:spacing w:val="0"/>
           <w:color w:val="0E121D"/>
         </w:rPr>
-        <w:t xml:space="preserve">Give a bounded conclusion for this dataset and implementation.</w:t>
+        <w:t xml:space="preserve">Give a careful conclusion limited to this project.</w:t>
       </w:r>
     </w:p>
     <w:p>
@@ -8338,7 +8325,7 @@
           <w:spacing w:val="0"/>
           <w:color w:val="0E121D"/>
         </w:rPr>
-        <w:t xml:space="preserve">Complete the LSTM and verify that validation and scaling use training-period information only.</w:t>
+        <w:t xml:space="preserve">Complete the final planned method and check that it uses only the information available at the time.</w:t>
       </w:r>
     </w:p>
     <w:p>
@@ -8366,7 +8353,7 @@
           <w:spacing w:val="0"/>
           <w:color w:val="0E121D"/>
         </w:rPr>
-        <w:t xml:space="preserve">Audit GARCH forecast alignment and the rolling-target conversion.</w:t>
+        <w:t xml:space="preserve">Check that every prediction is matched to the correct date and comparison value.</w:t>
       </w:r>
     </w:p>
     <w:p>
@@ -8394,7 +8381,7 @@
           <w:spacing w:val="0"/>
           <w:color w:val="0E121D"/>
         </w:rPr>
-        <w:t xml:space="preserve">Rerun the complete model set after each material correction.</w:t>
+        <w:t xml:space="preserve">Repeat the full comparison after any important correction.</w:t>
       </w:r>
     </w:p>
     <w:p>
@@ -8422,7 +8409,7 @@
           <w:spacing w:val="0"/>
           <w:color w:val="0E121D"/>
         </w:rPr>
-        <w:t xml:space="preserve">Add at least one alternative volatility window.</w:t>
+        <w:t xml:space="preserve">Try at least one reasonable alternative way of measuring volatility.</w:t>
       </w:r>
     </w:p>
     <w:p>
@@ -8450,7 +8437,7 @@
           <w:spacing w:val="0"/>
           <w:color w:val="0E121D"/>
         </w:rPr>
-        <w:t xml:space="preserve">Expand the literature review, methodology, results, discussion and conclusion.</w:t>
+        <w:t xml:space="preserve">Expand the report's research, method, results, discussion and conclusion sections.</w:t>
       </w:r>
     </w:p>
     <w:p>
@@ -8478,7 +8465,7 @@
           <w:spacing w:val="0"/>
           <w:color w:val="0E121D"/>
         </w:rPr>
-        <w:t xml:space="preserve">Prepare presentation materials and record genuine Q&amp;A after delivery.</w:t>
+        <w:t xml:space="preserve">Prepare the presentation and record the real questions after it is delivered.</w:t>
       </w:r>
     </w:p>
     <w:p>
@@ -8605,19 +8592,6 @@
           <w:color w:val="0E121D"/>
         </w:rPr>
         <w:t xml:space="preserve">{{MID_REVIEW_SIGNATURE_AND_DATE_OFFICIAL_FORM_ONLY}}</w:t>
-      </w:r>
-    </w:p>
-    <w:p>
-      <w:pPr/>
-      <w:r>
-        <w:rPr>
-          <w:rFonts w:ascii="Arial" w:hAnsi="Arial" w:cs="Arial"/>
-          <w:sz w:val="28"/>
-          <w:sz-cs w:val="28"/>
-          <w:spacing w:val="0"/>
-          <w:color w:val="6D6D6D"/>
-        </w:rPr>
-        <w:t xml:space="preserve"/>
       </w:r>
     </w:p>
     <w:p>
@@ -8679,7 +8653,7 @@
           <w:spacing w:val="0"/>
           <w:color w:val="0E121D"/>
         </w:rPr>
-        <w:t xml:space="preserve">The product is a research report supported by a reproducible Python pipeline, archived market data, processed features and targets, model predictions, comparison tables, robustness outputs, a native chart, source evaluation and presentation preparation. The project followed the revised topic and comparison logic, but the methodology became stricter after several audits. Those changes are part of the product's development rather than being hidden from the record.</w:t>
+        <w:t xml:space="preserve">The main product is a research report supported by saved Bitcoin data, the work used to run the comparisons, result tables, a chart, source evaluation and presentation preparation. The topic stayed consistent with the revised plan, but the checking process became more careful after I found problems with dates and an incomplete day of data. I have kept those changes visible because they show how the project developed.</w:t>
       </w:r>
       <w:r>
         <w:rPr>
@@ -8802,20 +8776,20 @@
           <w:spacing w:val="0"/>
           <w:color w:val="0E121D"/>
         </w:rPr>
-        <w:t xml:space="preserve">Reproducible code and tests</w:t>
-      </w:r>
-    </w:p>
-    <w:p>
-      <w:pPr/>
-      <w:r>
-        <w:rPr>
-          <w:rFonts w:ascii="Arial" w:hAnsi="Arial" w:cs="Arial"/>
-          <w:sz w:val="23"/>
-          <w:sz-cs w:val="23"/>
-          <w:spacing w:val="0"/>
-          <w:color w:val="0E121D"/>
-        </w:rPr>
-        <w:t xml:space="preserve">code/epq_pipeline, code/tests and run scripts; current passing-test count: 39</w:t>
+        <w:t xml:space="preserve">Saved comparison work and checks</w:t>
+      </w:r>
+    </w:p>
+    <w:p>
+      <w:pPr/>
+      <w:r>
+        <w:rPr>
+          <w:rFonts w:ascii="Arial" w:hAnsi="Arial" w:cs="Arial"/>
+          <w:sz w:val="23"/>
+          <w:sz-cs w:val="23"/>
+          <w:spacing w:val="0"/>
+          <w:color w:val="0E121D"/>
+        </w:rPr>
+        <w:t xml:space="preserve">code folder, test folder and run files; 39 checks currently pass</w:t>
       </w:r>
     </w:p>
     <w:p>
@@ -8841,20 +8815,20 @@
           <w:spacing w:val="0"/>
           <w:color w:val="0E121D"/>
         </w:rPr>
-        <w:t xml:space="preserve">Market data and quality record</w:t>
-      </w:r>
-    </w:p>
-    <w:p>
-      <w:pPr/>
-      <w:r>
-        <w:rPr>
-          <w:rFonts w:ascii="Arial" w:hAnsi="Arial" w:cs="Arial"/>
-          <w:sz w:val="23"/>
-          <w:sz-cs w:val="23"/>
-          <w:spacing w:val="0"/>
-          <w:color w:val="0E121D"/>
-        </w:rPr>
-        <w:t xml:space="preserve">Completed daily Hyperliquid candles and quality JSON; current retained rows: 1,240</w:t>
+        <w:t xml:space="preserve">Market data and data-quality record</w:t>
+      </w:r>
+    </w:p>
+    <w:p>
+      <w:pPr/>
+      <w:r>
+        <w:rPr>
+          <w:rFonts w:ascii="Arial" w:hAnsi="Arial" w:cs="Arial"/>
+          <w:sz w:val="23"/>
+          <w:sz-cs w:val="23"/>
+          <w:spacing w:val="0"/>
+          <w:color w:val="0E121D"/>
+        </w:rPr>
+        <w:t xml:space="preserve">Completed daily Hyperliquid records; 1,240 completed days retained</w:t>
       </w:r>
     </w:p>
     <w:p>
@@ -8880,20 +8854,20 @@
           <w:spacing w:val="0"/>
           <w:color w:val="0E121D"/>
         </w:rPr>
-        <w:t xml:space="preserve">Model evidence</w:t>
-      </w:r>
-    </w:p>
-    <w:p>
-      <w:pPr/>
-      <w:r>
-        <w:rPr>
-          <w:rFonts w:ascii="Arial" w:hAnsi="Arial" w:cs="Arial"/>
-          <w:sz w:val="23"/>
-          <w:sz-cs w:val="23"/>
-          <w:spacing w:val="0"/>
-          <w:color w:val="0E121D"/>
-        </w:rPr>
-        <w:t xml:space="preserve">Predictions, metrics, parameters, timing, complexity and diagnostic outputs</w:t>
+        <w:t xml:space="preserve">Results evidence</w:t>
+      </w:r>
+    </w:p>
+    <w:p>
+      <w:pPr/>
+      <w:r>
+        <w:rPr>
+          <w:rFonts w:ascii="Arial" w:hAnsi="Arial" w:cs="Arial"/>
+          <w:sz w:val="23"/>
+          <w:sz-cs w:val="23"/>
+          <w:spacing w:val="0"/>
+          <w:color w:val="0E121D"/>
+        </w:rPr>
+        <w:t xml:space="preserve">Saved predictions, comparison figures and supporting checks</w:t>
       </w:r>
     </w:p>
     <w:p>
@@ -8932,7 +8906,7 @@
           <w:spacing w:val="0"/>
           <w:color w:val="0E121D"/>
         </w:rPr>
-        <w:t xml:space="preserve">Source list, literature notes, search log and source-evaluation workbook</w:t>
+        <w:t xml:space="preserve">Source list, reading notes, search log and source-evaluation workbook</w:t>
       </w:r>
     </w:p>
     <w:p>
@@ -8971,7 +8945,7 @@
           <w:spacing w:val="0"/>
           <w:color w:val="0E121D"/>
         </w:rPr>
-        <w:t xml:space="preserve">Slide outline, full script and Q&amp;A preparation; final delivered slide file: {{FINAL_PRESENTATION_FILE}}</w:t>
+        <w:t xml:space="preserve">Slide outline, script and Q&amp;A preparation; final slide file: {{FINAL_PRESENTATION_FILE}}</w:t>
       </w:r>
     </w:p>
     <w:p>
@@ -8987,7 +8961,7 @@
           <w:spacing w:val="0"/>
           <w:color w:val="1B3C5D"/>
         </w:rPr>
-        <w:t xml:space="preserve">PL-11.02 Major development and audit trail</w:t>
+        <w:t xml:space="preserve">PL-11.02 Major development and checking record</w:t>
       </w:r>
     </w:p>
     <w:p>
@@ -9061,20 +9035,20 @@
           <w:spacing w:val="0"/>
           <w:color w:val="0E121D"/>
         </w:rPr>
-        <w:t xml:space="preserve">Data source changed from Yahoo Finance to Hyperliquid</w:t>
-      </w:r>
-    </w:p>
-    <w:p>
-      <w:pPr/>
-      <w:r>
-        <w:rPr>
-          <w:rFonts w:ascii="Arial" w:hAnsi="Arial" w:cs="Arial"/>
-          <w:sz w:val="23"/>
-          <w:sz-cs w:val="23"/>
-          <w:spacing w:val="0"/>
-          <w:color w:val="0E121D"/>
-        </w:rPr>
-        <w:t xml:space="preserve">Defined one exchange-level BTC perpetual-futures market and made the market scope more precise.</w:t>
+        <w:t xml:space="preserve">The data source changed from Yahoo Finance to Hyperliquid</w:t>
+      </w:r>
+    </w:p>
+    <w:p>
+      <w:pPr/>
+      <w:r>
+        <w:rPr>
+          <w:rFonts w:ascii="Arial" w:hAnsi="Arial" w:cs="Arial"/>
+          <w:sz w:val="23"/>
+          <w:sz-cs w:val="23"/>
+          <w:spacing w:val="0"/>
+          <w:color w:val="0E121D"/>
+        </w:rPr>
+        <w:t xml:space="preserve">The study used one clearly identified Bitcoin market.</w:t>
       </w:r>
     </w:p>
     <w:p>
@@ -9100,20 +9074,20 @@
           <w:spacing w:val="0"/>
           <w:color w:val="0E121D"/>
         </w:rPr>
-        <w:t xml:space="preserve">Lagged linear regression added</w:t>
-      </w:r>
-    </w:p>
-    <w:p>
-      <w:pPr/>
-      <w:r>
-        <w:rPr>
-          <w:rFonts w:ascii="Arial" w:hAnsi="Arial" w:cs="Arial"/>
-          <w:sz w:val="23"/>
-          <w:sz-cs w:val="23"/>
-          <w:spacing w:val="0"/>
-          <w:color w:val="0E121D"/>
-        </w:rPr>
-        <w:t xml:space="preserve">Tested whether engineered lag information needed a nonlinear model.</w:t>
+        <w:t xml:space="preserve">An extra simple comparison was added</w:t>
+      </w:r>
+    </w:p>
+    <w:p>
+      <w:pPr/>
+      <w:r>
+        <w:rPr>
+          <w:rFonts w:ascii="Arial" w:hAnsi="Arial" w:cs="Arial"/>
+          <w:sz w:val="23"/>
+          <w:sz-cs w:val="23"/>
+          <w:spacing w:val="0"/>
+          <w:color w:val="0E121D"/>
+        </w:rPr>
+        <w:t xml:space="preserve">It helped show whether a more complicated method was actually needed.</w:t>
       </w:r>
     </w:p>
     <w:p>
@@ -9139,20 +9113,20 @@
           <w:spacing w:val="0"/>
           <w:color w:val="0E121D"/>
         </w:rPr>
-        <w:t xml:space="preserve">LSTM implemented and code refactored into a package</w:t>
-      </w:r>
-    </w:p>
-    <w:p>
-      <w:pPr/>
-      <w:r>
-        <w:rPr>
-          <w:rFonts w:ascii="Arial" w:hAnsi="Arial" w:cs="Arial"/>
-          <w:sz w:val="23"/>
-          <w:sz-cs w:val="23"/>
-          <w:spacing w:val="0"/>
-          <w:color w:val="0E121D"/>
-        </w:rPr>
-        <w:t xml:space="preserve">Completed the planned sequential-model comparison and improved reproducibility.</w:t>
+        <w:t xml:space="preserve">The final planned method was completed and the files were reorganised</w:t>
+      </w:r>
+    </w:p>
+    <w:p>
+      <w:pPr/>
+      <w:r>
+        <w:rPr>
+          <w:rFonts w:ascii="Arial" w:hAnsi="Arial" w:cs="Arial"/>
+          <w:sz w:val="23"/>
+          <w:sz-cs w:val="23"/>
+          <w:spacing w:val="0"/>
+          <w:color w:val="0E121D"/>
+        </w:rPr>
+        <w:t xml:space="preserve">The full comparison became easier to repeat and review.</w:t>
       </w:r>
     </w:p>
     <w:p>
@@ -9178,20 +9152,20 @@
           <w:spacing w:val="0"/>
           <w:color w:val="0E121D"/>
         </w:rPr>
-        <w:t xml:space="preserve">GARCH predictions mapped by date rather than reset row number</w:t>
-      </w:r>
-    </w:p>
-    <w:p>
-      <w:pPr/>
-      <w:r>
-        <w:rPr>
-          <w:rFonts w:ascii="Arial" w:hAnsi="Arial" w:cs="Arial"/>
-          <w:sz w:val="23"/>
-          <w:sz-cs w:val="23"/>
-          <w:spacing w:val="0"/>
-          <w:color w:val="0E121D"/>
-        </w:rPr>
-        <w:t xml:space="preserve">Removed a forecast-to-target alignment risk.</w:t>
+        <w:t xml:space="preserve">Predictions were matched using dates</w:t>
+      </w:r>
+    </w:p>
+    <w:p>
+      <w:pPr/>
+      <w:r>
+        <w:rPr>
+          <w:rFonts w:ascii="Arial" w:hAnsi="Arial" w:cs="Arial"/>
+          <w:sz w:val="23"/>
+          <w:sz-cs w:val="23"/>
+          <w:spacing w:val="0"/>
+          <w:color w:val="0E121D"/>
+        </w:rPr>
+        <w:t xml:space="preserve">This corrected the risk of connecting a result to the wrong day.</w:t>
       </w:r>
     </w:p>
     <w:p>
@@ -9217,20 +9191,20 @@
           <w:spacing w:val="0"/>
           <w:color w:val="0E121D"/>
         </w:rPr>
-        <w:t xml:space="preserve">GARCH likelihood update order corrected</w:t>
-      </w:r>
-    </w:p>
-    <w:p>
-      <w:pPr/>
-      <w:r>
-        <w:rPr>
-          <w:rFonts w:ascii="Arial" w:hAnsi="Arial" w:cs="Arial"/>
-          <w:sz w:val="23"/>
-          <w:sz-cs w:val="23"/>
-          <w:spacing w:val="0"/>
-          <w:color w:val="0E121D"/>
-        </w:rPr>
-        <w:t xml:space="preserve">Prevented the current shock from entering its own conditional variance.</w:t>
+        <w:t xml:space="preserve">One calculation step was corrected</w:t>
+      </w:r>
+    </w:p>
+    <w:p>
+      <w:pPr/>
+      <w:r>
+        <w:rPr>
+          <w:rFonts w:ascii="Arial" w:hAnsi="Arial" w:cs="Arial"/>
+          <w:sz w:val="23"/>
+          <w:sz-cs w:val="23"/>
+          <w:spacing w:val="0"/>
+          <w:color w:val="0E121D"/>
+        </w:rPr>
+        <w:t xml:space="preserve">The result no longer used information from the wrong point in time.</w:t>
       </w:r>
     </w:p>
     <w:p>
@@ -9256,20 +9230,20 @@
           <w:spacing w:val="0"/>
           <w:color w:val="0E121D"/>
         </w:rPr>
-        <w:t xml:space="preserve">Rolling sample-variance expectation corrected</w:t>
-      </w:r>
-    </w:p>
-    <w:p>
-      <w:pPr/>
-      <w:r>
-        <w:rPr>
-          <w:rFonts w:ascii="Arial" w:hAnsi="Arial" w:cs="Arial"/>
-          <w:sz w:val="23"/>
-          <w:sz-cs w:val="23"/>
-          <w:spacing w:val="0"/>
-          <w:color w:val="0E121D"/>
-        </w:rPr>
-        <w:t xml:space="preserve">Accounted for the uncertain next return changing both the sum of squares and the sample mean.</w:t>
+        <w:t xml:space="preserve">The volatility calculation was checked and corrected</w:t>
+      </w:r>
+    </w:p>
+    <w:p>
+      <w:pPr/>
+      <w:r>
+        <w:rPr>
+          <w:rFonts w:ascii="Arial" w:hAnsi="Arial" w:cs="Arial"/>
+          <w:sz w:val="23"/>
+          <w:sz-cs w:val="23"/>
+          <w:spacing w:val="0"/>
+          <w:color w:val="0E121D"/>
+        </w:rPr>
+        <w:t xml:space="preserve">The target was calculated more consistently.</w:t>
       </w:r>
     </w:p>
     <w:p>
@@ -9295,20 +9269,20 @@
           <w:spacing w:val="0"/>
           <w:color w:val="0E121D"/>
         </w:rPr>
-        <w:t xml:space="preserve">LSTM scaler limited to the fitting portion</w:t>
-      </w:r>
-    </w:p>
-    <w:p>
-      <w:pPr/>
-      <w:r>
-        <w:rPr>
-          <w:rFonts w:ascii="Arial" w:hAnsi="Arial" w:cs="Arial"/>
-          <w:sz w:val="23"/>
-          <w:sz-cs w:val="23"/>
-          <w:spacing w:val="0"/>
-          <w:color w:val="0E121D"/>
-        </w:rPr>
-        <w:t xml:space="preserve">Removed validation-period information from scaling estimates.</w:t>
+        <w:t xml:space="preserve">Data preparation for the final method was limited to the correct period</w:t>
+      </w:r>
+    </w:p>
+    <w:p>
+      <w:pPr/>
+      <w:r>
+        <w:rPr>
+          <w:rFonts w:ascii="Arial" w:hAnsi="Arial" w:cs="Arial"/>
+          <w:sz w:val="23"/>
+          <w:sz-cs w:val="23"/>
+          <w:spacing w:val="0"/>
+          <w:color w:val="0E121D"/>
+        </w:rPr>
+        <w:t xml:space="preserve">Later information was kept out of an earlier stage.</w:t>
       </w:r>
     </w:p>
     <w:p>
@@ -9334,20 +9308,20 @@
           <w:spacing w:val="0"/>
           <w:color w:val="0E121D"/>
         </w:rPr>
-        <w:t xml:space="preserve">Still-open daily candle excluded</w:t>
-      </w:r>
-    </w:p>
-    <w:p>
-      <w:pPr/>
-      <w:r>
-        <w:rPr>
-          <w:rFonts w:ascii="Arial" w:hAnsi="Arial" w:cs="Arial"/>
-          <w:sz w:val="23"/>
-          <w:sz-cs w:val="23"/>
-          <w:spacing w:val="0"/>
-          <w:color w:val="0E121D"/>
-        </w:rPr>
-        <w:t xml:space="preserve">Prevented a partial close and partial activity measures from entering the dataset.</w:t>
+        <w:t xml:space="preserve">The still-open daily record was excluded</w:t>
+      </w:r>
+    </w:p>
+    <w:p>
+      <w:pPr/>
+      <w:r>
+        <w:rPr>
+          <w:rFonts w:ascii="Arial" w:hAnsi="Arial" w:cs="Arial"/>
+          <w:sz w:val="23"/>
+          <w:sz-cs w:val="23"/>
+          <w:spacing w:val="0"/>
+          <w:color w:val="0E121D"/>
+        </w:rPr>
+        <w:t xml:space="preserve">Only completed days entered the final comparison.</w:t>
       </w:r>
     </w:p>
     <w:p>
@@ -9373,20 +9347,20 @@
           <w:spacing w:val="0"/>
           <w:color w:val="0E121D"/>
         </w:rPr>
-        <w:t xml:space="preserve">Robustness and diagnostics expanded</w:t>
-      </w:r>
-    </w:p>
-    <w:p>
-      <w:pPr/>
-      <w:r>
-        <w:rPr>
-          <w:rFonts w:ascii="Arial" w:hAnsi="Arial" w:cs="Arial"/>
-          <w:sz w:val="23"/>
-          <w:sz-cs w:val="23"/>
-          <w:spacing w:val="0"/>
-          <w:color w:val="0E121D"/>
-        </w:rPr>
-        <w:t xml:space="preserve">Added target-window, segment, expanding-window, regime, bootstrap, OOB, permutation and multi-seed evidence.</w:t>
+        <w:t xml:space="preserve">The comparison was repeated under several reasonable settings</w:t>
+      </w:r>
+    </w:p>
+    <w:p>
+      <w:pPr/>
+      <w:r>
+        <w:rPr>
+          <w:rFonts w:ascii="Arial" w:hAnsi="Arial" w:cs="Arial"/>
+          <w:sz w:val="23"/>
+          <w:sz-cs w:val="23"/>
+          <w:spacing w:val="0"/>
+          <w:color w:val="0E121D"/>
+        </w:rPr>
+        <w:t xml:space="preserve">This showed whether the main conclusion was stable.</w:t>
       </w:r>
     </w:p>
     <w:p>
@@ -9401,7 +9375,7 @@
           <w:spacing w:val="0"/>
           <w:color w:val="0E121D"/>
         </w:rPr>
-        <w:t xml:space="preserve">The candidate must describe personal involvement accurately. Replace any unsupported “I coded” or “I corrected” wording with a truthful account of what was done with AI assistance and what the candidate personally reviewed or tested.</w:t>
+        <w:t xml:space="preserve">The candidate must describe personal involvement accurately. Any statement about creating or correcting work should explain truthfully what was completed with AI assistance and what the candidate personally reviewed or tested.</w:t>
       </w:r>
     </w:p>
     <w:p>
@@ -9432,7 +9406,7 @@
           <w:spacing w:val="0"/>
           <w:color w:val="0E121D"/>
         </w:rPr>
-        <w:t xml:space="preserve">The values below come from the final 2026-07-20 data refresh and model run. The run metadata was generated at 2026-07-20T06:14:33+00:00.</w:t>
+        <w:t xml:space="preserve">The values below come from the data refresh and full comparison completed on 2026-07-20. More detailed figures remain in the report and saved output files.</w:t>
       </w:r>
     </w:p>
     <w:p>
@@ -9545,7 +9519,7 @@
           <w:spacing w:val="0"/>
           <w:color w:val="0E121D"/>
         </w:rPr>
-        <w:t xml:space="preserve">Fetch timestamp UTC</w:t>
+        <w:t xml:space="preserve">Time the data was collected</w:t>
       </w:r>
     </w:p>
     <w:p>
@@ -9584,7 +9558,7 @@
           <w:spacing w:val="0"/>
           <w:color w:val="0E121D"/>
         </w:rPr>
-        <w:t xml:space="preserve">API rows returned</w:t>
+        <w:t xml:space="preserve">Daily records returned</w:t>
       </w:r>
     </w:p>
     <w:p>
@@ -9623,7 +9597,7 @@
           <w:spacing w:val="0"/>
           <w:color w:val="0E121D"/>
         </w:rPr>
-        <w:t xml:space="preserve">Incomplete rows excluded</w:t>
+        <w:t xml:space="preserve">Unfinished records removed</w:t>
       </w:r>
     </w:p>
     <w:p>
@@ -9662,7 +9636,7 @@
           <w:spacing w:val="0"/>
           <w:color w:val="0E121D"/>
         </w:rPr>
-        <w:t xml:space="preserve">Completed candle rows retained</w:t>
+        <w:t xml:space="preserve">Completed daily records kept</w:t>
       </w:r>
     </w:p>
     <w:p>
@@ -9701,7 +9675,7 @@
           <w:spacing w:val="0"/>
           <w:color w:val="0E121D"/>
         </w:rPr>
-        <w:t xml:space="preserve">Last completed candle date</w:t>
+        <w:t xml:space="preserve">Last complete date</w:t>
       </w:r>
     </w:p>
     <w:p>
@@ -9740,7 +9714,7 @@
           <w:spacing w:val="0"/>
           <w:color w:val="0E121D"/>
         </w:rPr>
-        <w:t xml:space="preserve">Modelling-frame rows</w:t>
+        <w:t xml:space="preserve">Rows used after preparation</w:t>
       </w:r>
     </w:p>
     <w:p>
@@ -9779,7 +9753,7 @@
           <w:spacing w:val="0"/>
           <w:color w:val="0E121D"/>
         </w:rPr>
-        <w:t xml:space="preserve">Training rows</w:t>
+        <w:t xml:space="preserve">Earlier rows used for learning</w:t>
       </w:r>
     </w:p>
     <w:p>
@@ -9818,7 +9792,7 @@
           <w:spacing w:val="0"/>
           <w:color w:val="0E121D"/>
         </w:rPr>
-        <w:t xml:space="preserve">Test rows</w:t>
+        <w:t xml:space="preserve">Later rows used for comparison</w:t>
       </w:r>
     </w:p>
     <w:p>
@@ -9857,7 +9831,7 @@
           <w:spacing w:val="0"/>
           <w:color w:val="0E121D"/>
         </w:rPr>
-        <w:t xml:space="preserve">GARCH 30-day RMSE</w:t>
+        <w:t xml:space="preserve">Best main error figure</w:t>
       </w:r>
     </w:p>
     <w:p>
@@ -9896,7 +9870,7 @@
           <w:spacing w:val="0"/>
           <w:color w:val="0E121D"/>
         </w:rPr>
-        <w:t xml:space="preserve">Lagged linear 30-day RMSE</w:t>
+        <w:t xml:space="preserve">Extra simple comparison</w:t>
       </w:r>
     </w:p>
     <w:p>
@@ -9935,7 +9909,7 @@
           <w:spacing w:val="0"/>
           <w:color w:val="0E121D"/>
         </w:rPr>
-        <w:t xml:space="preserve">Rolling 30-day RMSE</w:t>
+        <w:t xml:space="preserve">Rolling comparison</w:t>
       </w:r>
     </w:p>
     <w:p>
@@ -9974,7 +9948,7 @@
           <w:spacing w:val="0"/>
           <w:color w:val="0E121D"/>
         </w:rPr>
-        <w:t xml:space="preserve">LSTM 30-day RMSE</w:t>
+        <w:t xml:space="preserve">LSTM comparison</w:t>
       </w:r>
     </w:p>
     <w:p>
@@ -10013,7 +9987,7 @@
           <w:spacing w:val="0"/>
           <w:color w:val="0E121D"/>
         </w:rPr>
-        <w:t xml:space="preserve">Random Forest 30-day RMSE</w:t>
+        <w:t xml:space="preserve">Random Forest comparison</w:t>
       </w:r>
     </w:p>
     <w:p>
@@ -10052,7 +10026,7 @@
           <w:spacing w:val="0"/>
           <w:color w:val="0E121D"/>
         </w:rPr>
-        <w:t xml:space="preserve">GARCH expanding-window RMSE</w:t>
+        <w:t xml:space="preserve">Best result in the repeated time-based check</w:t>
       </w:r>
     </w:p>
     <w:p>
@@ -10091,7 +10065,7 @@
           <w:spacing w:val="0"/>
           <w:color w:val="0E121D"/>
         </w:rPr>
-        <w:t xml:space="preserve">GARCH bootstrap interval versus rolling</w:t>
+        <w:t xml:space="preserve">Range from the uncertainty check</w:t>
       </w:r>
     </w:p>
     <w:p>
@@ -10130,7 +10104,7 @@
           <w:spacing w:val="0"/>
           <w:color w:val="0E121D"/>
         </w:rPr>
-        <w:t xml:space="preserve">Passing tests</w:t>
+        <w:t xml:space="preserve">Automated checks passed</w:t>
       </w:r>
     </w:p>
     <w:p>
@@ -10187,7 +10161,7 @@
           <w:spacing w:val="0"/>
           <w:color w:val="0E121D"/>
         </w:rPr>
-        <w:t xml:space="preserve">The same explicit target and chronological test logic are used across the five primary comparators.</w:t>
+        <w:t xml:space="preserve">All main methods were compared using the same target and the same time order.</w:t>
       </w:r>
     </w:p>
     <w:p>
@@ -10215,7 +10189,7 @@
           <w:spacing w:val="0"/>
           <w:color w:val="0E121D"/>
         </w:rPr>
-        <w:t xml:space="preserve">Saved outputs support numerical claims and preserve forecast-origin and target dates.</w:t>
+        <w:t xml:space="preserve">Results were saved in tables so that the figures could be checked again.</w:t>
       </w:r>
     </w:p>
     <w:p>
@@ -10243,7 +10217,7 @@
           <w:spacing w:val="0"/>
           <w:color w:val="0E121D"/>
         </w:rPr>
-        <w:t xml:space="preserve">The audit trail records material corrections instead of silently retaining an invalid early ranking.</w:t>
+        <w:t xml:space="preserve">Important corrections were recorded instead of hiding the earlier problem.</w:t>
       </w:r>
     </w:p>
     <w:p>
@@ -10271,7 +10245,7 @@
           <w:spacing w:val="0"/>
           <w:color w:val="0E121D"/>
         </w:rPr>
-        <w:t xml:space="preserve">Robustness evidence tests whether the conclusion depends on one window, one test segment, one volatility regime or one LSTM seed.</w:t>
+        <w:t xml:space="preserve">The comparison was repeated in several ways to see whether the overall answer changed.</w:t>
       </w:r>
     </w:p>
     <w:p>
@@ -10299,7 +10273,7 @@
           <w:spacing w:val="0"/>
           <w:color w:val="0E121D"/>
         </w:rPr>
-        <w:t xml:space="preserve">The final conclusion is bounded to the selected market, period, target and implementations.</w:t>
+        <w:t xml:space="preserve">The final conclusion is limited to the market, dates and methods used in this project.</w:t>
       </w:r>
     </w:p>
     <w:p>
@@ -10343,7 +10317,7 @@
           <w:spacing w:val="0"/>
           <w:color w:val="0E121D"/>
         </w:rPr>
-        <w:t xml:space="preserve">Daily realised volatility is a proxy and does not use intraday realised variance.</w:t>
+        <w:t xml:space="preserve">The project estimates volatility from daily data rather than observing it directly.</w:t>
       </w:r>
     </w:p>
     <w:p>
@@ -10371,7 +10345,7 @@
           <w:spacing w:val="0"/>
           <w:color w:val="0E121D"/>
         </w:rPr>
-        <w:t xml:space="preserve">Overlapping rolling targets create strong persistence and dependent errors.</w:t>
+        <w:t xml:space="preserve">Results for neighbouring days are closely related, so the evidence is not completely independent.</w:t>
       </w:r>
     </w:p>
     <w:p>
@@ -10399,7 +10373,7 @@
           <w:spacing w:val="0"/>
           <w:color w:val="0E121D"/>
         </w:rPr>
-        <w:t xml:space="preserve">The Random Forest is a lightweight local implementation rather than an extensively tuned library benchmark.</w:t>
+        <w:t xml:space="preserve">The Random Forest comparison is deliberately modest and was not tuned in every possible way.</w:t>
       </w:r>
     </w:p>
     <w:p>
@@ -10427,7 +10401,7 @@
           <w:spacing w:val="0"/>
           <w:color w:val="0E121D"/>
         </w:rPr>
-        <w:t xml:space="preserve">The LSTM is deliberately small and the dataset is limited for deep learning.</w:t>
+        <w:t xml:space="preserve">The LSTM is small and the available dataset is limited for a complicated model.</w:t>
       </w:r>
     </w:p>
     <w:p>
@@ -10455,7 +10429,7 @@
           <w:spacing w:val="0"/>
           <w:color w:val="0E121D"/>
         </w:rPr>
-        <w:t xml:space="preserve">One BTC perpetual-futures market cannot establish universal model superiority.</w:t>
+        <w:t xml:space="preserve">One Bitcoin market cannot prove that the same result will hold everywhere.</w:t>
       </w:r>
     </w:p>
     <w:p>
@@ -10483,7 +10457,7 @@
           <w:spacing w:val="0"/>
           <w:color w:val="0E121D"/>
         </w:rPr>
-        <w:t xml:space="preserve">Four expanding-window blocks remain parts of one history, not independent external datasets.</w:t>
+        <w:t xml:space="preserve">Repeating the test across parts of the same history is not the same as using a completely new dataset.</w:t>
       </w:r>
     </w:p>
     <w:p>
@@ -10511,7 +10485,7 @@
           <w:spacing w:val="0"/>
           <w:color w:val="0E121D"/>
         </w:rPr>
-        <w:t xml:space="preserve">Early administration was weaker than the later technical audit; many days lack direct process records.</w:t>
+        <w:t xml:space="preserve">Early weekly record-keeping was weaker than the later checking process.</w:t>
       </w:r>
     </w:p>
     <w:p>
@@ -10539,7 +10513,7 @@
           <w:spacing w:val="0"/>
           <w:color w:val="0E121D"/>
         </w:rPr>
-        <w:t xml:space="preserve">AI-supported implementation and drafting require precise disclosure and candidate verification.</w:t>
+        <w:t xml:space="preserve">Any AI-supported work and writing must be disclosed accurately and checked by the candidate.</w:t>
       </w:r>
     </w:p>
     <w:p>
@@ -11326,7 +11300,7 @@
           <w:spacing w:val="0"/>
           <w:color w:val="0E121D"/>
         </w:rPr>
-        <w:t xml:space="preserve">How the question narrowed from a broad machine-learning comparison to Bitcoin volatility forecasting.</w:t>
+        <w:t xml:space="preserve">How I narrowed the question to Bitcoin volatility forecasting.</w:t>
       </w:r>
     </w:p>
     <w:p>
@@ -11354,7 +11328,7 @@
           <w:spacing w:val="0"/>
           <w:color w:val="0E121D"/>
         </w:rPr>
-        <w:t xml:space="preserve">Why the data source changed to Hyperliquid BTC perpetual-futures candles.</w:t>
+        <w:t xml:space="preserve">Why I changed the data source to Hyperliquid.</w:t>
       </w:r>
     </w:p>
     <w:p>
@@ -11382,7 +11356,7 @@
           <w:spacing w:val="0"/>
           <w:color w:val="0E121D"/>
         </w:rPr>
-        <w:t xml:space="preserve">How log returns and rolling realised-volatility targets were constructed.</w:t>
+        <w:t xml:space="preserve">How I prepared the daily data and decided what to measure.</w:t>
       </w:r>
     </w:p>
     <w:p>
@@ -11410,7 +11384,7 @@
           <w:spacing w:val="0"/>
           <w:color w:val="0E121D"/>
         </w:rPr>
-        <w:t xml:space="preserve">Why a chronological holdout and expanding-window checks were used.</w:t>
+        <w:t xml:space="preserve">Why I kept the data in date order for a fair comparison.</w:t>
       </w:r>
     </w:p>
     <w:p>
@@ -11438,7 +11412,7 @@
           <w:spacing w:val="0"/>
           <w:color w:val="0E121D"/>
         </w:rPr>
-        <w:t xml:space="preserve">How date alignment, likelihood order, sample-variance conversion, scaling and incomplete-candle audits improved the evidence.</w:t>
+        <w:t xml:space="preserve">How checking the dates, calculations and unfinished daily record changed the project.</w:t>
       </w:r>
     </w:p>
     <w:p>
@@ -11466,7 +11440,7 @@
           <w:spacing w:val="0"/>
           <w:color w:val="0E121D"/>
         </w:rPr>
-        <w:t xml:space="preserve">How source evaluation, code outputs and limitations informed the final judgment.</w:t>
+        <w:t xml:space="preserve">How the research, results and limitations led to the final judgement.</w:t>
       </w:r>
     </w:p>
     <w:p>
@@ -11497,7 +11471,7 @@
           <w:spacing w:val="0"/>
           <w:color w:val="0E121D"/>
         </w:rPr>
-        <w:t xml:space="preserve">The presentation will insert the final synchronised values:</w:t>
+        <w:t xml:space="preserve">The presentation will use the final checked values:</w:t>
       </w:r>
     </w:p>
     <w:p>
@@ -11571,7 +11545,7 @@
           <w:spacing w:val="0"/>
           <w:color w:val="0E121D"/>
         </w:rPr>
-        <w:t xml:space="preserve">Best primary 30-day RMSE model</w:t>
+        <w:t xml:space="preserve">Best result in the main comparison</w:t>
       </w:r>
     </w:p>
     <w:p>
@@ -11610,7 +11584,7 @@
           <w:spacing w:val="0"/>
           <w:color w:val="0E121D"/>
         </w:rPr>
-        <w:t xml:space="preserve">GARCH primary RMSE</w:t>
+        <w:t xml:space="preserve">Best main error figure</w:t>
       </w:r>
     </w:p>
     <w:p>
@@ -11649,7 +11623,7 @@
           <w:spacing w:val="0"/>
           <w:color w:val="0E121D"/>
         </w:rPr>
-        <w:t xml:space="preserve">Rolling benchmark RMSE</w:t>
+        <w:t xml:space="preserve">Simple rolling comparison</w:t>
       </w:r>
     </w:p>
     <w:p>
@@ -11688,20 +11662,20 @@
           <w:spacing w:val="0"/>
           <w:color w:val="0E121D"/>
         </w:rPr>
-        <w:t xml:space="preserve">Alternative-window conclusion</w:t>
-      </w:r>
-    </w:p>
-    <w:p>
-      <w:pPr/>
-      <w:r>
-        <w:rPr>
-          <w:rFonts w:ascii="Arial" w:hAnsi="Arial" w:cs="Arial"/>
-          <w:sz w:val="23"/>
-          <w:sz-cs w:val="23"/>
-          <w:spacing w:val="0"/>
-          <w:color w:val="0E121D"/>
-        </w:rPr>
-        <w:t xml:space="preserve">GARCH ranks first for the 14-day target with RMSE 0.00178208, 35.482% below rolling.</w:t>
+        <w:t xml:space="preserve">Result with a shorter measurement period</w:t>
+      </w:r>
+    </w:p>
+    <w:p>
+      <w:pPr/>
+      <w:r>
+        <w:rPr>
+          <w:rFonts w:ascii="Arial" w:hAnsi="Arial" w:cs="Arial"/>
+          <w:sz w:val="23"/>
+          <w:sz-cs w:val="23"/>
+          <w:spacing w:val="0"/>
+          <w:color w:val="0E121D"/>
+        </w:rPr>
+        <w:t xml:space="preserve">The same method remained first, with an error of 0.00178208.</w:t>
       </w:r>
     </w:p>
     <w:p>
@@ -11727,20 +11701,20 @@
           <w:spacing w:val="0"/>
           <w:color w:val="0E121D"/>
         </w:rPr>
-        <w:t xml:space="preserve">Expanding-window conclusion</w:t>
-      </w:r>
-    </w:p>
-    <w:p>
-      <w:pPr/>
-      <w:r>
-        <w:rPr>
-          <w:rFonts w:ascii="Arial" w:hAnsi="Arial" w:cs="Arial"/>
-          <w:sz w:val="23"/>
-          <w:sz-cs w:val="23"/>
-          <w:spacing w:val="0"/>
-          <w:color w:val="0E121D"/>
-        </w:rPr>
-        <w:t xml:space="preserve">GARCH ranks first overall with RMSE 0.00098681 and ranks first in each of the four chronological folds.</w:t>
+        <w:t xml:space="preserve">Result when the comparison was repeated through time</w:t>
+      </w:r>
+    </w:p>
+    <w:p>
+      <w:pPr/>
+      <w:r>
+        <w:rPr>
+          <w:rFonts w:ascii="Arial" w:hAnsi="Arial" w:cs="Arial"/>
+          <w:sz w:val="23"/>
+          <w:sz-cs w:val="23"/>
+          <w:spacing w:val="0"/>
+          <w:color w:val="0E121D"/>
+        </w:rPr>
+        <w:t xml:space="preserve">The same method ranked first overall and in each of the four sections.</w:t>
       </w:r>
     </w:p>
     <w:p>
@@ -11766,20 +11740,20 @@
           <w:spacing w:val="0"/>
           <w:color w:val="0E121D"/>
         </w:rPr>
-        <w:t xml:space="preserve">Machine-learning conclusion</w:t>
-      </w:r>
-    </w:p>
-    <w:p>
-      <w:pPr/>
-      <w:r>
-        <w:rPr>
-          <w:rFonts w:ascii="Arial" w:hAnsi="Arial" w:cs="Arial"/>
-          <w:sz w:val="23"/>
-          <w:sz-cs w:val="23"/>
-          <w:spacing w:val="0"/>
-          <w:color w:val="0E121D"/>
-        </w:rPr>
-        <w:t xml:space="preserve">Neither machine-learning model beats rolling: LSTM ranks fourth and Random Forest fifth on primary RMSE.</w:t>
+        <w:t xml:space="preserve">Machine-learning result</w:t>
+      </w:r>
+    </w:p>
+    <w:p>
+      <w:pPr/>
+      <w:r>
+        <w:rPr>
+          <w:rFonts w:ascii="Arial" w:hAnsi="Arial" w:cs="Arial"/>
+          <w:sz w:val="23"/>
+          <w:sz-cs w:val="23"/>
+          <w:spacing w:val="0"/>
+          <w:color w:val="0E121D"/>
+        </w:rPr>
+        <w:t xml:space="preserve">Neither machine-learning method beat the simple rolling comparison.</w:t>
       </w:r>
     </w:p>
     <w:p>
@@ -11794,7 +11768,7 @@
           <w:spacing w:val="0"/>
           <w:color w:val="0E121D"/>
         </w:rPr>
-        <w:t xml:space="preserve">The intended conclusion is bounded: the tested machine-learning models do not justify their additional complexity under this daily-data design; this is not a claim about every Bitcoin market or every machine-learning method.</w:t>
+        <w:t xml:space="preserve">My conclusion will be careful: in this project, the tested machine-learning methods did not improve the result enough to justify their extra complexity. This does not prove that the same answer applies to every Bitcoin market or every machine-learning method.</w:t>
       </w:r>
     </w:p>
     <w:p>
@@ -13147,7 +13121,7 @@
           <w:spacing w:val="0"/>
           <w:color w:val="0E121D"/>
         </w:rPr>
-        <w:t xml:space="preserve">This project taught me that the quality of a forecast comparison depends first on the definition of the question and target. I learned to distinguish latent volatility from an observable rolling proxy, to calculate log returns, and to understand why volatility clustering motivates GARCH. I also learned that a persistent target can make simple models strong. A complicated model does not begin with an automatic advantage, and a small numerical difference is not meaningful unless the validation design and uncertainty support it.</w:t>
+        <w:t xml:space="preserve">This project taught me that a comparison depends first on asking a clear question and defining exactly what will be measured. I learned how daily Bitcoin price changes can be used to estimate volatility and why a simple method can sometimes perform very well. I also learned that a complicated method does not automatically have an advantage and that a small difference in a result only matters if the comparison itself is fair.</w:t>
       </w:r>
       <w:r>
         <w:rPr>
@@ -13203,7 +13177,7 @@
           <w:spacing w:val="0"/>
           <w:color w:val="0E121D"/>
         </w:rPr>
-        <w:t xml:space="preserve">My most important methodological lesson was that reproducible code can still be conceptually wrong. Saving a script is not enough if a prediction is aligned to the wrong date, if the current shock leaks into its own conditional variance, if a sample-variance conversion ignores the moving sample mean, if validation information influences scaling, or if an unfinished candle enters the data. The audit changed the strength of the evidence and made me more cautious about accepting the first output. I learned to use explicit dates, failure checks, unit tests, metadata and saved predictions as part of the argument rather than treating code as a hidden calculation.</w:t>
+        <w:t xml:space="preserve">My most important lesson was that a saved and repeatable process can still contain a mistake. Dates may be matched incorrectly, later information may enter an earlier stage or an unfinished day may be included. I therefore learned to check the meaning and timing of the data, repeat the work after corrections and keep the earlier change visible. Saved results, dates and simple checks became part of the evidence rather than background computer work.</w:t>
       </w:r>
       <w:r>
         <w:rPr>
@@ -13257,7 +13231,7 @@
           <w:spacing w:val="0"/>
           <w:color w:val="0E121D"/>
         </w:rPr>
-        <w:t xml:space="preserve">The project developed a focused and answerable research question.</w:t>
+        <w:t xml:space="preserve">The project developed a focused and answerable question.</w:t>
       </w:r>
     </w:p>
     <w:p>
@@ -13285,7 +13259,7 @@
           <w:spacing w:val="0"/>
           <w:color w:val="0E121D"/>
         </w:rPr>
-        <w:t xml:space="preserve">It compared transparent baselines with two different machine-learning approaches.</w:t>
+        <w:t xml:space="preserve">It compared clear reference methods with two different machine-learning methods.</w:t>
       </w:r>
     </w:p>
     <w:p>
@@ -13313,7 +13287,7 @@
           <w:spacing w:val="0"/>
           <w:color w:val="0E121D"/>
         </w:rPr>
-        <w:t xml:space="preserve">It retained an audit trail and reported method changes that affected the result.</w:t>
+        <w:t xml:space="preserve">It kept a record of important changes that affected the result.</w:t>
       </w:r>
     </w:p>
     <w:p>
@@ -13341,7 +13315,7 @@
           <w:spacing w:val="0"/>
           <w:color w:val="0E121D"/>
         </w:rPr>
-        <w:t xml:space="preserve">It combined numerical accuracy with interpretability, practicality and robustness.</w:t>
+        <w:t xml:space="preserve">It considered clarity and practicality as well as numerical accuracy.</w:t>
       </w:r>
     </w:p>
     <w:p>
@@ -13369,7 +13343,7 @@
           <w:spacing w:val="0"/>
           <w:color w:val="0E121D"/>
         </w:rPr>
-        <w:t xml:space="preserve">It produced reusable code, datasets, tables, diagnostics and presentation preparation rather than only a narrative report.</w:t>
+        <w:t xml:space="preserve">It produced a report, saved data, result tables, checking records and presentation material.</w:t>
       </w:r>
     </w:p>
     <w:p>
@@ -13413,7 +13387,7 @@
           <w:spacing w:val="0"/>
           <w:color w:val="0E121D"/>
         </w:rPr>
-        <w:t xml:space="preserve">Early project administration was not recorded consistently, so some process history is reconstructed from Git and generated files.</w:t>
+        <w:t xml:space="preserve">Early project activity was not recorded consistently, so some weeks had to be reconstructed from saved evidence.</w:t>
       </w:r>
     </w:p>
     <w:p>
@@ -13441,7 +13415,7 @@
           <w:spacing w:val="0"/>
           <w:color w:val="0E121D"/>
         </w:rPr>
-        <w:t xml:space="preserve">The target is based on daily data and overlapping rolling windows rather than intraday realised variance.</w:t>
+        <w:t xml:space="preserve">The project uses daily data and an estimated measure of volatility.</w:t>
       </w:r>
     </w:p>
     <w:p>
@@ -13469,7 +13443,7 @@
           <w:spacing w:val="0"/>
           <w:color w:val="0E121D"/>
         </w:rPr>
-        <w:t xml:space="preserve">The project studies one market and a modest set of implementations.</w:t>
+        <w:t xml:space="preserve">It studies one market and a limited group of methods.</w:t>
       </w:r>
     </w:p>
     <w:p>
@@ -13497,7 +13471,7 @@
           <w:spacing w:val="0"/>
           <w:color w:val="0E121D"/>
         </w:rPr>
-        <w:t xml:space="preserve">Machine-learning tuning is limited, particularly for the LSTM.</w:t>
+        <w:t xml:space="preserve">There was not enough time or data to try every possible setting for the machine-learning methods.</w:t>
       </w:r>
     </w:p>
     <w:p>
@@ -13525,7 +13499,7 @@
           <w:spacing w:val="0"/>
           <w:color w:val="0E121D"/>
         </w:rPr>
-        <w:t xml:space="preserve">Extensive AI assistance means that the candidate must be especially precise about personal decisions, verification and understanding.</w:t>
+        <w:t xml:space="preserve">Extensive AI assistance means that my own decisions, checks and understanding must be stated especially carefully.</w:t>
       </w:r>
     </w:p>
     <w:p>
@@ -13571,7 +13545,7 @@
           <w:spacing w:val="0"/>
           <w:color w:val="0E121D"/>
         </w:rPr>
-        <w:t xml:space="preserve">I developed skills in narrowing a research question, evaluating sources, designing chronological validation, interpreting statistical and machine-learning models, checking data quality, reading generated evidence critically, organising a repository and communicating a bounded conclusion. I also improved my understanding of why model comparison must separate predictive accuracy from interpretability and computational cost. I will identify which of these skills I personally demonstrated and provide examples before signing the final log.</w:t>
+        <w:t xml:space="preserve">I developed skills in narrowing a question, evaluating sources, organising a longer project, checking data quality, comparing results fairly and explaining a cautious conclusion. I also became better at reading computer-generated results critically rather than accepting the first output. Before signing the final log, I will identify the examples that I personally completed and can explain.</w:t>
       </w:r>
       <w:r>
         <w:rPr>
@@ -13870,7 +13844,7 @@
           <w:spacing w:val="0"/>
           <w:color w:val="0E121D"/>
         </w:rPr>
-        <w:t xml:space="preserve">If I repeated the project, I would write the evaluation protocol before fitting models, keep a contemporaneous activity log from the first day, preserve an untouched future test period, use higher-frequency data to estimate realised variance, and specify model-tuning limits in advance. I would also agree an AI-use record with the supervisor at the start and record which outputs I personally checked. Only after the core BTC workflow was stable would I add another exchange, asset or richer information such as sentiment.</w:t>
+        <w:t xml:space="preserve">If I repeated the project, I would write down the comparison rules before producing results, keep a short activity note after every work session and reserve a final set of data that remained untouched until the end. I would also agree how AI use should be recorded from the start and note exactly which results I checked myself. Only after the main Bitcoin comparison was stable would I consider adding another market or another type of information.</w:t>
       </w:r>
       <w:r>
         <w:rPr>
@@ -13926,7 +13900,7 @@
           <w:spacing w:val="0"/>
           <w:color w:val="0E121D"/>
         </w:rPr>
-        <w:t xml:space="preserve">Start with a strong baseline, define the target before choosing an advanced model, keep raw evidence, separate forecast-origin and target dates, and let the result contradict the original expectation. Record changes when they happen rather than reconstructing them later. Treat an AI-generated or software-generated output as something to verify and explain, not as evidence of understanding by itself.</w:t>
+        <w:t xml:space="preserve">Begin with a clear question and a simple comparison. Define what you are measuring before choosing a more advanced method, keep the original evidence and record changes when they happen. If a computer or AI produces an answer, check that you understand the data, dates and meaning of the result before using it in the report.</w:t>
       </w:r>
       <w:r>
         <w:rPr>
@@ -14373,72 +14347,20 @@
           <w:spacing w:val="0"/>
           <w:color w:val="0E121D"/>
         </w:rPr>
-        <w:t xml:space="preserve">Git-verified</w:t>
-      </w:r>
-    </w:p>
-    <w:p>
-      <w:pPr/>
-      <w:r>
-        <w:rPr>
-          <w:rFonts w:ascii="Arial" w:hAnsi="Arial" w:cs="Arial"/>
-          <w:sz w:val="23"/>
-          <w:sz-cs w:val="23"/>
-          <w:spacing w:val="0"/>
-          <w:color w:val="0E121D"/>
-        </w:rPr>
-        <w:t xml:space="preserve">Project structure and initial folders were created in commit 8aee51f.</w:t>
-      </w:r>
-    </w:p>
-    <w:p>
-      <w:pPr/>
-      <w:r>
-        <w:rPr>
-          <w:rFonts w:ascii="Arial" w:hAnsi="Arial" w:cs="Arial"/>
-          <w:sz w:val="23"/>
-          <w:sz-cs w:val="23"/>
-          <w:spacing w:val="0"/>
-          <w:color w:val="0E121D"/>
-        </w:rPr>
-        <w:t xml:space="preserve">PL-15.01-B</w:t>
-      </w:r>
-    </w:p>
-    <w:p>
-      <w:pPr/>
-      <w:r>
-        <w:rPr>
-          <w:rFonts w:ascii="Arial" w:hAnsi="Arial" w:cs="Arial"/>
-          <w:sz w:val="23"/>
-          <w:sz-cs w:val="23"/>
-          <w:spacing w:val="0"/>
-          <w:color w:val="0E121D"/>
-        </w:rPr>
-        <w:t xml:space="preserve">2026-06-14 to 2026-06-16</w:t>
-      </w:r>
-    </w:p>
-    <w:p>
-      <w:pPr/>
-      <w:r>
-        <w:rPr>
-          <w:rFonts w:ascii="Arial" w:hAnsi="Arial" w:cs="Arial"/>
-          <w:sz w:val="23"/>
-          <w:sz-cs w:val="23"/>
-          <w:spacing w:val="0"/>
-          <w:color w:val="0E121D"/>
-        </w:rPr>
-        <w:t xml:space="preserve">No direct repository evidence</w:t>
-      </w:r>
-    </w:p>
-    <w:p>
-      <w:pPr/>
-      <w:r>
-        <w:rPr>
-          <w:rFonts w:ascii="Arial" w:hAnsi="Arial" w:cs="Arial"/>
-          <w:sz w:val="23"/>
-          <w:sz-cs w:val="23"/>
-          <w:spacing w:val="0"/>
-          <w:color w:val="0E121D"/>
-        </w:rPr>
-        <w:t xml:space="preserve">No separate dated activity is claimed for this interval.</w:t>
+        <w:t xml:space="preserve">Confirmed by Git</w:t>
+      </w:r>
+    </w:p>
+    <w:p>
+      <w:pPr/>
+      <w:r>
+        <w:rPr>
+          <w:rFonts w:ascii="Arial" w:hAnsi="Arial" w:cs="Arial"/>
+          <w:sz w:val="23"/>
+          <w:sz-cs w:val="23"/>
+          <w:spacing w:val="0"/>
+          <w:color w:val="0E121D"/>
+        </w:rPr>
+        <w:t xml:space="preserve">Project folders and the first planning structure were created in commit 8aee51f.</w:t>
       </w:r>
     </w:p>
     <w:p>
@@ -14477,72 +14399,20 @@
           <w:spacing w:val="0"/>
           <w:color w:val="0E121D"/>
         </w:rPr>
-        <w:t xml:space="preserve">Git-verified</w:t>
-      </w:r>
-    </w:p>
-    <w:p>
-      <w:pPr/>
-      <w:r>
-        <w:rPr>
-          <w:rFonts w:ascii="Arial" w:hAnsi="Arial" w:cs="Arial"/>
-          <w:sz w:val="23"/>
-          <w:sz-cs w:val="23"/>
-          <w:spacing w:val="0"/>
-          <w:color w:val="0E121D"/>
-        </w:rPr>
-        <w:t xml:space="preserve">The question and production-log drafts were developed, sources were recorded, the planned data source changed to Hyperliquid, and first model outputs were added in commits 155ce90, 595d119 and b4a3cf6.</w:t>
-      </w:r>
-    </w:p>
-    <w:p>
-      <w:pPr/>
-      <w:r>
-        <w:rPr>
-          <w:rFonts w:ascii="Arial" w:hAnsi="Arial" w:cs="Arial"/>
-          <w:sz w:val="23"/>
-          <w:sz-cs w:val="23"/>
-          <w:spacing w:val="0"/>
-          <w:color w:val="0E121D"/>
-        </w:rPr>
-        <w:t xml:space="preserve">PL-15.01-D</w:t>
-      </w:r>
-    </w:p>
-    <w:p>
-      <w:pPr/>
-      <w:r>
-        <w:rPr>
-          <w:rFonts w:ascii="Arial" w:hAnsi="Arial" w:cs="Arial"/>
-          <w:sz w:val="23"/>
-          <w:sz-cs w:val="23"/>
-          <w:spacing w:val="0"/>
-          <w:color w:val="0E121D"/>
-        </w:rPr>
-        <w:t xml:space="preserve">2026-06-18 to 2026-07-08</w:t>
-      </w:r>
-    </w:p>
-    <w:p>
-      <w:pPr/>
-      <w:r>
-        <w:rPr>
-          <w:rFonts w:ascii="Arial" w:hAnsi="Arial" w:cs="Arial"/>
-          <w:sz w:val="23"/>
-          <w:sz-cs w:val="23"/>
-          <w:spacing w:val="0"/>
-          <w:color w:val="0E121D"/>
-        </w:rPr>
-        <w:t xml:space="preserve">Sparse evidence</w:t>
-      </w:r>
-    </w:p>
-    <w:p>
-      <w:pPr/>
-      <w:r>
-        <w:rPr>
-          <w:rFonts w:ascii="Arial" w:hAnsi="Arial" w:cs="Arial"/>
-          <w:sz w:val="23"/>
-          <w:sz-cs w:val="23"/>
-          <w:spacing w:val="0"/>
-          <w:color w:val="0E121D"/>
-        </w:rPr>
-        <w:t xml:space="preserve">The timetable contains targets, but it does not prove completion on those dates. No detailed daily activity is reconstructed.</w:t>
+        <w:t xml:space="preserve">Confirmed by Git</w:t>
+      </w:r>
+    </w:p>
+    <w:p>
+      <w:pPr/>
+      <w:r>
+        <w:rPr>
+          <w:rFonts w:ascii="Arial" w:hAnsi="Arial" w:cs="Arial"/>
+          <w:sz w:val="23"/>
+          <w:sz-cs w:val="23"/>
+          <w:spacing w:val="0"/>
+          <w:color w:val="0E121D"/>
+        </w:rPr>
+        <w:t xml:space="preserve">The question and planning drafts were developed, sources were recorded, the data source changed and the first results were added.</w:t>
       </w:r>
     </w:p>
     <w:p>
@@ -14581,20 +14451,20 @@
           <w:spacing w:val="0"/>
           <w:color w:val="0E121D"/>
         </w:rPr>
-        <w:t xml:space="preserve">Generated metadata and workspace evidence</w:t>
-      </w:r>
-    </w:p>
-    <w:p>
-      <w:pPr/>
-      <w:r>
-        <w:rPr>
-          <w:rFonts w:ascii="Arial" w:hAnsi="Arial" w:cs="Arial"/>
-          <w:sz w:val="23"/>
-          <w:sz-cs w:val="23"/>
-          <w:spacing w:val="0"/>
-          <w:color w:val="0E121D"/>
-        </w:rPr>
-        <w:t xml:space="preserve">Data and outputs were refreshed and report/status materials were expanded. These entries are supported by saved files rather than a dedicated Git commit.</w:t>
+        <w:t xml:space="preserve">Saved files and workspace evidence</w:t>
+      </w:r>
+    </w:p>
+    <w:p>
+      <w:pPr/>
+      <w:r>
+        <w:rPr>
+          <w:rFonts w:ascii="Arial" w:hAnsi="Arial" w:cs="Arial"/>
+          <w:sz w:val="23"/>
+          <w:sz-cs w:val="23"/>
+          <w:spacing w:val="0"/>
+          <w:color w:val="0E121D"/>
+        </w:rPr>
+        <w:t xml:space="preserve">Data and results were refreshed and the report and status material were expanded.</w:t>
       </w:r>
     </w:p>
     <w:p>
@@ -14633,20 +14503,20 @@
           <w:spacing w:val="0"/>
           <w:color w:val="0E121D"/>
         </w:rPr>
-        <w:t xml:space="preserve">Superseded generated output</w:t>
-      </w:r>
-    </w:p>
-    <w:p>
-      <w:pPr/>
-      <w:r>
-        <w:rPr>
-          <w:rFonts w:ascii="Arial" w:hAnsi="Arial" w:cs="Arial"/>
-          <w:sz w:val="23"/>
-          <w:sz-cs w:val="23"/>
-          <w:spacing w:val="0"/>
-          <w:color w:val="0E121D"/>
-        </w:rPr>
-        <w:t xml:space="preserve">A refresh included a daily candle that a later audit identified as still open at fetch time; the completion-aware fetch replaced it.</w:t>
+        <w:t xml:space="preserve">Earlier saved result</w:t>
+      </w:r>
+    </w:p>
+    <w:p>
+      <w:pPr/>
+      <w:r>
+        <w:rPr>
+          <w:rFonts w:ascii="Arial" w:hAnsi="Arial" w:cs="Arial"/>
+          <w:sz w:val="23"/>
+          <w:sz-cs w:val="23"/>
+          <w:spacing w:val="0"/>
+          <w:color w:val="0E121D"/>
+        </w:rPr>
+        <w:t xml:space="preserve">A later check found that the newest daily record had not yet finished and replaced it with a completion-aware refresh.</w:t>
       </w:r>
     </w:p>
     <w:p>
@@ -14685,20 +14555,20 @@
           <w:spacing w:val="0"/>
           <w:color w:val="0E121D"/>
         </w:rPr>
-        <w:t xml:space="preserve">Git-verified</w:t>
-      </w:r>
-    </w:p>
-    <w:p>
-      <w:pPr/>
-      <w:r>
-        <w:rPr>
-          <w:rFonts w:ascii="Arial" w:hAnsi="Arial" w:cs="Arial"/>
-          <w:sz w:val="23"/>
-          <w:sz-cs w:val="23"/>
-          <w:spacing w:val="0"/>
-          <w:color w:val="0E121D"/>
-        </w:rPr>
-        <w:t xml:space="preserve">LSTM implementation, package refactoring, date-alignment correction and expanded evaluation were recorded in commits f7d20bf, f0ab18a, af458e7 and 8c98f36.</w:t>
+        <w:t xml:space="preserve">Confirmed by Git</w:t>
+      </w:r>
+    </w:p>
+    <w:p>
+      <w:pPr/>
+      <w:r>
+        <w:rPr>
+          <w:rFonts w:ascii="Arial" w:hAnsi="Arial" w:cs="Arial"/>
+          <w:sz w:val="23"/>
+          <w:sz-cs w:val="23"/>
+          <w:spacing w:val="0"/>
+          <w:color w:val="0E121D"/>
+        </w:rPr>
+        <w:t xml:space="preserve">The planned methods were completed, files were reorganised, date matching was corrected and the comparison was expanded.</w:t>
       </w:r>
     </w:p>
     <w:p>
@@ -14737,72 +14607,20 @@
           <w:spacing w:val="0"/>
           <w:color w:val="0E121D"/>
         </w:rPr>
-        <w:t xml:space="preserve">Generated outputs and workspace evidence</w:t>
-      </w:r>
-    </w:p>
-    <w:p>
-      <w:pPr/>
-      <w:r>
-        <w:rPr>
-          <w:rFonts w:ascii="Arial" w:hAnsi="Arial" w:cs="Arial"/>
-          <w:sz w:val="23"/>
-          <w:sz-cs w:val="23"/>
-          <w:spacing w:val="0"/>
-          <w:color w:val="0E121D"/>
-        </w:rPr>
-        <w:t xml:space="preserve">Likelihood order, rolling-target conversion, scaler scope and completed-candle handling were audited; data-quality, expanding-window, regime, bootstrap, OOB, permutation and multi-seed evidence was generated.</w:t>
-      </w:r>
-    </w:p>
-    <w:p>
-      <w:pPr/>
-      <w:r>
-        <w:rPr>
-          <w:rFonts w:ascii="Arial" w:hAnsi="Arial" w:cs="Arial"/>
-          <w:sz w:val="23"/>
-          <w:sz-cs w:val="23"/>
-          <w:spacing w:val="0"/>
-          <w:color w:val="0E121D"/>
-        </w:rPr>
-        <w:t xml:space="preserve">PL-15.01-I</w:t>
-      </w:r>
-    </w:p>
-    <w:p>
-      <w:pPr/>
-      <w:r>
-        <w:rPr>
-          <w:rFonts w:ascii="Arial" w:hAnsi="Arial" w:cs="Arial"/>
-          <w:sz w:val="23"/>
-          <w:sz-cs w:val="23"/>
-          <w:spacing w:val="0"/>
-          <w:color w:val="0E121D"/>
-        </w:rPr>
-        <w:t xml:space="preserve">2026-07-15 to 2026-07-19</w:t>
-      </w:r>
-    </w:p>
-    <w:p>
-      <w:pPr/>
-      <w:r>
-        <w:rPr>
-          <w:rFonts w:ascii="Arial" w:hAnsi="Arial" w:cs="Arial"/>
-          <w:sz w:val="23"/>
-          <w:sz-cs w:val="23"/>
-          <w:spacing w:val="0"/>
-          <w:color w:val="0E121D"/>
-        </w:rPr>
-        <w:t xml:space="preserve">No separate direct evidence preserved</w:t>
-      </w:r>
-    </w:p>
-    <w:p>
-      <w:pPr/>
-      <w:r>
-        <w:rPr>
-          <w:rFonts w:ascii="Arial" w:hAnsi="Arial" w:cs="Arial"/>
-          <w:sz w:val="23"/>
-          <w:sz-cs w:val="23"/>
-          <w:spacing w:val="0"/>
-          <w:color w:val="0E121D"/>
-        </w:rPr>
-        <w:t xml:space="preserve">No specific activity is asserted for this interval.</w:t>
+        <w:t xml:space="preserve">Saved results and workspace evidence</w:t>
+      </w:r>
+    </w:p>
+    <w:p>
+      <w:pPr/>
+      <w:r>
+        <w:rPr>
+          <w:rFonts w:ascii="Arial" w:hAnsi="Arial" w:cs="Arial"/>
+          <w:sz w:val="23"/>
+          <w:sz-cs w:val="23"/>
+          <w:spacing w:val="0"/>
+          <w:color w:val="0E121D"/>
+        </w:rPr>
+        <w:t xml:space="preserve">Important calculation and data checks were completed, followed by several repeated comparisons.</w:t>
       </w:r>
     </w:p>
     <w:p>
@@ -14841,20 +14659,20 @@
           <w:spacing w:val="0"/>
           <w:color w:val="0E121D"/>
         </w:rPr>
-        <w:t xml:space="preserve">Final generated metadata and test run</w:t>
-      </w:r>
-    </w:p>
-    <w:p>
-      <w:pPr/>
-      <w:r>
-        <w:rPr>
-          <w:rFonts w:ascii="Arial" w:hAnsi="Arial" w:cs="Arial"/>
-          <w:sz w:val="23"/>
-          <w:sz-cs w:val="23"/>
-          <w:spacing w:val="0"/>
-          <w:color w:val="0E121D"/>
-        </w:rPr>
-        <w:t xml:space="preserve">The data and complete pipeline were refreshed again. The API returned 1,241 rows; one incomplete row was excluded; 1,240 completed candles were retained through 2026-07-19; 39 tests passed.</w:t>
+        <w:t xml:space="preserve">Final saved data and checking run</w:t>
+      </w:r>
+    </w:p>
+    <w:p>
+      <w:pPr/>
+      <w:r>
+        <w:rPr>
+          <w:rFonts w:ascii="Arial" w:hAnsi="Arial" w:cs="Arial"/>
+          <w:sz w:val="23"/>
+          <w:sz-cs w:val="23"/>
+          <w:spacing w:val="0"/>
+          <w:color w:val="0E121D"/>
+        </w:rPr>
+        <w:t xml:space="preserve">The project was refreshed again; one unfinished day was removed, 1,240 complete days were kept and 39 checks passed.</w:t>
       </w:r>
     </w:p>
     <w:p>
@@ -15643,7 +15461,7 @@
           <w:spacing w:val="0"/>
           <w:color w:val="1B3C5D"/>
         </w:rPr>
-        <w:t xml:space="preserve">PL-16.02 Research, technical and product evidence</w:t>
+        <w:t xml:space="preserve">PL-16.02 Research, project and product evidence</w:t>
       </w:r>
     </w:p>
     <w:p>
@@ -15746,7 +15564,7 @@
           <w:spacing w:val="0"/>
           <w:color w:val="0E121D"/>
         </w:rPr>
-        <w:t xml:space="preserve">Academic evidence and critical notes</w:t>
+        <w:t xml:space="preserve">Reading and critical notes</w:t>
       </w:r>
     </w:p>
     <w:p>
@@ -15863,7 +15681,7 @@
           <w:spacing w:val="0"/>
           <w:color w:val="0E121D"/>
         </w:rPr>
-        <w:t xml:space="preserve">Candidate should verify identity, content and submission relevance</w:t>
+        <w:t xml:space="preserve">Candidate should verify identity, content and relevance</w:t>
       </w:r>
     </w:p>
     <w:p>
@@ -15902,20 +15720,20 @@
           <w:spacing w:val="0"/>
           <w:color w:val="0E121D"/>
         </w:rPr>
-        <w:t xml:space="preserve">Archived data and target construction</w:t>
-      </w:r>
-    </w:p>
-    <w:p>
-      <w:pPr/>
-      <w:r>
-        <w:rPr>
-          <w:rFonts w:ascii="Arial" w:hAnsi="Arial" w:cs="Arial"/>
-          <w:sz w:val="23"/>
-          <w:sz-cs w:val="23"/>
-          <w:spacing w:val="0"/>
-          <w:color w:val="0E121D"/>
-        </w:rPr>
-        <w:t xml:space="preserve">Generated evidence</w:t>
+        <w:t xml:space="preserve">Original and prepared data</w:t>
+      </w:r>
+    </w:p>
+    <w:p>
+      <w:pPr/>
+      <w:r>
+        <w:rPr>
+          <w:rFonts w:ascii="Arial" w:hAnsi="Arial" w:cs="Arial"/>
+          <w:sz w:val="23"/>
+          <w:sz-cs w:val="23"/>
+          <w:spacing w:val="0"/>
+          <w:color w:val="0E121D"/>
+        </w:rPr>
+        <w:t xml:space="preserve">Saved project evidence</w:t>
       </w:r>
     </w:p>
     <w:p>
@@ -15941,20 +15759,20 @@
           <w:spacing w:val="0"/>
           <w:color w:val="0E121D"/>
         </w:rPr>
-        <w:t xml:space="preserve">code/epq_pipeline and code/tests</w:t>
-      </w:r>
-    </w:p>
-    <w:p>
-      <w:pPr/>
-      <w:r>
-        <w:rPr>
-          <w:rFonts w:ascii="Arial" w:hAnsi="Arial" w:cs="Arial"/>
-          <w:sz w:val="23"/>
-          <w:sz-cs w:val="23"/>
-          <w:spacing w:val="0"/>
-          <w:color w:val="0E121D"/>
-        </w:rPr>
-        <w:t xml:space="preserve">Reproducible implementation and tests</w:t>
+        <w:t xml:space="preserve">code folder and test folder</w:t>
+      </w:r>
+    </w:p>
+    <w:p>
+      <w:pPr/>
+      <w:r>
+        <w:rPr>
+          <w:rFonts w:ascii="Arial" w:hAnsi="Arial" w:cs="Arial"/>
+          <w:sz w:val="23"/>
+          <w:sz-cs w:val="23"/>
+          <w:spacing w:val="0"/>
+          <w:color w:val="0E121D"/>
+        </w:rPr>
+        <w:t xml:space="preserve">Repeatable comparison work and checks</w:t>
       </w:r>
     </w:p>
     <w:p>
@@ -16006,20 +15824,20 @@
           <w:spacing w:val="0"/>
           <w:color w:val="0E121D"/>
         </w:rPr>
-        <w:t xml:space="preserve">Run design, sample and timestamps</w:t>
-      </w:r>
-    </w:p>
-    <w:p>
-      <w:pPr/>
-      <w:r>
-        <w:rPr>
-          <w:rFonts w:ascii="Arial" w:hAnsi="Arial" w:cs="Arial"/>
-          <w:sz w:val="23"/>
-          <w:sz-cs w:val="23"/>
-          <w:spacing w:val="0"/>
-          <w:color w:val="0E121D"/>
-        </w:rPr>
-        <w:t xml:space="preserve">Canonical generated run metadata</w:t>
+        <w:t xml:space="preserve">Dates and overall run record</w:t>
+      </w:r>
+    </w:p>
+    <w:p>
+      <w:pPr/>
+      <w:r>
+        <w:rPr>
+          <w:rFonts w:ascii="Arial" w:hAnsi="Arial" w:cs="Arial"/>
+          <w:sz w:val="23"/>
+          <w:sz-cs w:val="23"/>
+          <w:spacing w:val="0"/>
+          <w:color w:val="0E121D"/>
+        </w:rPr>
+        <w:t xml:space="preserve">Main saved run information</w:t>
       </w:r>
     </w:p>
     <w:p>
@@ -16058,20 +15876,20 @@
           <w:spacing w:val="0"/>
           <w:color w:val="0E121D"/>
         </w:rPr>
-        <w:t xml:space="preserve">Primary numerical result</w:t>
-      </w:r>
-    </w:p>
-    <w:p>
-      <w:pPr/>
-      <w:r>
-        <w:rPr>
-          <w:rFonts w:ascii="Arial" w:hAnsi="Arial" w:cs="Arial"/>
-          <w:sz w:val="23"/>
-          <w:sz-cs w:val="23"/>
-          <w:spacing w:val="0"/>
-          <w:color w:val="0E121D"/>
-        </w:rPr>
-        <w:t xml:space="preserve">Canonical generated output after final run</w:t>
+        <w:t xml:space="preserve">Main numerical result</w:t>
+      </w:r>
+    </w:p>
+    <w:p>
+      <w:pPr/>
+      <w:r>
+        <w:rPr>
+          <w:rFonts w:ascii="Arial" w:hAnsi="Arial" w:cs="Arial"/>
+          <w:sz w:val="23"/>
+          <w:sz-cs w:val="23"/>
+          <w:spacing w:val="0"/>
+          <w:color w:val="0E121D"/>
+        </w:rPr>
+        <w:t xml:space="preserve">Saved result after the final run</w:t>
       </w:r>
     </w:p>
     <w:p>
@@ -16097,33 +15915,33 @@
           <w:spacing w:val="0"/>
           <w:color w:val="0E121D"/>
         </w:rPr>
-        <w:t xml:space="preserve">code/outputs robustness and diagnostic files</w:t>
-      </w:r>
-    </w:p>
-    <w:p>
-      <w:pPr/>
-      <w:r>
-        <w:rPr>
-          <w:rFonts w:ascii="Arial" w:hAnsi="Arial" w:cs="Arial"/>
-          <w:sz w:val="23"/>
-          <w:sz-cs w:val="23"/>
-          <w:spacing w:val="0"/>
-          <w:color w:val="0E121D"/>
-        </w:rPr>
-        <w:t xml:space="preserve">Robustness, uncertainty and model diagnostics</w:t>
-      </w:r>
-    </w:p>
-    <w:p>
-      <w:pPr/>
-      <w:r>
-        <w:rPr>
-          <w:rFonts w:ascii="Arial" w:hAnsi="Arial" w:cs="Arial"/>
-          <w:sz w:val="23"/>
-          <w:sz-cs w:val="23"/>
-          <w:spacing w:val="0"/>
-          <w:color w:val="0E121D"/>
-        </w:rPr>
-        <w:t xml:space="preserve">Supporting generated outputs</w:t>
+        <w:t xml:space="preserve">Other files in code/outputs</w:t>
+      </w:r>
+    </w:p>
+    <w:p>
+      <w:pPr/>
+      <w:r>
+        <w:rPr>
+          <w:rFonts w:ascii="Arial" w:hAnsi="Arial" w:cs="Arial"/>
+          <w:sz w:val="23"/>
+          <w:sz-cs w:val="23"/>
+          <w:spacing w:val="0"/>
+          <w:color w:val="0E121D"/>
+        </w:rPr>
+        <w:t xml:space="preserve">Extra comparison and checking evidence</w:t>
+      </w:r>
+    </w:p>
+    <w:p>
+      <w:pPr/>
+      <w:r>
+        <w:rPr>
+          <w:rFonts w:ascii="Arial" w:hAnsi="Arial" w:cs="Arial"/>
+          <w:sz w:val="23"/>
+          <w:sz-cs w:val="23"/>
+          <w:spacing w:val="0"/>
+          <w:color w:val="0E121D"/>
+        </w:rPr>
+        <w:t xml:space="preserve">Supporting saved results</w:t>
       </w:r>
     </w:p>
     <w:p>
@@ -16175,7 +15993,7 @@
           <w:spacing w:val="0"/>
           <w:color w:val="0E121D"/>
         </w:rPr>
-        <w:t xml:space="preserve">Final count and wording to be synchronised</w:t>
+        <w:t xml:space="preserve">Final count and wording to be checked</w:t>
       </w:r>
     </w:p>
     <w:p>
@@ -16228,19 +16046,6 @@
           <w:color w:val="0E121D"/>
         </w:rPr>
         <w:t xml:space="preserve">Delivery evidence still required</w:t>
-      </w:r>
-    </w:p>
-    <w:p>
-      <w:pPr/>
-      <w:r>
-        <w:rPr>
-          <w:rFonts w:ascii="Arial" w:hAnsi="Arial" w:cs="Arial"/>
-          <w:sz w:val="28"/>
-          <w:sz-cs w:val="28"/>
-          <w:spacing w:val="0"/>
-          <w:color w:val="6D6D6D"/>
-        </w:rPr>
-        <w:t xml:space="preserve"/>
       </w:r>
     </w:p>
     <w:p>

</xml_diff>